<commit_message>
Worked on timer or debonced testing
</commit_message>
<xml_diff>
--- a/d2_dart_asynchronous_await_and_future.docx
+++ b/d2_dart_asynchronous_await_and_future.docx
@@ -724,16 +724,7 @@
           <w:sz w:val="32"/>
           <w:szCs w:val="32"/>
         </w:rPr>
-        <w:t>a</w:t>
-      </w:r>
-      <w:r>
-        <w:rPr>
-          <w:b/>
-          <w:bCs/>
-          <w:sz w:val="32"/>
-          <w:szCs w:val="32"/>
-        </w:rPr>
-        <w:t>sync</w:t>
+        <w:t>async</w:t>
       </w:r>
       <w:r>
         <w:rPr>
@@ -749,16 +740,7 @@
           <w:sz w:val="32"/>
           <w:szCs w:val="32"/>
         </w:rPr>
-        <w:t>a</w:t>
-      </w:r>
-      <w:r>
-        <w:rPr>
-          <w:b/>
-          <w:bCs/>
-          <w:sz w:val="32"/>
-          <w:szCs w:val="32"/>
-        </w:rPr>
-        <w:t>sync</w:t>
+        <w:t>async</w:t>
       </w:r>
       <w:r>
         <w:rPr>
@@ -3279,17 +3261,7 @@
           <w:sz w:val="32"/>
           <w:szCs w:val="32"/>
         </w:rPr>
-        <w:t>'timed out');</w:t>
-      </w:r>
-      <w:r>
-        <w:rPr>
-          <w:b/>
-          <w:bCs/>
-          <w:color w:val="D86DCB" w:themeColor="accent5" w:themeTint="99"/>
-          <w:sz w:val="32"/>
-          <w:szCs w:val="32"/>
-        </w:rPr>
-        <w:t xml:space="preserve">  // shows timed out</w:t>
+        <w:t>'timed out');  // shows timed out</w:t>
       </w:r>
     </w:p>
     <w:p>
@@ -23564,6 +23536,56 @@
         </w:rPr>
         <w:t># Now our code is clean and scalable. This is how experienced developers write it.</w:t>
       </w:r>
+      <w:r>
+        <w:rPr>
+          <w:sz w:val="32"/>
+          <w:szCs w:val="32"/>
+        </w:rPr>
+        <w:t xml:space="preserve"> Or we can write this logic directly in the </w:t>
+      </w:r>
+      <w:r>
+        <w:rPr>
+          <w:b/>
+          <w:bCs/>
+          <w:sz w:val="32"/>
+          <w:szCs w:val="32"/>
+        </w:rPr>
+        <w:t>Provider</w:t>
+      </w:r>
+      <w:r>
+        <w:rPr>
+          <w:sz w:val="32"/>
+          <w:szCs w:val="32"/>
+        </w:rPr>
+        <w:t xml:space="preserve">, </w:t>
+      </w:r>
+      <w:proofErr w:type="spellStart"/>
+      <w:r>
+        <w:rPr>
+          <w:b/>
+          <w:bCs/>
+          <w:sz w:val="32"/>
+          <w:szCs w:val="32"/>
+        </w:rPr>
+        <w:t>GetX</w:t>
+      </w:r>
+      <w:proofErr w:type="spellEnd"/>
+      <w:r>
+        <w:rPr>
+          <w:b/>
+          <w:bCs/>
+          <w:sz w:val="32"/>
+          <w:szCs w:val="32"/>
+        </w:rPr>
+        <w:t xml:space="preserve"> </w:t>
+      </w:r>
+      <w:r>
+        <w:rPr>
+          <w:sz w:val="32"/>
+          <w:szCs w:val="32"/>
+        </w:rPr>
+        <w:t>state management controller class.</w:t>
+      </w:r>
     </w:p>
     <w:p>
       <w:pPr>
@@ -23818,6 +23840,7 @@
           <w:sz w:val="32"/>
           <w:szCs w:val="32"/>
         </w:rPr>
+        <w:lastRenderedPageBreak/>
         <w:t xml:space="preserve">    _</w:t>
       </w:r>
       <w:proofErr w:type="spellStart"/>
@@ -23874,7 +23897,6 @@
           <w:sz w:val="32"/>
           <w:szCs w:val="32"/>
         </w:rPr>
-        <w:lastRenderedPageBreak/>
         <w:t xml:space="preserve">    _timer = </w:t>
       </w:r>
       <w:proofErr w:type="gramStart"/>
@@ -24608,6 +24630,7 @@
           <w:sz w:val="32"/>
           <w:szCs w:val="32"/>
         </w:rPr>
+        <w:lastRenderedPageBreak/>
         <w:t>RxDart</w:t>
       </w:r>
       <w:proofErr w:type="spellEnd"/>
@@ -24625,7 +24648,6 @@
           <w:sz w:val="32"/>
           <w:szCs w:val="32"/>
         </w:rPr>
-        <w:lastRenderedPageBreak/>
         <w:t># They have built-in debounce operators. Much cleaner for large apps. Example in streams:</w:t>
       </w:r>
     </w:p>
@@ -25539,6 +25561,7 @@
           <w:sz w:val="32"/>
           <w:szCs w:val="32"/>
         </w:rPr>
+        <w:lastRenderedPageBreak/>
         <w:t xml:space="preserve">  Widget </w:t>
       </w:r>
       <w:proofErr w:type="gramStart"/>
@@ -25617,7 +25640,6 @@
           <w:sz w:val="32"/>
           <w:szCs w:val="32"/>
         </w:rPr>
-        <w:lastRenderedPageBreak/>
         <w:t xml:space="preserve">    final </w:t>
       </w:r>
       <w:proofErr w:type="spellStart"/>
@@ -26546,6 +26568,7 @@
           <w:sz w:val="32"/>
           <w:szCs w:val="32"/>
         </w:rPr>
+        <w:lastRenderedPageBreak/>
         <w:t xml:space="preserve">                  </w:t>
       </w:r>
       <w:proofErr w:type="gramStart"/>
@@ -26590,7 +26613,6 @@
           <w:sz w:val="32"/>
           <w:szCs w:val="32"/>
         </w:rPr>
-        <w:lastRenderedPageBreak/>
         <w:t xml:space="preserve">              data: (results) {</w:t>
       </w:r>
     </w:p>
@@ -27225,7 +27247,6 @@
           <w:sz w:val="32"/>
           <w:szCs w:val="32"/>
         </w:rPr>
-        <w:lastRenderedPageBreak/>
         <w:t>RxDart</w:t>
       </w:r>
       <w:proofErr w:type="spellEnd"/>
@@ -27869,7 +27890,6 @@
           <w:sz w:val="32"/>
           <w:szCs w:val="32"/>
         </w:rPr>
-        <w:lastRenderedPageBreak/>
         <w:t>Async</w:t>
       </w:r>
       <w:r>
@@ -28917,6 +28937,7 @@
           <w:sz w:val="28"/>
           <w:szCs w:val="28"/>
         </w:rPr>
+        <w:lastRenderedPageBreak/>
         <w:t>│    └─ await ...</w:t>
       </w:r>
     </w:p>
@@ -28937,7 +28958,6 @@
           <w:sz w:val="28"/>
           <w:szCs w:val="28"/>
         </w:rPr>
-        <w:lastRenderedPageBreak/>
         <w:t xml:space="preserve">│       </w:t>
       </w:r>
       <w:r>
@@ -43746,6 +43766,7 @@
   <w:style w:type="character" w:default="1" w:styleId="DefaultParagraphFont">
     <w:name w:val="Default Paragraph Font"/>
     <w:uiPriority w:val="1"/>
+    <w:semiHidden/>
     <w:unhideWhenUsed/>
   </w:style>
   <w:style w:type="table" w:default="1" w:styleId="TableNormal">

</xml_diff>

<commit_message>
Updated docs 1st August
</commit_message>
<xml_diff>
--- a/d2_dart_asynchronous_await_and_future.docx
+++ b/d2_dart_asynchronous_await_and_future.docx
@@ -666,42 +666,62 @@
       </w:pPr>
       <w:r>
         <w:rPr>
-          <w:sz w:val="32"/>
-          <w:szCs w:val="32"/>
-        </w:rPr>
-        <w:t xml:space="preserve">Debounce/Timer in </w:t>
-      </w:r>
-      <w:r>
-        <w:rPr>
-          <w:b/>
-          <w:bCs/>
-          <w:sz w:val="32"/>
-          <w:szCs w:val="32"/>
-        </w:rPr>
-        <w:t>Dart</w:t>
-      </w:r>
-      <w:r>
-        <w:rPr>
-          <w:sz w:val="32"/>
-          <w:szCs w:val="32"/>
-        </w:rPr>
-        <w:t>…………………………………………</w:t>
+          <w:b/>
+          <w:bCs/>
+          <w:sz w:val="32"/>
+          <w:szCs w:val="32"/>
+        </w:rPr>
+        <w:t>Completer&lt;T</w:t>
       </w:r>
       <w:proofErr w:type="gramStart"/>
       <w:r>
         <w:rPr>
-          <w:sz w:val="32"/>
-          <w:szCs w:val="32"/>
-        </w:rPr>
-        <w:t>…..</w:t>
+          <w:b/>
+          <w:bCs/>
+          <w:sz w:val="32"/>
+          <w:szCs w:val="32"/>
+        </w:rPr>
+        <w:t>&gt;(</w:t>
       </w:r>
       <w:proofErr w:type="gramEnd"/>
       <w:r>
         <w:rPr>
-          <w:sz w:val="32"/>
-          <w:szCs w:val="32"/>
-        </w:rPr>
-        <w:t>27</w:t>
+          <w:b/>
+          <w:bCs/>
+          <w:sz w:val="32"/>
+          <w:szCs w:val="32"/>
+        </w:rPr>
+        <w:t>)</w:t>
+      </w:r>
+      <w:r>
+        <w:rPr>
+          <w:sz w:val="32"/>
+          <w:szCs w:val="32"/>
+        </w:rPr>
+        <w:t xml:space="preserve"> class with </w:t>
+      </w:r>
+      <w:r>
+        <w:rPr>
+          <w:b/>
+          <w:bCs/>
+          <w:sz w:val="32"/>
+          <w:szCs w:val="32"/>
+        </w:rPr>
+        <w:t>Future&lt;T&gt;</w:t>
+      </w:r>
+      <w:r>
+        <w:rPr>
+          <w:sz w:val="32"/>
+          <w:szCs w:val="32"/>
+        </w:rPr>
+        <w:t>…………………………</w:t>
+      </w:r>
+      <w:r>
+        <w:rPr>
+          <w:sz w:val="32"/>
+          <w:szCs w:val="32"/>
+        </w:rPr>
+        <w:t>.27</w:t>
       </w:r>
     </w:p>
     <w:p>
@@ -719,42 +739,42 @@
       </w:pPr>
       <w:r>
         <w:rPr>
-          <w:b/>
-          <w:bCs/>
-          <w:sz w:val="32"/>
-          <w:szCs w:val="32"/>
-        </w:rPr>
-        <w:t>async</w:t>
-      </w:r>
-      <w:r>
-        <w:rPr>
-          <w:sz w:val="32"/>
-          <w:szCs w:val="32"/>
-        </w:rPr>
-        <w:t xml:space="preserve"> Constructors and </w:t>
-      </w:r>
-      <w:r>
-        <w:rPr>
-          <w:b/>
-          <w:bCs/>
-          <w:sz w:val="32"/>
-          <w:szCs w:val="32"/>
-        </w:rPr>
-        <w:t>async</w:t>
-      </w:r>
-      <w:r>
-        <w:rPr>
-          <w:sz w:val="32"/>
-          <w:szCs w:val="32"/>
-        </w:rPr>
-        <w:t xml:space="preserve"> in Class</w:t>
-      </w:r>
-      <w:r>
-        <w:rPr>
-          <w:sz w:val="32"/>
-          <w:szCs w:val="32"/>
-        </w:rPr>
-        <w:t>…………………………38</w:t>
+          <w:sz w:val="32"/>
+          <w:szCs w:val="32"/>
+        </w:rPr>
+        <w:t xml:space="preserve">Debounce/Timer in </w:t>
+      </w:r>
+      <w:r>
+        <w:rPr>
+          <w:b/>
+          <w:bCs/>
+          <w:sz w:val="32"/>
+          <w:szCs w:val="32"/>
+        </w:rPr>
+        <w:t>Dart</w:t>
+      </w:r>
+      <w:r>
+        <w:rPr>
+          <w:sz w:val="32"/>
+          <w:szCs w:val="32"/>
+        </w:rPr>
+        <w:t>…………………………………………</w:t>
+      </w:r>
+      <w:proofErr w:type="gramStart"/>
+      <w:r>
+        <w:rPr>
+          <w:sz w:val="32"/>
+          <w:szCs w:val="32"/>
+        </w:rPr>
+        <w:t>…..</w:t>
+      </w:r>
+      <w:proofErr w:type="gramEnd"/>
+      <w:r>
+        <w:rPr>
+          <w:sz w:val="32"/>
+          <w:szCs w:val="32"/>
+        </w:rPr>
+        <w:t>30</w:t>
       </w:r>
     </w:p>
     <w:p>
@@ -772,17 +792,49 @@
       </w:pPr>
       <w:r>
         <w:rPr>
-          <w:sz w:val="32"/>
-          <w:szCs w:val="32"/>
-        </w:rPr>
-        <w:t>Async, Call Stack, Microtask Queue &amp; Isolates</w:t>
-      </w:r>
-      <w:r>
-        <w:rPr>
-          <w:sz w:val="32"/>
-          <w:szCs w:val="32"/>
-        </w:rPr>
-        <w:t>……………….39</w:t>
+          <w:b/>
+          <w:bCs/>
+          <w:sz w:val="32"/>
+          <w:szCs w:val="32"/>
+        </w:rPr>
+        <w:t>async</w:t>
+      </w:r>
+      <w:r>
+        <w:rPr>
+          <w:sz w:val="32"/>
+          <w:szCs w:val="32"/>
+        </w:rPr>
+        <w:t xml:space="preserve"> Constructors and </w:t>
+      </w:r>
+      <w:r>
+        <w:rPr>
+          <w:b/>
+          <w:bCs/>
+          <w:sz w:val="32"/>
+          <w:szCs w:val="32"/>
+        </w:rPr>
+        <w:t>async</w:t>
+      </w:r>
+      <w:r>
+        <w:rPr>
+          <w:sz w:val="32"/>
+          <w:szCs w:val="32"/>
+        </w:rPr>
+        <w:t xml:space="preserve"> in Class</w:t>
+      </w:r>
+      <w:r>
+        <w:rPr>
+          <w:sz w:val="32"/>
+          <w:szCs w:val="32"/>
+        </w:rPr>
+        <w:t>…………………………</w:t>
+      </w:r>
+      <w:r>
+        <w:rPr>
+          <w:sz w:val="32"/>
+          <w:szCs w:val="32"/>
+        </w:rPr>
+        <w:t>41</w:t>
       </w:r>
     </w:p>
     <w:p>
@@ -800,36 +852,18 @@
       </w:pPr>
       <w:r>
         <w:rPr>
-          <w:b/>
-          <w:bCs/>
-          <w:sz w:val="32"/>
-          <w:szCs w:val="32"/>
-        </w:rPr>
-        <w:t>Call Stack</w:t>
-      </w:r>
-      <w:r>
-        <w:rPr>
-          <w:sz w:val="32"/>
-          <w:szCs w:val="32"/>
-        </w:rPr>
-        <w:t xml:space="preserve"> in Event Loop</w:t>
-      </w:r>
-      <w:r>
-        <w:rPr>
-          <w:sz w:val="32"/>
-          <w:szCs w:val="32"/>
-        </w:rPr>
-        <w:t>…………………………………………</w:t>
-      </w:r>
-      <w:proofErr w:type="gramStart"/>
-      <w:r>
-        <w:rPr>
-          <w:sz w:val="32"/>
-          <w:szCs w:val="32"/>
-        </w:rPr>
-        <w:t>…..</w:t>
-      </w:r>
-      <w:proofErr w:type="gramEnd"/>
+          <w:sz w:val="32"/>
+          <w:szCs w:val="32"/>
+        </w:rPr>
+        <w:t>Async, Call Stack, Microtask Queue &amp; Isolates</w:t>
+      </w:r>
+      <w:r>
+        <w:rPr>
+          <w:sz w:val="32"/>
+          <w:szCs w:val="32"/>
+        </w:rPr>
+        <w:t>……………….</w:t>
+      </w:r>
       <w:r>
         <w:rPr>
           <w:sz w:val="32"/>
@@ -853,17 +887,49 @@
       </w:pPr>
       <w:r>
         <w:rPr>
-          <w:sz w:val="32"/>
-          <w:szCs w:val="32"/>
-        </w:rPr>
-        <w:t>Microtask Queue</w:t>
-      </w:r>
-      <w:r>
-        <w:rPr>
-          <w:sz w:val="32"/>
-          <w:szCs w:val="32"/>
-        </w:rPr>
-        <w:t>……………………………………………………….45</w:t>
+          <w:b/>
+          <w:bCs/>
+          <w:sz w:val="32"/>
+          <w:szCs w:val="32"/>
+        </w:rPr>
+        <w:t>Call Stack</w:t>
+      </w:r>
+      <w:r>
+        <w:rPr>
+          <w:sz w:val="32"/>
+          <w:szCs w:val="32"/>
+        </w:rPr>
+        <w:t xml:space="preserve"> in Event Loop</w:t>
+      </w:r>
+      <w:r>
+        <w:rPr>
+          <w:sz w:val="32"/>
+          <w:szCs w:val="32"/>
+        </w:rPr>
+        <w:t>…………………………………………</w:t>
+      </w:r>
+      <w:proofErr w:type="gramStart"/>
+      <w:r>
+        <w:rPr>
+          <w:sz w:val="32"/>
+          <w:szCs w:val="32"/>
+        </w:rPr>
+        <w:t>…..</w:t>
+      </w:r>
+      <w:proofErr w:type="gramEnd"/>
+      <w:r>
+        <w:rPr>
+          <w:sz w:val="32"/>
+          <w:szCs w:val="32"/>
+        </w:rPr>
+        <w:t>4</w:t>
+      </w:r>
+      <w:r>
+        <w:rPr>
+          <w:sz w:val="32"/>
+          <w:szCs w:val="32"/>
+        </w:rPr>
+        <w:t>5</w:t>
       </w:r>
     </w:p>
     <w:p>
@@ -884,6 +950,41 @@
           <w:sz w:val="32"/>
           <w:szCs w:val="32"/>
         </w:rPr>
+        <w:t>Microtask Queue</w:t>
+      </w:r>
+      <w:r>
+        <w:rPr>
+          <w:sz w:val="32"/>
+          <w:szCs w:val="32"/>
+        </w:rPr>
+        <w:t>……………………………………………………….4</w:t>
+      </w:r>
+      <w:r>
+        <w:rPr>
+          <w:sz w:val="32"/>
+          <w:szCs w:val="32"/>
+        </w:rPr>
+        <w:t>9</w:t>
+      </w:r>
+    </w:p>
+    <w:p>
+      <w:pPr>
+        <w:pStyle w:val="ListParagraph"/>
+        <w:numPr>
+          <w:ilvl w:val="0"/>
+          <w:numId w:val="37"/>
+        </w:numPr>
+        <w:jc w:val="both"/>
+        <w:rPr>
+          <w:sz w:val="32"/>
+          <w:szCs w:val="32"/>
+        </w:rPr>
+      </w:pPr>
+      <w:r>
+        <w:rPr>
+          <w:sz w:val="32"/>
+          <w:szCs w:val="32"/>
+        </w:rPr>
         <w:t>Isolate…………………………………………………………………</w:t>
       </w:r>
       <w:proofErr w:type="gramStart"/>
@@ -900,7 +1001,7 @@
           <w:sz w:val="32"/>
           <w:szCs w:val="32"/>
         </w:rPr>
-        <w:t>49</w:t>
+        <w:t>52</w:t>
       </w:r>
     </w:p>
     <w:p>
@@ -19560,6 +19661,2197 @@
           <w:sz w:val="32"/>
           <w:szCs w:val="32"/>
         </w:rPr>
+        <w:t>Completer&lt;T</w:t>
+      </w:r>
+      <w:proofErr w:type="gramStart"/>
+      <w:r>
+        <w:rPr>
+          <w:b/>
+          <w:bCs/>
+          <w:sz w:val="32"/>
+          <w:szCs w:val="32"/>
+        </w:rPr>
+        <w:t>&gt;(</w:t>
+      </w:r>
+      <w:proofErr w:type="gramEnd"/>
+      <w:r>
+        <w:rPr>
+          <w:b/>
+          <w:bCs/>
+          <w:sz w:val="32"/>
+          <w:szCs w:val="32"/>
+        </w:rPr>
+        <w:t>) class with Future&lt;T&gt;</w:t>
+      </w:r>
+      <w:r>
+        <w:rPr>
+          <w:b/>
+          <w:bCs/>
+          <w:sz w:val="32"/>
+          <w:szCs w:val="32"/>
+        </w:rPr>
+        <w:t>:</w:t>
+      </w:r>
+    </w:p>
+    <w:p>
+      <w:pPr>
+        <w:jc w:val="both"/>
+        <w:rPr>
+          <w:sz w:val="32"/>
+          <w:szCs w:val="32"/>
+        </w:rPr>
+      </w:pPr>
+      <w:r>
+        <w:rPr>
+          <w:sz w:val="32"/>
+          <w:szCs w:val="32"/>
+        </w:rPr>
+        <w:t xml:space="preserve"># </w:t>
+      </w:r>
+      <w:r>
+        <w:rPr>
+          <w:b/>
+          <w:bCs/>
+          <w:sz w:val="32"/>
+          <w:szCs w:val="32"/>
+        </w:rPr>
+        <w:t>Completer&lt;T</w:t>
+      </w:r>
+      <w:proofErr w:type="gramStart"/>
+      <w:r>
+        <w:rPr>
+          <w:b/>
+          <w:bCs/>
+          <w:sz w:val="32"/>
+          <w:szCs w:val="32"/>
+        </w:rPr>
+        <w:t>&gt;(</w:t>
+      </w:r>
+      <w:proofErr w:type="gramEnd"/>
+      <w:r>
+        <w:rPr>
+          <w:b/>
+          <w:bCs/>
+          <w:sz w:val="32"/>
+          <w:szCs w:val="32"/>
+        </w:rPr>
+        <w:t>)</w:t>
+      </w:r>
+      <w:r>
+        <w:rPr>
+          <w:sz w:val="32"/>
+          <w:szCs w:val="32"/>
+        </w:rPr>
+        <w:t xml:space="preserve"> is a way to</w:t>
+      </w:r>
+      <w:r>
+        <w:rPr>
+          <w:b/>
+          <w:bCs/>
+          <w:sz w:val="32"/>
+          <w:szCs w:val="32"/>
+        </w:rPr>
+        <w:t xml:space="preserve"> Future&lt;T&gt;</w:t>
+      </w:r>
+      <w:r>
+        <w:rPr>
+          <w:sz w:val="32"/>
+          <w:szCs w:val="32"/>
+        </w:rPr>
+        <w:t xml:space="preserve"> objects and to complete them later with a value or error. Think of </w:t>
+      </w:r>
+      <w:r>
+        <w:rPr>
+          <w:b/>
+          <w:bCs/>
+          <w:sz w:val="32"/>
+          <w:szCs w:val="32"/>
+        </w:rPr>
+        <w:t>Completer</w:t>
+      </w:r>
+      <w:r>
+        <w:rPr>
+          <w:sz w:val="32"/>
+          <w:szCs w:val="32"/>
+        </w:rPr>
+        <w:t xml:space="preserve"> as a remote control and </w:t>
+      </w:r>
+      <w:r>
+        <w:rPr>
+          <w:b/>
+          <w:bCs/>
+          <w:sz w:val="32"/>
+          <w:szCs w:val="32"/>
+        </w:rPr>
+        <w:t>Future</w:t>
+      </w:r>
+      <w:r>
+        <w:rPr>
+          <w:sz w:val="32"/>
+          <w:szCs w:val="32"/>
+        </w:rPr>
+        <w:t xml:space="preserve"> is like a TV. A Completer gives us the remote control to decide when the </w:t>
+      </w:r>
+      <w:r>
+        <w:rPr>
+          <w:b/>
+          <w:bCs/>
+          <w:sz w:val="32"/>
+          <w:szCs w:val="32"/>
+        </w:rPr>
+        <w:t>Future</w:t>
+      </w:r>
+      <w:r>
+        <w:rPr>
+          <w:sz w:val="32"/>
+          <w:szCs w:val="32"/>
+        </w:rPr>
+        <w:t xml:space="preserve"> finishes (or returns)</w:t>
+      </w:r>
+    </w:p>
+    <w:p>
+      <w:pPr>
+        <w:jc w:val="both"/>
+        <w:rPr>
+          <w:sz w:val="32"/>
+          <w:szCs w:val="32"/>
+        </w:rPr>
+      </w:pPr>
+    </w:p>
+    <w:p>
+      <w:pPr>
+        <w:jc w:val="both"/>
+        <w:rPr>
+          <w:sz w:val="32"/>
+          <w:szCs w:val="32"/>
+        </w:rPr>
+      </w:pPr>
+      <w:r>
+        <w:rPr>
+          <w:sz w:val="32"/>
+          <w:szCs w:val="32"/>
+        </w:rPr>
+        <w:t>The Problem Completer Solves:</w:t>
+      </w:r>
+    </w:p>
+    <w:p>
+      <w:pPr>
+        <w:jc w:val="both"/>
+        <w:rPr>
+          <w:sz w:val="32"/>
+          <w:szCs w:val="32"/>
+        </w:rPr>
+      </w:pPr>
+      <w:r>
+        <w:rPr>
+          <w:sz w:val="32"/>
+          <w:szCs w:val="32"/>
+        </w:rPr>
+        <w:t># Normally, an async function finishes when it reaches its end. Like:</w:t>
+      </w:r>
+    </w:p>
+    <w:p>
+      <w:pPr>
+        <w:jc w:val="both"/>
+        <w:rPr>
+          <w:b/>
+          <w:bCs/>
+          <w:sz w:val="28"/>
+          <w:szCs w:val="28"/>
+        </w:rPr>
+      </w:pPr>
+      <w:r>
+        <w:rPr>
+          <w:b/>
+          <w:bCs/>
+          <w:sz w:val="28"/>
+          <w:szCs w:val="28"/>
+        </w:rPr>
+        <w:t xml:space="preserve">Call </w:t>
+      </w:r>
+      <w:proofErr w:type="spellStart"/>
+      <w:proofErr w:type="gramStart"/>
+      <w:r>
+        <w:rPr>
+          <w:b/>
+          <w:bCs/>
+          <w:sz w:val="28"/>
+          <w:szCs w:val="28"/>
+        </w:rPr>
+        <w:t>getName</w:t>
+      </w:r>
+      <w:proofErr w:type="spellEnd"/>
+      <w:r>
+        <w:rPr>
+          <w:b/>
+          <w:bCs/>
+          <w:sz w:val="28"/>
+          <w:szCs w:val="28"/>
+        </w:rPr>
+        <w:t>(</w:t>
+      </w:r>
+      <w:proofErr w:type="gramEnd"/>
+      <w:r>
+        <w:rPr>
+          <w:b/>
+          <w:bCs/>
+          <w:sz w:val="28"/>
+          <w:szCs w:val="28"/>
+        </w:rPr>
+        <w:t>)</w:t>
+      </w:r>
+    </w:p>
+    <w:p>
+      <w:pPr>
+        <w:jc w:val="both"/>
+        <w:rPr>
+          <w:b/>
+          <w:bCs/>
+          <w:sz w:val="28"/>
+          <w:szCs w:val="28"/>
+        </w:rPr>
+      </w:pPr>
+      <w:r>
+        <w:rPr>
+          <w:b/>
+          <w:bCs/>
+          <w:sz w:val="28"/>
+          <w:szCs w:val="28"/>
+        </w:rPr>
+        <w:t>↓</w:t>
+      </w:r>
+    </w:p>
+    <w:p>
+      <w:pPr>
+        <w:jc w:val="both"/>
+        <w:rPr>
+          <w:b/>
+          <w:bCs/>
+          <w:sz w:val="28"/>
+          <w:szCs w:val="28"/>
+        </w:rPr>
+      </w:pPr>
+      <w:r>
+        <w:rPr>
+          <w:b/>
+          <w:bCs/>
+          <w:sz w:val="28"/>
+          <w:szCs w:val="28"/>
+        </w:rPr>
+        <w:t>wait 2 sec</w:t>
+      </w:r>
+    </w:p>
+    <w:p>
+      <w:pPr>
+        <w:jc w:val="both"/>
+        <w:rPr>
+          <w:b/>
+          <w:bCs/>
+          <w:sz w:val="28"/>
+          <w:szCs w:val="28"/>
+        </w:rPr>
+      </w:pPr>
+      <w:r>
+        <w:rPr>
+          <w:b/>
+          <w:bCs/>
+          <w:sz w:val="28"/>
+          <w:szCs w:val="28"/>
+        </w:rPr>
+        <w:t>↓</w:t>
+      </w:r>
+    </w:p>
+    <w:p>
+      <w:pPr>
+        <w:jc w:val="both"/>
+        <w:rPr>
+          <w:b/>
+          <w:bCs/>
+          <w:sz w:val="28"/>
+          <w:szCs w:val="28"/>
+        </w:rPr>
+      </w:pPr>
+      <w:r>
+        <w:rPr>
+          <w:b/>
+          <w:bCs/>
+          <w:sz w:val="28"/>
+          <w:szCs w:val="28"/>
+        </w:rPr>
+        <w:t>return "Nazmul"</w:t>
+      </w:r>
+    </w:p>
+    <w:p>
+      <w:pPr>
+        <w:jc w:val="both"/>
+        <w:rPr>
+          <w:sz w:val="32"/>
+          <w:szCs w:val="32"/>
+        </w:rPr>
+      </w:pPr>
+      <w:r>
+        <w:rPr>
+          <w:sz w:val="32"/>
+          <w:szCs w:val="32"/>
+        </w:rPr>
+        <w:t># The function itself knows when it is finished</w:t>
+      </w:r>
+    </w:p>
+    <w:p>
+      <w:pPr>
+        <w:jc w:val="both"/>
+        <w:rPr>
+          <w:b/>
+          <w:bCs/>
+          <w:color w:val="D86DCB" w:themeColor="accent5" w:themeTint="99"/>
+          <w:sz w:val="32"/>
+          <w:szCs w:val="32"/>
+        </w:rPr>
+      </w:pPr>
+      <w:r>
+        <w:rPr>
+          <w:b/>
+          <w:bCs/>
+          <w:color w:val="D86DCB" w:themeColor="accent5" w:themeTint="99"/>
+          <w:sz w:val="32"/>
+          <w:szCs w:val="32"/>
+        </w:rPr>
+        <w:t xml:space="preserve">Future&lt;String&gt; </w:t>
+      </w:r>
+      <w:proofErr w:type="spellStart"/>
+      <w:proofErr w:type="gramStart"/>
+      <w:r>
+        <w:rPr>
+          <w:b/>
+          <w:bCs/>
+          <w:color w:val="D86DCB" w:themeColor="accent5" w:themeTint="99"/>
+          <w:sz w:val="32"/>
+          <w:szCs w:val="32"/>
+        </w:rPr>
+        <w:t>getName</w:t>
+      </w:r>
+      <w:proofErr w:type="spellEnd"/>
+      <w:r>
+        <w:rPr>
+          <w:b/>
+          <w:bCs/>
+          <w:color w:val="D86DCB" w:themeColor="accent5" w:themeTint="99"/>
+          <w:sz w:val="32"/>
+          <w:szCs w:val="32"/>
+        </w:rPr>
+        <w:t>(</w:t>
+      </w:r>
+      <w:proofErr w:type="gramEnd"/>
+      <w:r>
+        <w:rPr>
+          <w:b/>
+          <w:bCs/>
+          <w:color w:val="D86DCB" w:themeColor="accent5" w:themeTint="99"/>
+          <w:sz w:val="32"/>
+          <w:szCs w:val="32"/>
+        </w:rPr>
+        <w:t>) async {</w:t>
+      </w:r>
+    </w:p>
+    <w:p>
+      <w:pPr>
+        <w:jc w:val="both"/>
+        <w:rPr>
+          <w:b/>
+          <w:bCs/>
+          <w:color w:val="D86DCB" w:themeColor="accent5" w:themeTint="99"/>
+          <w:sz w:val="32"/>
+          <w:szCs w:val="32"/>
+        </w:rPr>
+      </w:pPr>
+      <w:r>
+        <w:rPr>
+          <w:b/>
+          <w:bCs/>
+          <w:color w:val="D86DCB" w:themeColor="accent5" w:themeTint="99"/>
+          <w:sz w:val="32"/>
+          <w:szCs w:val="32"/>
+        </w:rPr>
+        <w:t xml:space="preserve">  await </w:t>
+      </w:r>
+      <w:proofErr w:type="spellStart"/>
+      <w:r>
+        <w:rPr>
+          <w:b/>
+          <w:bCs/>
+          <w:color w:val="D86DCB" w:themeColor="accent5" w:themeTint="99"/>
+          <w:sz w:val="32"/>
+          <w:szCs w:val="32"/>
+        </w:rPr>
+        <w:t>Future.delayed</w:t>
+      </w:r>
+      <w:proofErr w:type="spellEnd"/>
+      <w:r>
+        <w:rPr>
+          <w:b/>
+          <w:bCs/>
+          <w:color w:val="D86DCB" w:themeColor="accent5" w:themeTint="99"/>
+          <w:sz w:val="32"/>
+          <w:szCs w:val="32"/>
+        </w:rPr>
+        <w:t>(</w:t>
+      </w:r>
+      <w:proofErr w:type="gramStart"/>
+      <w:r>
+        <w:rPr>
+          <w:b/>
+          <w:bCs/>
+          <w:color w:val="D86DCB" w:themeColor="accent5" w:themeTint="99"/>
+          <w:sz w:val="32"/>
+          <w:szCs w:val="32"/>
+        </w:rPr>
+        <w:t>Duration(</w:t>
+      </w:r>
+      <w:proofErr w:type="gramEnd"/>
+      <w:r>
+        <w:rPr>
+          <w:b/>
+          <w:bCs/>
+          <w:color w:val="D86DCB" w:themeColor="accent5" w:themeTint="99"/>
+          <w:sz w:val="32"/>
+          <w:szCs w:val="32"/>
+        </w:rPr>
+        <w:t>seconds: 2));</w:t>
+      </w:r>
+    </w:p>
+    <w:p>
+      <w:pPr>
+        <w:jc w:val="both"/>
+        <w:rPr>
+          <w:b/>
+          <w:bCs/>
+          <w:color w:val="D86DCB" w:themeColor="accent5" w:themeTint="99"/>
+          <w:sz w:val="32"/>
+          <w:szCs w:val="32"/>
+        </w:rPr>
+      </w:pPr>
+      <w:r>
+        <w:rPr>
+          <w:b/>
+          <w:bCs/>
+          <w:color w:val="D86DCB" w:themeColor="accent5" w:themeTint="99"/>
+          <w:sz w:val="32"/>
+          <w:szCs w:val="32"/>
+        </w:rPr>
+        <w:t xml:space="preserve">  return "Nazmul";</w:t>
+      </w:r>
+    </w:p>
+    <w:p>
+      <w:pPr>
+        <w:jc w:val="both"/>
+        <w:rPr>
+          <w:b/>
+          <w:bCs/>
+          <w:color w:val="D86DCB" w:themeColor="accent5" w:themeTint="99"/>
+          <w:sz w:val="32"/>
+          <w:szCs w:val="32"/>
+        </w:rPr>
+      </w:pPr>
+      <w:r>
+        <w:rPr>
+          <w:b/>
+          <w:bCs/>
+          <w:color w:val="D86DCB" w:themeColor="accent5" w:themeTint="99"/>
+          <w:sz w:val="32"/>
+          <w:szCs w:val="32"/>
+        </w:rPr>
+        <w:lastRenderedPageBreak/>
+        <w:t>}</w:t>
+      </w:r>
+    </w:p>
+    <w:p>
+      <w:pPr>
+        <w:jc w:val="both"/>
+        <w:rPr>
+          <w:sz w:val="32"/>
+          <w:szCs w:val="32"/>
+        </w:rPr>
+      </w:pPr>
+      <w:r>
+        <w:rPr>
+          <w:sz w:val="32"/>
+          <w:szCs w:val="32"/>
+        </w:rPr>
+        <w:t xml:space="preserve"># But </w:t>
+      </w:r>
+      <w:r>
+        <w:rPr>
+          <w:sz w:val="32"/>
+          <w:szCs w:val="32"/>
+        </w:rPr>
+        <w:t>what if the function doesn't know when it will finish</w:t>
+      </w:r>
+      <w:r>
+        <w:rPr>
+          <w:sz w:val="32"/>
+          <w:szCs w:val="32"/>
+        </w:rPr>
+        <w:t xml:space="preserve">. </w:t>
+      </w:r>
+      <w:r>
+        <w:rPr>
+          <w:sz w:val="32"/>
+          <w:szCs w:val="32"/>
+        </w:rPr>
+        <w:t>Example:</w:t>
+      </w:r>
+    </w:p>
+    <w:p>
+      <w:pPr>
+        <w:jc w:val="both"/>
+        <w:rPr>
+          <w:b/>
+          <w:bCs/>
+          <w:sz w:val="28"/>
+          <w:szCs w:val="28"/>
+        </w:rPr>
+      </w:pPr>
+      <w:r>
+        <w:rPr>
+          <w:b/>
+          <w:bCs/>
+          <w:sz w:val="28"/>
+          <w:szCs w:val="28"/>
+        </w:rPr>
+        <w:t>Show Dialog</w:t>
+      </w:r>
+    </w:p>
+    <w:p>
+      <w:pPr>
+        <w:jc w:val="both"/>
+        <w:rPr>
+          <w:b/>
+          <w:bCs/>
+          <w:sz w:val="28"/>
+          <w:szCs w:val="28"/>
+        </w:rPr>
+      </w:pPr>
+      <w:r>
+        <w:rPr>
+          <w:b/>
+          <w:bCs/>
+          <w:sz w:val="28"/>
+          <w:szCs w:val="28"/>
+        </w:rPr>
+        <w:t>↓</w:t>
+      </w:r>
+    </w:p>
+    <w:p>
+      <w:pPr>
+        <w:jc w:val="both"/>
+        <w:rPr>
+          <w:b/>
+          <w:bCs/>
+          <w:sz w:val="28"/>
+          <w:szCs w:val="28"/>
+        </w:rPr>
+      </w:pPr>
+      <w:r>
+        <w:rPr>
+          <w:b/>
+          <w:bCs/>
+          <w:sz w:val="28"/>
+          <w:szCs w:val="28"/>
+        </w:rPr>
+        <w:t>User thinks...</w:t>
+      </w:r>
+    </w:p>
+    <w:p>
+      <w:pPr>
+        <w:jc w:val="both"/>
+        <w:rPr>
+          <w:b/>
+          <w:bCs/>
+          <w:sz w:val="28"/>
+          <w:szCs w:val="28"/>
+        </w:rPr>
+      </w:pPr>
+      <w:r>
+        <w:rPr>
+          <w:b/>
+          <w:bCs/>
+          <w:sz w:val="28"/>
+          <w:szCs w:val="28"/>
+        </w:rPr>
+        <w:t>↓</w:t>
+      </w:r>
+    </w:p>
+    <w:p>
+      <w:pPr>
+        <w:jc w:val="both"/>
+        <w:rPr>
+          <w:b/>
+          <w:bCs/>
+          <w:sz w:val="28"/>
+          <w:szCs w:val="28"/>
+        </w:rPr>
+      </w:pPr>
+      <w:r>
+        <w:rPr>
+          <w:b/>
+          <w:bCs/>
+          <w:sz w:val="28"/>
+          <w:szCs w:val="28"/>
+        </w:rPr>
+        <w:t>User clicks OK</w:t>
+      </w:r>
+    </w:p>
+    <w:p>
+      <w:pPr>
+        <w:jc w:val="both"/>
+        <w:rPr>
+          <w:b/>
+          <w:bCs/>
+          <w:sz w:val="28"/>
+          <w:szCs w:val="28"/>
+        </w:rPr>
+      </w:pPr>
+      <w:r>
+        <w:rPr>
+          <w:b/>
+          <w:bCs/>
+          <w:sz w:val="28"/>
+          <w:szCs w:val="28"/>
+        </w:rPr>
+        <w:t>↓</w:t>
+      </w:r>
+    </w:p>
+    <w:p>
+      <w:pPr>
+        <w:jc w:val="both"/>
+        <w:rPr>
+          <w:b/>
+          <w:bCs/>
+          <w:sz w:val="28"/>
+          <w:szCs w:val="28"/>
+        </w:rPr>
+      </w:pPr>
+      <w:r>
+        <w:rPr>
+          <w:b/>
+          <w:bCs/>
+          <w:sz w:val="28"/>
+          <w:szCs w:val="28"/>
+        </w:rPr>
+        <w:t>Return result</w:t>
+      </w:r>
+    </w:p>
+    <w:p>
+      <w:pPr>
+        <w:jc w:val="both"/>
+        <w:rPr>
+          <w:sz w:val="32"/>
+          <w:szCs w:val="32"/>
+        </w:rPr>
+      </w:pPr>
+      <w:r>
+        <w:rPr>
+          <w:sz w:val="32"/>
+          <w:szCs w:val="32"/>
+        </w:rPr>
+        <w:t xml:space="preserve"># </w:t>
+      </w:r>
+      <w:r>
+        <w:rPr>
+          <w:sz w:val="32"/>
+          <w:szCs w:val="32"/>
+        </w:rPr>
+        <w:t>The function has no idea whether the user will click in</w:t>
+      </w:r>
+      <w:r>
+        <w:rPr>
+          <w:sz w:val="32"/>
+          <w:szCs w:val="32"/>
+        </w:rPr>
+        <w:t xml:space="preserve"> </w:t>
+      </w:r>
+      <w:r>
+        <w:rPr>
+          <w:sz w:val="32"/>
+          <w:szCs w:val="32"/>
+        </w:rPr>
+        <w:t>2 seconds</w:t>
+      </w:r>
+      <w:r>
+        <w:rPr>
+          <w:sz w:val="32"/>
+          <w:szCs w:val="32"/>
+        </w:rPr>
+        <w:t xml:space="preserve">, </w:t>
+      </w:r>
+      <w:r>
+        <w:rPr>
+          <w:sz w:val="32"/>
+          <w:szCs w:val="32"/>
+        </w:rPr>
+        <w:t>20 seconds</w:t>
+      </w:r>
+      <w:r>
+        <w:rPr>
+          <w:sz w:val="32"/>
+          <w:szCs w:val="32"/>
+        </w:rPr>
+        <w:t xml:space="preserve"> or </w:t>
+      </w:r>
+      <w:r>
+        <w:rPr>
+          <w:sz w:val="32"/>
+          <w:szCs w:val="32"/>
+        </w:rPr>
+        <w:t>2 hours</w:t>
+      </w:r>
+      <w:r>
+        <w:rPr>
+          <w:sz w:val="32"/>
+          <w:szCs w:val="32"/>
+        </w:rPr>
+        <w:t xml:space="preserve">. </w:t>
+      </w:r>
+      <w:r>
+        <w:rPr>
+          <w:sz w:val="32"/>
+          <w:szCs w:val="32"/>
+        </w:rPr>
+        <w:t>The completion depends on someone else.</w:t>
+      </w:r>
+      <w:r>
+        <w:rPr>
+          <w:sz w:val="32"/>
+          <w:szCs w:val="32"/>
+        </w:rPr>
+        <w:t xml:space="preserve"> </w:t>
+      </w:r>
+      <w:r>
+        <w:rPr>
+          <w:sz w:val="32"/>
+          <w:szCs w:val="32"/>
+        </w:rPr>
+        <w:t xml:space="preserve">That's exactly what </w:t>
+      </w:r>
+      <w:r>
+        <w:rPr>
+          <w:b/>
+          <w:bCs/>
+          <w:sz w:val="32"/>
+          <w:szCs w:val="32"/>
+        </w:rPr>
+        <w:t>Completer</w:t>
+      </w:r>
+      <w:r>
+        <w:rPr>
+          <w:sz w:val="32"/>
+          <w:szCs w:val="32"/>
+        </w:rPr>
+        <w:t xml:space="preserve"> is for.</w:t>
+      </w:r>
+      <w:r>
+        <w:rPr>
+          <w:sz w:val="32"/>
+          <w:szCs w:val="32"/>
+        </w:rPr>
+        <w:t xml:space="preserve"> (It can also solve indicating API success problem in </w:t>
+      </w:r>
+      <w:proofErr w:type="spellStart"/>
+      <w:r>
+        <w:rPr>
+          <w:b/>
+          <w:bCs/>
+          <w:sz w:val="32"/>
+          <w:szCs w:val="32"/>
+        </w:rPr>
+        <w:t>Stream.listen</w:t>
+      </w:r>
+      <w:proofErr w:type="spellEnd"/>
+      <w:r>
+        <w:rPr>
+          <w:b/>
+          <w:bCs/>
+          <w:sz w:val="32"/>
+          <w:szCs w:val="32"/>
+        </w:rPr>
+        <w:t>()</w:t>
+      </w:r>
+      <w:r>
+        <w:rPr>
+          <w:sz w:val="32"/>
+          <w:szCs w:val="32"/>
+        </w:rPr>
+        <w:t>)</w:t>
+      </w:r>
+    </w:p>
+    <w:p>
+      <w:pPr>
+        <w:jc w:val="both"/>
+        <w:rPr>
+          <w:sz w:val="32"/>
+          <w:szCs w:val="32"/>
+        </w:rPr>
+      </w:pPr>
+    </w:p>
+    <w:p>
+      <w:pPr>
+        <w:jc w:val="both"/>
+        <w:rPr>
+          <w:sz w:val="32"/>
+          <w:szCs w:val="32"/>
+        </w:rPr>
+      </w:pPr>
+      <w:r>
+        <w:rPr>
+          <w:sz w:val="32"/>
+          <w:szCs w:val="32"/>
+        </w:rPr>
+        <w:t>Basic Usage:</w:t>
+      </w:r>
+    </w:p>
+    <w:p>
+      <w:pPr>
+        <w:jc w:val="both"/>
+        <w:rPr>
+          <w:sz w:val="32"/>
+          <w:szCs w:val="32"/>
+        </w:rPr>
+      </w:pPr>
+      <w:r>
+        <w:rPr>
+          <w:sz w:val="32"/>
+          <w:szCs w:val="32"/>
+        </w:rPr>
+        <w:t xml:space="preserve"># </w:t>
+      </w:r>
+      <w:r>
+        <w:rPr>
+          <w:sz w:val="32"/>
+          <w:szCs w:val="32"/>
+        </w:rPr>
+        <w:t xml:space="preserve">Here, the </w:t>
+      </w:r>
+      <w:r>
+        <w:rPr>
+          <w:b/>
+          <w:bCs/>
+          <w:sz w:val="32"/>
+          <w:szCs w:val="32"/>
+        </w:rPr>
+        <w:t>Future&lt;String&gt;</w:t>
+      </w:r>
+      <w:r>
+        <w:rPr>
+          <w:sz w:val="32"/>
+          <w:szCs w:val="32"/>
+        </w:rPr>
+        <w:t xml:space="preserve"> (</w:t>
+      </w:r>
+      <w:r>
+        <w:rPr>
+          <w:b/>
+          <w:bCs/>
+          <w:sz w:val="32"/>
+          <w:szCs w:val="32"/>
+        </w:rPr>
+        <w:t>future</w:t>
+      </w:r>
+      <w:r>
+        <w:rPr>
+          <w:sz w:val="32"/>
+          <w:szCs w:val="32"/>
+        </w:rPr>
+        <w:t xml:space="preserve">) is read only, the </w:t>
+      </w:r>
+      <w:r>
+        <w:rPr>
+          <w:b/>
+          <w:bCs/>
+          <w:sz w:val="32"/>
+          <w:szCs w:val="32"/>
+        </w:rPr>
+        <w:t>Completer</w:t>
+      </w:r>
+      <w:r>
+        <w:rPr>
+          <w:sz w:val="32"/>
+          <w:szCs w:val="32"/>
+        </w:rPr>
+        <w:t xml:space="preserve"> controls it. First create an object of </w:t>
+      </w:r>
+      <w:r>
+        <w:rPr>
+          <w:b/>
+          <w:bCs/>
+          <w:sz w:val="32"/>
+          <w:szCs w:val="32"/>
+        </w:rPr>
+        <w:t>Completer&lt;T</w:t>
+      </w:r>
+      <w:proofErr w:type="gramStart"/>
+      <w:r>
+        <w:rPr>
+          <w:b/>
+          <w:bCs/>
+          <w:sz w:val="32"/>
+          <w:szCs w:val="32"/>
+        </w:rPr>
+        <w:t>&gt;(</w:t>
+      </w:r>
+      <w:proofErr w:type="gramEnd"/>
+      <w:r>
+        <w:rPr>
+          <w:b/>
+          <w:bCs/>
+          <w:sz w:val="32"/>
+          <w:szCs w:val="32"/>
+        </w:rPr>
+        <w:t>)</w:t>
+      </w:r>
+      <w:r>
+        <w:rPr>
+          <w:b/>
+          <w:bCs/>
+          <w:sz w:val="32"/>
+          <w:szCs w:val="32"/>
+        </w:rPr>
+        <w:t xml:space="preserve"> </w:t>
+      </w:r>
+      <w:r>
+        <w:rPr>
+          <w:sz w:val="32"/>
+          <w:szCs w:val="32"/>
+        </w:rPr>
+        <w:t>using OOP</w:t>
+      </w:r>
+    </w:p>
+    <w:p>
+      <w:pPr>
+        <w:jc w:val="both"/>
+        <w:rPr>
+          <w:sz w:val="32"/>
+          <w:szCs w:val="32"/>
+        </w:rPr>
+      </w:pPr>
+      <w:r>
+        <w:rPr>
+          <w:sz w:val="32"/>
+          <w:szCs w:val="32"/>
+        </w:rPr>
+        <w:t># And</w:t>
+      </w:r>
+      <w:r>
+        <w:rPr>
+          <w:b/>
+          <w:bCs/>
+          <w:sz w:val="32"/>
+          <w:szCs w:val="32"/>
+        </w:rPr>
+        <w:t xml:space="preserve"> return _</w:t>
+      </w:r>
+      <w:proofErr w:type="spellStart"/>
+      <w:proofErr w:type="gramStart"/>
+      <w:r>
+        <w:rPr>
+          <w:b/>
+          <w:bCs/>
+          <w:sz w:val="32"/>
+          <w:szCs w:val="32"/>
+        </w:rPr>
+        <w:t>completer.future</w:t>
+      </w:r>
+      <w:proofErr w:type="spellEnd"/>
+      <w:proofErr w:type="gramEnd"/>
+      <w:r>
+        <w:rPr>
+          <w:sz w:val="32"/>
+          <w:szCs w:val="32"/>
+        </w:rPr>
+        <w:t xml:space="preserve"> in the method (</w:t>
+      </w:r>
+      <w:r>
+        <w:rPr>
+          <w:b/>
+          <w:bCs/>
+          <w:sz w:val="32"/>
+          <w:szCs w:val="32"/>
+        </w:rPr>
+        <w:t>future</w:t>
+      </w:r>
+      <w:r>
+        <w:rPr>
+          <w:sz w:val="32"/>
+          <w:szCs w:val="32"/>
+        </w:rPr>
+        <w:t>) that we want to control. Value of that</w:t>
+      </w:r>
+      <w:r>
+        <w:rPr>
+          <w:b/>
+          <w:bCs/>
+          <w:sz w:val="32"/>
+          <w:szCs w:val="32"/>
+        </w:rPr>
+        <w:t xml:space="preserve"> future </w:t>
+      </w:r>
+      <w:r>
+        <w:rPr>
+          <w:sz w:val="32"/>
+          <w:szCs w:val="32"/>
+        </w:rPr>
+        <w:t xml:space="preserve">method will be returned by </w:t>
+      </w:r>
+      <w:r>
+        <w:rPr>
+          <w:b/>
+          <w:bCs/>
+          <w:sz w:val="32"/>
+          <w:szCs w:val="32"/>
+        </w:rPr>
+        <w:t>_</w:t>
+      </w:r>
+      <w:proofErr w:type="spellStart"/>
+      <w:proofErr w:type="gramStart"/>
+      <w:r>
+        <w:rPr>
+          <w:b/>
+          <w:bCs/>
+          <w:sz w:val="32"/>
+          <w:szCs w:val="32"/>
+        </w:rPr>
+        <w:t>completer.complete</w:t>
+      </w:r>
+      <w:proofErr w:type="spellEnd"/>
+      <w:proofErr w:type="gramEnd"/>
+      <w:r>
+        <w:rPr>
+          <w:b/>
+          <w:bCs/>
+          <w:sz w:val="32"/>
+          <w:szCs w:val="32"/>
+        </w:rPr>
+        <w:t>(…)</w:t>
+      </w:r>
+      <w:r>
+        <w:rPr>
+          <w:sz w:val="32"/>
+          <w:szCs w:val="32"/>
+        </w:rPr>
+        <w:t xml:space="preserve"> method when </w:t>
+      </w:r>
+      <w:r>
+        <w:rPr>
+          <w:sz w:val="32"/>
+          <w:szCs w:val="32"/>
+        </w:rPr>
+        <w:t>called</w:t>
+      </w:r>
+    </w:p>
+    <w:p>
+      <w:pPr>
+        <w:jc w:val="both"/>
+        <w:rPr>
+          <w:sz w:val="32"/>
+          <w:szCs w:val="32"/>
+        </w:rPr>
+      </w:pPr>
+      <w:r>
+        <w:rPr>
+          <w:sz w:val="32"/>
+          <w:szCs w:val="32"/>
+        </w:rPr>
+        <w:t xml:space="preserve"># Also check </w:t>
+      </w:r>
+      <w:r>
+        <w:rPr>
+          <w:b/>
+          <w:bCs/>
+          <w:sz w:val="32"/>
+          <w:szCs w:val="32"/>
+        </w:rPr>
+        <w:t>_</w:t>
+      </w:r>
+      <w:proofErr w:type="spellStart"/>
+      <w:proofErr w:type="gramStart"/>
+      <w:r>
+        <w:rPr>
+          <w:b/>
+          <w:bCs/>
+          <w:sz w:val="32"/>
+          <w:szCs w:val="32"/>
+        </w:rPr>
+        <w:t>comleter.isCompleted</w:t>
+      </w:r>
+      <w:proofErr w:type="spellEnd"/>
+      <w:proofErr w:type="gramEnd"/>
+      <w:r>
+        <w:rPr>
+          <w:sz w:val="32"/>
+          <w:szCs w:val="32"/>
+        </w:rPr>
+        <w:t xml:space="preserve"> to see if </w:t>
+      </w:r>
+      <w:r>
+        <w:rPr>
+          <w:b/>
+          <w:bCs/>
+          <w:sz w:val="32"/>
+          <w:szCs w:val="32"/>
+        </w:rPr>
+        <w:t>future</w:t>
+      </w:r>
+      <w:r>
+        <w:rPr>
+          <w:sz w:val="32"/>
+          <w:szCs w:val="32"/>
+        </w:rPr>
+        <w:t xml:space="preserve"> is already completed or not. We can also complete with error instead of value using</w:t>
+      </w:r>
+      <w:r>
+        <w:rPr>
+          <w:b/>
+          <w:bCs/>
+          <w:sz w:val="32"/>
+          <w:szCs w:val="32"/>
+        </w:rPr>
+        <w:t xml:space="preserve"> _</w:t>
+      </w:r>
+      <w:proofErr w:type="spellStart"/>
+      <w:proofErr w:type="gramStart"/>
+      <w:r>
+        <w:rPr>
+          <w:b/>
+          <w:bCs/>
+          <w:sz w:val="32"/>
+          <w:szCs w:val="32"/>
+        </w:rPr>
+        <w:t>completer.completeError</w:t>
+      </w:r>
+      <w:proofErr w:type="spellEnd"/>
+      <w:proofErr w:type="gramEnd"/>
+      <w:r>
+        <w:rPr>
+          <w:b/>
+          <w:bCs/>
+          <w:sz w:val="32"/>
+          <w:szCs w:val="32"/>
+        </w:rPr>
+        <w:t>(‘…’)</w:t>
+      </w:r>
+    </w:p>
+    <w:p>
+      <w:pPr>
+        <w:jc w:val="both"/>
+        <w:rPr>
+          <w:b/>
+          <w:bCs/>
+          <w:color w:val="D86DCB" w:themeColor="accent5" w:themeTint="99"/>
+          <w:sz w:val="32"/>
+          <w:szCs w:val="32"/>
+        </w:rPr>
+      </w:pPr>
+      <w:r>
+        <w:rPr>
+          <w:b/>
+          <w:bCs/>
+          <w:color w:val="D86DCB" w:themeColor="accent5" w:themeTint="99"/>
+          <w:sz w:val="32"/>
+          <w:szCs w:val="32"/>
+        </w:rPr>
+        <w:t>class User {</w:t>
+      </w:r>
+    </w:p>
+    <w:p>
+      <w:pPr>
+        <w:jc w:val="both"/>
+        <w:rPr>
+          <w:b/>
+          <w:bCs/>
+          <w:color w:val="D86DCB" w:themeColor="accent5" w:themeTint="99"/>
+          <w:sz w:val="32"/>
+          <w:szCs w:val="32"/>
+        </w:rPr>
+      </w:pPr>
+      <w:r>
+        <w:rPr>
+          <w:b/>
+          <w:bCs/>
+          <w:color w:val="D86DCB" w:themeColor="accent5" w:themeTint="99"/>
+          <w:sz w:val="32"/>
+          <w:szCs w:val="32"/>
+        </w:rPr>
+        <w:t xml:space="preserve">  final Completer&lt;String&gt; _completer = Completer&lt;String</w:t>
+      </w:r>
+      <w:proofErr w:type="gramStart"/>
+      <w:r>
+        <w:rPr>
+          <w:b/>
+          <w:bCs/>
+          <w:color w:val="D86DCB" w:themeColor="accent5" w:themeTint="99"/>
+          <w:sz w:val="32"/>
+          <w:szCs w:val="32"/>
+        </w:rPr>
+        <w:t>&gt;(</w:t>
+      </w:r>
+      <w:proofErr w:type="gramEnd"/>
+      <w:r>
+        <w:rPr>
+          <w:b/>
+          <w:bCs/>
+          <w:color w:val="D86DCB" w:themeColor="accent5" w:themeTint="99"/>
+          <w:sz w:val="32"/>
+          <w:szCs w:val="32"/>
+        </w:rPr>
+        <w:t>);</w:t>
+      </w:r>
+    </w:p>
+    <w:p>
+      <w:pPr>
+        <w:jc w:val="both"/>
+        <w:rPr>
+          <w:b/>
+          <w:bCs/>
+          <w:color w:val="D86DCB" w:themeColor="accent5" w:themeTint="99"/>
+          <w:sz w:val="32"/>
+          <w:szCs w:val="32"/>
+        </w:rPr>
+      </w:pPr>
+      <w:r>
+        <w:rPr>
+          <w:b/>
+          <w:bCs/>
+          <w:color w:val="D86DCB" w:themeColor="accent5" w:themeTint="99"/>
+          <w:sz w:val="32"/>
+          <w:szCs w:val="32"/>
+        </w:rPr>
+        <w:lastRenderedPageBreak/>
+        <w:t xml:space="preserve">  Future&lt;String&gt; </w:t>
+      </w:r>
+      <w:proofErr w:type="gramStart"/>
+      <w:r>
+        <w:rPr>
+          <w:b/>
+          <w:bCs/>
+          <w:color w:val="D86DCB" w:themeColor="accent5" w:themeTint="99"/>
+          <w:sz w:val="32"/>
+          <w:szCs w:val="32"/>
+        </w:rPr>
+        <w:t>future(</w:t>
+      </w:r>
+      <w:proofErr w:type="gramEnd"/>
+      <w:r>
+        <w:rPr>
+          <w:b/>
+          <w:bCs/>
+          <w:color w:val="D86DCB" w:themeColor="accent5" w:themeTint="99"/>
+          <w:sz w:val="32"/>
+          <w:szCs w:val="32"/>
+        </w:rPr>
+        <w:t>) async {</w:t>
+      </w:r>
+    </w:p>
+    <w:p>
+      <w:pPr>
+        <w:jc w:val="both"/>
+        <w:rPr>
+          <w:b/>
+          <w:bCs/>
+          <w:color w:val="D86DCB" w:themeColor="accent5" w:themeTint="99"/>
+          <w:sz w:val="32"/>
+          <w:szCs w:val="32"/>
+        </w:rPr>
+      </w:pPr>
+      <w:r>
+        <w:rPr>
+          <w:b/>
+          <w:bCs/>
+          <w:color w:val="D86DCB" w:themeColor="accent5" w:themeTint="99"/>
+          <w:sz w:val="32"/>
+          <w:szCs w:val="32"/>
+        </w:rPr>
+        <w:t xml:space="preserve">    return _</w:t>
+      </w:r>
+      <w:proofErr w:type="spellStart"/>
+      <w:proofErr w:type="gramStart"/>
+      <w:r>
+        <w:rPr>
+          <w:b/>
+          <w:bCs/>
+          <w:color w:val="D86DCB" w:themeColor="accent5" w:themeTint="99"/>
+          <w:sz w:val="32"/>
+          <w:szCs w:val="32"/>
+        </w:rPr>
+        <w:t>completer.future</w:t>
+      </w:r>
+      <w:proofErr w:type="spellEnd"/>
+      <w:proofErr w:type="gramEnd"/>
+      <w:r>
+        <w:rPr>
+          <w:b/>
+          <w:bCs/>
+          <w:color w:val="D86DCB" w:themeColor="accent5" w:themeTint="99"/>
+          <w:sz w:val="32"/>
+          <w:szCs w:val="32"/>
+        </w:rPr>
+        <w:t>;</w:t>
+      </w:r>
+    </w:p>
+    <w:p>
+      <w:pPr>
+        <w:jc w:val="both"/>
+        <w:rPr>
+          <w:b/>
+          <w:bCs/>
+          <w:color w:val="D86DCB" w:themeColor="accent5" w:themeTint="99"/>
+          <w:sz w:val="32"/>
+          <w:szCs w:val="32"/>
+        </w:rPr>
+      </w:pPr>
+      <w:r>
+        <w:rPr>
+          <w:b/>
+          <w:bCs/>
+          <w:color w:val="D86DCB" w:themeColor="accent5" w:themeTint="99"/>
+          <w:sz w:val="32"/>
+          <w:szCs w:val="32"/>
+        </w:rPr>
+        <w:t xml:space="preserve">  }</w:t>
+      </w:r>
+    </w:p>
+    <w:p>
+      <w:pPr>
+        <w:jc w:val="both"/>
+        <w:rPr>
+          <w:b/>
+          <w:bCs/>
+          <w:color w:val="D86DCB" w:themeColor="accent5" w:themeTint="99"/>
+          <w:sz w:val="32"/>
+          <w:szCs w:val="32"/>
+        </w:rPr>
+      </w:pPr>
+      <w:r>
+        <w:rPr>
+          <w:b/>
+          <w:bCs/>
+          <w:color w:val="D86DCB" w:themeColor="accent5" w:themeTint="99"/>
+          <w:sz w:val="32"/>
+          <w:szCs w:val="32"/>
+        </w:rPr>
+        <w:t xml:space="preserve">  void </w:t>
+      </w:r>
+      <w:proofErr w:type="gramStart"/>
+      <w:r>
+        <w:rPr>
+          <w:b/>
+          <w:bCs/>
+          <w:color w:val="D86DCB" w:themeColor="accent5" w:themeTint="99"/>
+          <w:sz w:val="32"/>
+          <w:szCs w:val="32"/>
+        </w:rPr>
+        <w:t>complete(</w:t>
+      </w:r>
+      <w:proofErr w:type="gramEnd"/>
+      <w:r>
+        <w:rPr>
+          <w:b/>
+          <w:bCs/>
+          <w:color w:val="D86DCB" w:themeColor="accent5" w:themeTint="99"/>
+          <w:sz w:val="32"/>
+          <w:szCs w:val="32"/>
+        </w:rPr>
+        <w:t>String value) {</w:t>
+      </w:r>
+    </w:p>
+    <w:p>
+      <w:pPr>
+        <w:jc w:val="both"/>
+        <w:rPr>
+          <w:b/>
+          <w:bCs/>
+          <w:color w:val="D86DCB" w:themeColor="accent5" w:themeTint="99"/>
+          <w:sz w:val="32"/>
+          <w:szCs w:val="32"/>
+        </w:rPr>
+      </w:pPr>
+      <w:r>
+        <w:rPr>
+          <w:b/>
+          <w:bCs/>
+          <w:color w:val="D86DCB" w:themeColor="accent5" w:themeTint="99"/>
+          <w:sz w:val="32"/>
+          <w:szCs w:val="32"/>
+        </w:rPr>
+        <w:t xml:space="preserve">    </w:t>
+      </w:r>
+      <w:proofErr w:type="gramStart"/>
+      <w:r>
+        <w:rPr>
+          <w:b/>
+          <w:bCs/>
+          <w:color w:val="D86DCB" w:themeColor="accent5" w:themeTint="99"/>
+          <w:sz w:val="32"/>
+          <w:szCs w:val="32"/>
+        </w:rPr>
+        <w:t>if(</w:t>
+      </w:r>
+      <w:proofErr w:type="gramEnd"/>
+      <w:r>
+        <w:rPr>
+          <w:b/>
+          <w:bCs/>
+          <w:color w:val="D86DCB" w:themeColor="accent5" w:themeTint="99"/>
+          <w:sz w:val="32"/>
+          <w:szCs w:val="32"/>
+        </w:rPr>
+        <w:t>_</w:t>
+      </w:r>
+      <w:proofErr w:type="spellStart"/>
+      <w:r>
+        <w:rPr>
+          <w:b/>
+          <w:bCs/>
+          <w:color w:val="D86DCB" w:themeColor="accent5" w:themeTint="99"/>
+          <w:sz w:val="32"/>
+          <w:szCs w:val="32"/>
+        </w:rPr>
+        <w:t>completer.isCompleted</w:t>
+      </w:r>
+      <w:proofErr w:type="spellEnd"/>
+      <w:r>
+        <w:rPr>
+          <w:b/>
+          <w:bCs/>
+          <w:color w:val="D86DCB" w:themeColor="accent5" w:themeTint="99"/>
+          <w:sz w:val="32"/>
+          <w:szCs w:val="32"/>
+        </w:rPr>
+        <w:t xml:space="preserve"> == false) {</w:t>
+      </w:r>
+    </w:p>
+    <w:p>
+      <w:pPr>
+        <w:jc w:val="both"/>
+        <w:rPr>
+          <w:b/>
+          <w:bCs/>
+          <w:color w:val="D86DCB" w:themeColor="accent5" w:themeTint="99"/>
+          <w:sz w:val="32"/>
+          <w:szCs w:val="32"/>
+        </w:rPr>
+      </w:pPr>
+      <w:r>
+        <w:rPr>
+          <w:b/>
+          <w:bCs/>
+          <w:color w:val="D86DCB" w:themeColor="accent5" w:themeTint="99"/>
+          <w:sz w:val="32"/>
+          <w:szCs w:val="32"/>
+        </w:rPr>
+        <w:t xml:space="preserve">    _</w:t>
+      </w:r>
+      <w:proofErr w:type="spellStart"/>
+      <w:proofErr w:type="gramStart"/>
+      <w:r>
+        <w:rPr>
+          <w:b/>
+          <w:bCs/>
+          <w:color w:val="D86DCB" w:themeColor="accent5" w:themeTint="99"/>
+          <w:sz w:val="32"/>
+          <w:szCs w:val="32"/>
+        </w:rPr>
+        <w:t>completer.complete</w:t>
+      </w:r>
+      <w:proofErr w:type="spellEnd"/>
+      <w:proofErr w:type="gramEnd"/>
+      <w:r>
+        <w:rPr>
+          <w:b/>
+          <w:bCs/>
+          <w:color w:val="D86DCB" w:themeColor="accent5" w:themeTint="99"/>
+          <w:sz w:val="32"/>
+          <w:szCs w:val="32"/>
+        </w:rPr>
+        <w:t xml:space="preserve">(value); </w:t>
+      </w:r>
+    </w:p>
+    <w:p>
+      <w:pPr>
+        <w:jc w:val="both"/>
+        <w:rPr>
+          <w:b/>
+          <w:bCs/>
+          <w:color w:val="D86DCB" w:themeColor="accent5" w:themeTint="99"/>
+          <w:sz w:val="32"/>
+          <w:szCs w:val="32"/>
+        </w:rPr>
+      </w:pPr>
+      <w:r>
+        <w:rPr>
+          <w:b/>
+          <w:bCs/>
+          <w:color w:val="D86DCB" w:themeColor="accent5" w:themeTint="99"/>
+          <w:sz w:val="32"/>
+          <w:szCs w:val="32"/>
+        </w:rPr>
+        <w:t xml:space="preserve">    }</w:t>
+      </w:r>
+    </w:p>
+    <w:p>
+      <w:pPr>
+        <w:jc w:val="both"/>
+        <w:rPr>
+          <w:b/>
+          <w:bCs/>
+          <w:color w:val="D86DCB" w:themeColor="accent5" w:themeTint="99"/>
+          <w:sz w:val="32"/>
+          <w:szCs w:val="32"/>
+        </w:rPr>
+      </w:pPr>
+      <w:r>
+        <w:rPr>
+          <w:b/>
+          <w:bCs/>
+          <w:color w:val="D86DCB" w:themeColor="accent5" w:themeTint="99"/>
+          <w:sz w:val="32"/>
+          <w:szCs w:val="32"/>
+        </w:rPr>
+        <w:t xml:space="preserve">  }</w:t>
+      </w:r>
+    </w:p>
+    <w:p>
+      <w:pPr>
+        <w:jc w:val="both"/>
+        <w:rPr>
+          <w:b/>
+          <w:bCs/>
+          <w:color w:val="D86DCB" w:themeColor="accent5" w:themeTint="99"/>
+          <w:sz w:val="32"/>
+          <w:szCs w:val="32"/>
+        </w:rPr>
+      </w:pPr>
+      <w:r>
+        <w:rPr>
+          <w:b/>
+          <w:bCs/>
+          <w:color w:val="D86DCB" w:themeColor="accent5" w:themeTint="99"/>
+          <w:sz w:val="32"/>
+          <w:szCs w:val="32"/>
+        </w:rPr>
+        <w:t xml:space="preserve">  void </w:t>
+      </w:r>
+      <w:proofErr w:type="spellStart"/>
+      <w:proofErr w:type="gramStart"/>
+      <w:r>
+        <w:rPr>
+          <w:b/>
+          <w:bCs/>
+          <w:color w:val="D86DCB" w:themeColor="accent5" w:themeTint="99"/>
+          <w:sz w:val="32"/>
+          <w:szCs w:val="32"/>
+        </w:rPr>
+        <w:t>completeWithError</w:t>
+      </w:r>
+      <w:proofErr w:type="spellEnd"/>
+      <w:r>
+        <w:rPr>
+          <w:b/>
+          <w:bCs/>
+          <w:color w:val="D86DCB" w:themeColor="accent5" w:themeTint="99"/>
+          <w:sz w:val="32"/>
+          <w:szCs w:val="32"/>
+        </w:rPr>
+        <w:t>(</w:t>
+      </w:r>
+      <w:proofErr w:type="gramEnd"/>
+      <w:r>
+        <w:rPr>
+          <w:b/>
+          <w:bCs/>
+          <w:color w:val="D86DCB" w:themeColor="accent5" w:themeTint="99"/>
+          <w:sz w:val="32"/>
+          <w:szCs w:val="32"/>
+        </w:rPr>
+        <w:t>) {</w:t>
+      </w:r>
+    </w:p>
+    <w:p>
+      <w:pPr>
+        <w:jc w:val="both"/>
+        <w:rPr>
+          <w:b/>
+          <w:bCs/>
+          <w:color w:val="D86DCB" w:themeColor="accent5" w:themeTint="99"/>
+          <w:sz w:val="32"/>
+          <w:szCs w:val="32"/>
+        </w:rPr>
+      </w:pPr>
+      <w:r>
+        <w:rPr>
+          <w:b/>
+          <w:bCs/>
+          <w:color w:val="D86DCB" w:themeColor="accent5" w:themeTint="99"/>
+          <w:sz w:val="32"/>
+          <w:szCs w:val="32"/>
+        </w:rPr>
+        <w:t xml:space="preserve">    </w:t>
+      </w:r>
+      <w:proofErr w:type="gramStart"/>
+      <w:r>
+        <w:rPr>
+          <w:b/>
+          <w:bCs/>
+          <w:color w:val="D86DCB" w:themeColor="accent5" w:themeTint="99"/>
+          <w:sz w:val="32"/>
+          <w:szCs w:val="32"/>
+        </w:rPr>
+        <w:t>if(</w:t>
+      </w:r>
+      <w:proofErr w:type="gramEnd"/>
+      <w:r>
+        <w:rPr>
+          <w:b/>
+          <w:bCs/>
+          <w:color w:val="D86DCB" w:themeColor="accent5" w:themeTint="99"/>
+          <w:sz w:val="32"/>
+          <w:szCs w:val="32"/>
+        </w:rPr>
+        <w:t>_</w:t>
+      </w:r>
+      <w:proofErr w:type="spellStart"/>
+      <w:r>
+        <w:rPr>
+          <w:b/>
+          <w:bCs/>
+          <w:color w:val="D86DCB" w:themeColor="accent5" w:themeTint="99"/>
+          <w:sz w:val="32"/>
+          <w:szCs w:val="32"/>
+        </w:rPr>
+        <w:t>completer.isCompleted</w:t>
+      </w:r>
+      <w:proofErr w:type="spellEnd"/>
+      <w:r>
+        <w:rPr>
+          <w:b/>
+          <w:bCs/>
+          <w:color w:val="D86DCB" w:themeColor="accent5" w:themeTint="99"/>
+          <w:sz w:val="32"/>
+          <w:szCs w:val="32"/>
+        </w:rPr>
+        <w:t xml:space="preserve"> == false) {</w:t>
+      </w:r>
+    </w:p>
+    <w:p>
+      <w:pPr>
+        <w:jc w:val="both"/>
+        <w:rPr>
+          <w:b/>
+          <w:bCs/>
+          <w:color w:val="D86DCB" w:themeColor="accent5" w:themeTint="99"/>
+          <w:sz w:val="32"/>
+          <w:szCs w:val="32"/>
+        </w:rPr>
+      </w:pPr>
+      <w:r>
+        <w:rPr>
+          <w:b/>
+          <w:bCs/>
+          <w:color w:val="D86DCB" w:themeColor="accent5" w:themeTint="99"/>
+          <w:sz w:val="32"/>
+          <w:szCs w:val="32"/>
+        </w:rPr>
+        <w:t xml:space="preserve">    _</w:t>
+      </w:r>
+      <w:proofErr w:type="spellStart"/>
+      <w:proofErr w:type="gramStart"/>
+      <w:r>
+        <w:rPr>
+          <w:b/>
+          <w:bCs/>
+          <w:color w:val="D86DCB" w:themeColor="accent5" w:themeTint="99"/>
+          <w:sz w:val="32"/>
+          <w:szCs w:val="32"/>
+        </w:rPr>
+        <w:t>completer.completeError</w:t>
+      </w:r>
+      <w:proofErr w:type="spellEnd"/>
+      <w:proofErr w:type="gramEnd"/>
+      <w:r>
+        <w:rPr>
+          <w:b/>
+          <w:bCs/>
+          <w:color w:val="D86DCB" w:themeColor="accent5" w:themeTint="99"/>
+          <w:sz w:val="32"/>
+          <w:szCs w:val="32"/>
+        </w:rPr>
+        <w:t xml:space="preserve">('Error'); </w:t>
+      </w:r>
+    </w:p>
+    <w:p>
+      <w:pPr>
+        <w:jc w:val="both"/>
+        <w:rPr>
+          <w:b/>
+          <w:bCs/>
+          <w:color w:val="D86DCB" w:themeColor="accent5" w:themeTint="99"/>
+          <w:sz w:val="32"/>
+          <w:szCs w:val="32"/>
+        </w:rPr>
+      </w:pPr>
+      <w:r>
+        <w:rPr>
+          <w:b/>
+          <w:bCs/>
+          <w:color w:val="D86DCB" w:themeColor="accent5" w:themeTint="99"/>
+          <w:sz w:val="32"/>
+          <w:szCs w:val="32"/>
+        </w:rPr>
+        <w:t xml:space="preserve">    }</w:t>
+      </w:r>
+    </w:p>
+    <w:p>
+      <w:pPr>
+        <w:jc w:val="both"/>
+        <w:rPr>
+          <w:b/>
+          <w:bCs/>
+          <w:color w:val="D86DCB" w:themeColor="accent5" w:themeTint="99"/>
+          <w:sz w:val="32"/>
+          <w:szCs w:val="32"/>
+        </w:rPr>
+      </w:pPr>
+      <w:r>
+        <w:rPr>
+          <w:b/>
+          <w:bCs/>
+          <w:color w:val="D86DCB" w:themeColor="accent5" w:themeTint="99"/>
+          <w:sz w:val="32"/>
+          <w:szCs w:val="32"/>
+        </w:rPr>
+        <w:t xml:space="preserve">  }</w:t>
+      </w:r>
+    </w:p>
+    <w:p>
+      <w:pPr>
+        <w:jc w:val="both"/>
+        <w:rPr>
+          <w:b/>
+          <w:bCs/>
+          <w:color w:val="D86DCB" w:themeColor="accent5" w:themeTint="99"/>
+          <w:sz w:val="32"/>
+          <w:szCs w:val="32"/>
+        </w:rPr>
+      </w:pPr>
+      <w:r>
+        <w:rPr>
+          <w:b/>
+          <w:bCs/>
+          <w:color w:val="D86DCB" w:themeColor="accent5" w:themeTint="99"/>
+          <w:sz w:val="32"/>
+          <w:szCs w:val="32"/>
+        </w:rPr>
+        <w:t>}</w:t>
+      </w:r>
+    </w:p>
+    <w:p>
+      <w:pPr>
+        <w:jc w:val="both"/>
+        <w:rPr>
+          <w:sz w:val="32"/>
+          <w:szCs w:val="32"/>
+        </w:rPr>
+      </w:pPr>
+      <w:r>
+        <w:rPr>
+          <w:sz w:val="32"/>
+          <w:szCs w:val="32"/>
+        </w:rPr>
+        <w:t xml:space="preserve"># In the UI, </w:t>
+      </w:r>
+      <w:r>
+        <w:rPr>
+          <w:b/>
+          <w:bCs/>
+          <w:sz w:val="32"/>
+          <w:szCs w:val="32"/>
+        </w:rPr>
+        <w:t xml:space="preserve">await </w:t>
+      </w:r>
+      <w:proofErr w:type="gramStart"/>
+      <w:r>
+        <w:rPr>
+          <w:b/>
+          <w:bCs/>
+          <w:sz w:val="32"/>
+          <w:szCs w:val="32"/>
+        </w:rPr>
+        <w:t>future(</w:t>
+      </w:r>
+      <w:proofErr w:type="gramEnd"/>
+      <w:r>
+        <w:rPr>
+          <w:b/>
+          <w:bCs/>
+          <w:sz w:val="32"/>
+          <w:szCs w:val="32"/>
+        </w:rPr>
+        <w:t>)</w:t>
+      </w:r>
+      <w:r>
+        <w:rPr>
+          <w:sz w:val="32"/>
+          <w:szCs w:val="32"/>
+        </w:rPr>
+        <w:t xml:space="preserve"> returns ‘</w:t>
+      </w:r>
+      <w:r>
+        <w:rPr>
+          <w:b/>
+          <w:bCs/>
+          <w:sz w:val="32"/>
+          <w:szCs w:val="32"/>
+        </w:rPr>
+        <w:t>Hello</w:t>
+      </w:r>
+      <w:r>
+        <w:rPr>
+          <w:sz w:val="32"/>
+          <w:szCs w:val="32"/>
+        </w:rPr>
+        <w:t xml:space="preserve">’ when </w:t>
+      </w:r>
+      <w:r>
+        <w:rPr>
+          <w:b/>
+          <w:bCs/>
+          <w:sz w:val="32"/>
+          <w:szCs w:val="32"/>
+        </w:rPr>
+        <w:t>complete(‘Hello’)</w:t>
+      </w:r>
+      <w:r>
+        <w:rPr>
+          <w:sz w:val="32"/>
+          <w:szCs w:val="32"/>
+        </w:rPr>
+        <w:t xml:space="preserve"> is called</w:t>
+      </w:r>
+    </w:p>
+    <w:p>
+      <w:pPr>
+        <w:jc w:val="both"/>
+        <w:rPr>
+          <w:b/>
+          <w:bCs/>
+          <w:color w:val="D86DCB" w:themeColor="accent5" w:themeTint="99"/>
+          <w:sz w:val="32"/>
+          <w:szCs w:val="32"/>
+        </w:rPr>
+      </w:pPr>
+      <w:r>
+        <w:rPr>
+          <w:b/>
+          <w:bCs/>
+          <w:color w:val="D86DCB" w:themeColor="accent5" w:themeTint="99"/>
+          <w:sz w:val="32"/>
+          <w:szCs w:val="32"/>
+        </w:rPr>
+        <w:t xml:space="preserve"> </w:t>
+      </w:r>
+      <w:proofErr w:type="spellStart"/>
+      <w:proofErr w:type="gramStart"/>
+      <w:r>
+        <w:rPr>
+          <w:b/>
+          <w:bCs/>
+          <w:color w:val="D86DCB" w:themeColor="accent5" w:themeTint="99"/>
+          <w:sz w:val="32"/>
+          <w:szCs w:val="32"/>
+        </w:rPr>
+        <w:t>user.complete</w:t>
+      </w:r>
+      <w:proofErr w:type="spellEnd"/>
+      <w:proofErr w:type="gramEnd"/>
+      <w:r>
+        <w:rPr>
+          <w:b/>
+          <w:bCs/>
+          <w:color w:val="D86DCB" w:themeColor="accent5" w:themeTint="99"/>
+          <w:sz w:val="32"/>
+          <w:szCs w:val="32"/>
+        </w:rPr>
+        <w:t>(‘Hello’)</w:t>
+      </w:r>
+    </w:p>
+    <w:p>
+      <w:pPr>
+        <w:jc w:val="both"/>
+        <w:rPr>
+          <w:b/>
+          <w:bCs/>
+          <w:color w:val="D86DCB" w:themeColor="accent5" w:themeTint="99"/>
+          <w:sz w:val="32"/>
+          <w:szCs w:val="32"/>
+        </w:rPr>
+      </w:pPr>
+      <w:r>
+        <w:rPr>
+          <w:b/>
+          <w:bCs/>
+          <w:color w:val="D86DCB" w:themeColor="accent5" w:themeTint="99"/>
+          <w:sz w:val="32"/>
+          <w:szCs w:val="32"/>
+        </w:rPr>
+        <w:t>…</w:t>
+      </w:r>
+    </w:p>
+    <w:p>
+      <w:pPr>
+        <w:jc w:val="both"/>
+        <w:rPr>
+          <w:color w:val="D86DCB" w:themeColor="accent5" w:themeTint="99"/>
+          <w:sz w:val="32"/>
+          <w:szCs w:val="32"/>
+        </w:rPr>
+      </w:pPr>
+      <w:r>
+        <w:rPr>
+          <w:b/>
+          <w:bCs/>
+          <w:color w:val="D86DCB" w:themeColor="accent5" w:themeTint="99"/>
+          <w:sz w:val="32"/>
+          <w:szCs w:val="32"/>
+        </w:rPr>
+        <w:t xml:space="preserve">final value = await </w:t>
+      </w:r>
+      <w:proofErr w:type="spellStart"/>
+      <w:proofErr w:type="gramStart"/>
+      <w:r>
+        <w:rPr>
+          <w:b/>
+          <w:bCs/>
+          <w:color w:val="D86DCB" w:themeColor="accent5" w:themeTint="99"/>
+          <w:sz w:val="32"/>
+          <w:szCs w:val="32"/>
+        </w:rPr>
+        <w:t>user.future</w:t>
+      </w:r>
+      <w:proofErr w:type="spellEnd"/>
+      <w:proofErr w:type="gramEnd"/>
+      <w:r>
+        <w:rPr>
+          <w:b/>
+          <w:bCs/>
+          <w:color w:val="D86DCB" w:themeColor="accent5" w:themeTint="99"/>
+          <w:sz w:val="32"/>
+          <w:szCs w:val="32"/>
+        </w:rPr>
+        <w:t>() // returns hello</w:t>
+      </w:r>
+    </w:p>
+    <w:p>
+      <w:pPr>
+        <w:jc w:val="both"/>
+        <w:rPr>
+          <w:sz w:val="32"/>
+          <w:szCs w:val="32"/>
+        </w:rPr>
+      </w:pPr>
+    </w:p>
+    <w:p>
+      <w:pPr>
+        <w:jc w:val="both"/>
+        <w:rPr>
+          <w:sz w:val="32"/>
+          <w:szCs w:val="32"/>
+        </w:rPr>
+      </w:pPr>
+      <w:r>
+        <w:rPr>
+          <w:sz w:val="32"/>
+          <w:szCs w:val="32"/>
+        </w:rPr>
+        <w:t>Use Case:</w:t>
+      </w:r>
+    </w:p>
+    <w:p>
+      <w:pPr>
+        <w:jc w:val="both"/>
+        <w:rPr>
+          <w:sz w:val="32"/>
+          <w:szCs w:val="32"/>
+        </w:rPr>
+      </w:pPr>
+      <w:r>
+        <w:rPr>
+          <w:sz w:val="32"/>
+          <w:szCs w:val="32"/>
+        </w:rPr>
+        <w:lastRenderedPageBreak/>
+        <w:t># Use a</w:t>
+      </w:r>
+      <w:r>
+        <w:rPr>
+          <w:b/>
+          <w:bCs/>
+          <w:sz w:val="32"/>
+          <w:szCs w:val="32"/>
+        </w:rPr>
+        <w:t xml:space="preserve"> Completer&lt;T</w:t>
+      </w:r>
+      <w:proofErr w:type="gramStart"/>
+      <w:r>
+        <w:rPr>
+          <w:b/>
+          <w:bCs/>
+          <w:sz w:val="32"/>
+          <w:szCs w:val="32"/>
+        </w:rPr>
+        <w:t>&gt;(</w:t>
+      </w:r>
+      <w:proofErr w:type="gramEnd"/>
+      <w:r>
+        <w:rPr>
+          <w:b/>
+          <w:bCs/>
+          <w:sz w:val="32"/>
+          <w:szCs w:val="32"/>
+        </w:rPr>
+        <w:t>)</w:t>
+      </w:r>
+      <w:r>
+        <w:rPr>
+          <w:sz w:val="32"/>
+          <w:szCs w:val="32"/>
+        </w:rPr>
+        <w:t xml:space="preserve"> whenever the completion of a </w:t>
+      </w:r>
+      <w:r>
+        <w:rPr>
+          <w:b/>
+          <w:bCs/>
+          <w:sz w:val="32"/>
+          <w:szCs w:val="32"/>
+        </w:rPr>
+        <w:t>Future&lt;T&gt;</w:t>
+      </w:r>
+      <w:r>
+        <w:rPr>
+          <w:sz w:val="32"/>
+          <w:szCs w:val="32"/>
+        </w:rPr>
+        <w:t xml:space="preserve"> depends on an external event (like API call in </w:t>
+      </w:r>
+      <w:r>
+        <w:rPr>
+          <w:b/>
+          <w:bCs/>
+          <w:sz w:val="32"/>
+          <w:szCs w:val="32"/>
+        </w:rPr>
+        <w:t>Stream</w:t>
+      </w:r>
+      <w:r>
+        <w:rPr>
+          <w:sz w:val="32"/>
+          <w:szCs w:val="32"/>
+        </w:rPr>
+        <w:t>), not on the normal flow of the current function</w:t>
+      </w:r>
+    </w:p>
+    <w:p>
+      <w:pPr>
+        <w:jc w:val="both"/>
+        <w:rPr>
+          <w:sz w:val="32"/>
+          <w:szCs w:val="32"/>
+        </w:rPr>
+      </w:pPr>
+      <w:r>
+        <w:rPr>
+          <w:sz w:val="32"/>
+          <w:szCs w:val="32"/>
+        </w:rPr>
+        <w:t xml:space="preserve"># For example, API calling in </w:t>
+      </w:r>
+      <w:proofErr w:type="spellStart"/>
+      <w:r>
+        <w:rPr>
+          <w:b/>
+          <w:bCs/>
+          <w:sz w:val="32"/>
+          <w:szCs w:val="32"/>
+        </w:rPr>
+        <w:t>Stream.listen</w:t>
+      </w:r>
+      <w:proofErr w:type="spellEnd"/>
+      <w:r>
+        <w:rPr>
+          <w:b/>
+          <w:bCs/>
+          <w:sz w:val="32"/>
+          <w:szCs w:val="32"/>
+        </w:rPr>
+        <w:t>()</w:t>
+      </w:r>
+      <w:r>
+        <w:rPr>
+          <w:sz w:val="32"/>
+          <w:szCs w:val="32"/>
+        </w:rPr>
+        <w:t xml:space="preserve"> method and the Future&lt;T&gt; that started the Stream will only finish API calling is finished in another method. See dart3 streams doc for this</w:t>
+      </w:r>
+    </w:p>
+    <w:p>
+      <w:pPr>
+        <w:jc w:val="both"/>
+        <w:rPr>
+          <w:sz w:val="32"/>
+          <w:szCs w:val="32"/>
+        </w:rPr>
+      </w:pPr>
+    </w:p>
+    <w:p>
+      <w:pPr>
+        <w:jc w:val="center"/>
+        <w:rPr>
+          <w:sz w:val="32"/>
+          <w:szCs w:val="32"/>
+        </w:rPr>
+      </w:pPr>
+      <w:r>
+        <w:rPr>
+          <w:sz w:val="32"/>
+          <w:szCs w:val="32"/>
+        </w:rPr>
+        <w:t>Break</w:t>
+      </w:r>
+    </w:p>
+    <w:p>
+      <w:pPr>
+        <w:jc w:val="both"/>
+        <w:rPr>
+          <w:sz w:val="32"/>
+          <w:szCs w:val="32"/>
+        </w:rPr>
+      </w:pPr>
+    </w:p>
+    <w:p>
+      <w:pPr>
+        <w:jc w:val="both"/>
+        <w:rPr>
+          <w:b/>
+          <w:bCs/>
+          <w:sz w:val="32"/>
+          <w:szCs w:val="32"/>
+        </w:rPr>
+      </w:pPr>
+      <w:r>
+        <w:rPr>
+          <w:b/>
+          <w:bCs/>
+          <w:sz w:val="32"/>
+          <w:szCs w:val="32"/>
+        </w:rPr>
         <w:t>Debounce/Timer in Dart:</w:t>
       </w:r>
     </w:p>
@@ -19867,6 +22159,7 @@
           <w:sz w:val="32"/>
           <w:szCs w:val="32"/>
         </w:rPr>
+        <w:lastRenderedPageBreak/>
         <w:t xml:space="preserve">  </w:t>
       </w:r>
       <w:proofErr w:type="gramStart"/>
@@ -20458,6 +22751,7 @@
           <w:sz w:val="32"/>
           <w:szCs w:val="32"/>
         </w:rPr>
+        <w:lastRenderedPageBreak/>
         <w:t># With debounce:</w:t>
       </w:r>
     </w:p>
@@ -20498,65 +22792,327 @@
           <w:sz w:val="32"/>
           <w:szCs w:val="32"/>
         </w:rPr>
+        <w:t>DB update only once</w:t>
+      </w:r>
+    </w:p>
+    <w:p>
+      <w:pPr>
+        <w:jc w:val="both"/>
+        <w:rPr>
+          <w:sz w:val="32"/>
+          <w:szCs w:val="32"/>
+        </w:rPr>
+      </w:pPr>
+      <w:r>
+        <w:rPr>
+          <w:sz w:val="32"/>
+          <w:szCs w:val="32"/>
+        </w:rPr>
+        <w:t># That’s the idea.</w:t>
+      </w:r>
+    </w:p>
+    <w:p>
+      <w:pPr>
+        <w:jc w:val="both"/>
+        <w:rPr>
+          <w:sz w:val="32"/>
+          <w:szCs w:val="32"/>
+        </w:rPr>
+      </w:pPr>
+    </w:p>
+    <w:p>
+      <w:pPr>
+        <w:jc w:val="both"/>
+        <w:rPr>
+          <w:sz w:val="32"/>
+          <w:szCs w:val="32"/>
+        </w:rPr>
+      </w:pPr>
+      <w:r>
+        <w:rPr>
+          <w:sz w:val="32"/>
+          <w:szCs w:val="32"/>
+        </w:rPr>
+        <w:t>Database/API Debounce:</w:t>
+      </w:r>
+    </w:p>
+    <w:p>
+      <w:pPr>
+        <w:jc w:val="both"/>
+        <w:rPr>
+          <w:sz w:val="32"/>
+          <w:szCs w:val="32"/>
+        </w:rPr>
+      </w:pPr>
+      <w:r>
+        <w:rPr>
+          <w:sz w:val="32"/>
+          <w:szCs w:val="32"/>
+        </w:rPr>
+        <w:t xml:space="preserve"># For DB or API Debounce we use one-shot timer </w:t>
+      </w:r>
+      <w:proofErr w:type="gramStart"/>
+      <w:r>
+        <w:rPr>
+          <w:b/>
+          <w:bCs/>
+          <w:sz w:val="32"/>
+          <w:szCs w:val="32"/>
+        </w:rPr>
+        <w:t>Timer(</w:t>
+      </w:r>
+      <w:proofErr w:type="gramEnd"/>
+      <w:r>
+        <w:rPr>
+          <w:b/>
+          <w:bCs/>
+          <w:sz w:val="32"/>
+          <w:szCs w:val="32"/>
+        </w:rPr>
+        <w:t>(…), () {})</w:t>
+      </w:r>
+      <w:r>
+        <w:rPr>
+          <w:sz w:val="32"/>
+          <w:szCs w:val="32"/>
+        </w:rPr>
+        <w:t xml:space="preserve"> that runs once after a delay. If user taps multiple times instead of updating DB or calling API multiple times, we use debounce (wait until user is done then do it)</w:t>
+      </w:r>
+    </w:p>
+    <w:p>
+      <w:pPr>
+        <w:jc w:val="both"/>
+        <w:rPr>
+          <w:sz w:val="32"/>
+          <w:szCs w:val="32"/>
+        </w:rPr>
+      </w:pPr>
+      <w:r>
+        <w:rPr>
+          <w:sz w:val="32"/>
+          <w:szCs w:val="32"/>
+        </w:rPr>
+        <w:t># Instead of calling API every keystroke or user tap. We wait 500ms after they stop typing. Then call API or update DB once</w:t>
+      </w:r>
+    </w:p>
+    <w:p>
+      <w:pPr>
+        <w:jc w:val="both"/>
+        <w:rPr>
+          <w:sz w:val="32"/>
+          <w:szCs w:val="32"/>
+        </w:rPr>
+      </w:pPr>
+      <w:r>
+        <w:rPr>
+          <w:sz w:val="32"/>
+          <w:szCs w:val="32"/>
+        </w:rPr>
+        <w:t># First create an object (</w:t>
+      </w:r>
+      <w:r>
+        <w:rPr>
+          <w:b/>
+          <w:bCs/>
+          <w:sz w:val="32"/>
+          <w:szCs w:val="32"/>
+        </w:rPr>
+        <w:t>_debounce</w:t>
+      </w:r>
+      <w:r>
+        <w:rPr>
+          <w:sz w:val="32"/>
+          <w:szCs w:val="32"/>
+        </w:rPr>
+        <w:t xml:space="preserve">) of </w:t>
+      </w:r>
+      <w:r>
+        <w:rPr>
+          <w:b/>
+          <w:bCs/>
+          <w:sz w:val="32"/>
+          <w:szCs w:val="32"/>
+        </w:rPr>
+        <w:t>Timer</w:t>
+      </w:r>
+      <w:r>
+        <w:rPr>
+          <w:sz w:val="32"/>
+          <w:szCs w:val="32"/>
+        </w:rPr>
+        <w:t xml:space="preserve"> class which can be nullable</w:t>
+      </w:r>
+    </w:p>
+    <w:p>
+      <w:pPr>
+        <w:jc w:val="both"/>
+        <w:rPr>
+          <w:sz w:val="32"/>
+          <w:szCs w:val="32"/>
+        </w:rPr>
+      </w:pPr>
+      <w:r>
+        <w:rPr>
+          <w:sz w:val="32"/>
+          <w:szCs w:val="32"/>
+        </w:rPr>
+        <w:t xml:space="preserve"># Then in the method we are updating data in the </w:t>
+      </w:r>
+      <w:r>
+        <w:rPr>
+          <w:b/>
+          <w:bCs/>
+          <w:sz w:val="32"/>
+          <w:szCs w:val="32"/>
+        </w:rPr>
+        <w:t>List</w:t>
+      </w:r>
+      <w:r>
+        <w:rPr>
+          <w:sz w:val="32"/>
+          <w:szCs w:val="32"/>
+        </w:rPr>
+        <w:t xml:space="preserve"> to save in the database</w:t>
+      </w:r>
+    </w:p>
+    <w:p>
+      <w:pPr>
+        <w:jc w:val="both"/>
+        <w:rPr>
+          <w:sz w:val="32"/>
+          <w:szCs w:val="32"/>
+        </w:rPr>
+      </w:pPr>
+      <w:r>
+        <w:rPr>
+          <w:sz w:val="32"/>
+          <w:szCs w:val="32"/>
+        </w:rPr>
+        <w:t xml:space="preserve"># Make sure to cancel any previous debounce if any was running (this resets the debounce to 500 milliseconds every time user taps) </w:t>
+      </w:r>
+      <w:proofErr w:type="gramStart"/>
+      <w:r>
+        <w:rPr>
+          <w:sz w:val="32"/>
+          <w:szCs w:val="32"/>
+        </w:rPr>
+        <w:t>using</w:t>
+      </w:r>
+      <w:r>
+        <w:rPr>
+          <w:b/>
+          <w:bCs/>
+          <w:sz w:val="32"/>
+          <w:szCs w:val="32"/>
+        </w:rPr>
+        <w:t xml:space="preserve"> .cancel</w:t>
+      </w:r>
+      <w:proofErr w:type="gramEnd"/>
+      <w:r>
+        <w:rPr>
+          <w:b/>
+          <w:bCs/>
+          <w:sz w:val="32"/>
+          <w:szCs w:val="32"/>
+        </w:rPr>
+        <w:t>()</w:t>
+      </w:r>
+      <w:r>
+        <w:rPr>
+          <w:sz w:val="32"/>
+          <w:szCs w:val="32"/>
+        </w:rPr>
+        <w:t xml:space="preserve"> method</w:t>
+      </w:r>
+      <w:r>
+        <w:rPr>
+          <w:sz w:val="32"/>
+          <w:szCs w:val="32"/>
+        </w:rPr>
+        <w:t>. This is the heart of debounce. We are basically saying: “Forget the previous delayed call. Start fresh.” Now only the LAST user action survives.</w:t>
+      </w:r>
+    </w:p>
+    <w:p>
+      <w:pPr>
+        <w:jc w:val="both"/>
+        <w:rPr>
+          <w:sz w:val="32"/>
+          <w:szCs w:val="32"/>
+        </w:rPr>
+      </w:pPr>
+      <w:r>
+        <w:rPr>
+          <w:sz w:val="32"/>
+          <w:szCs w:val="32"/>
+        </w:rPr>
+        <w:t># Then before database update or write we are using debounce</w:t>
+      </w:r>
+      <w:r>
+        <w:rPr>
+          <w:sz w:val="32"/>
+          <w:szCs w:val="32"/>
+        </w:rPr>
+        <w:t xml:space="preserve">. </w:t>
+      </w:r>
+      <w:proofErr w:type="gramStart"/>
+      <w:r>
+        <w:rPr>
+          <w:b/>
+          <w:bCs/>
+          <w:sz w:val="32"/>
+          <w:szCs w:val="32"/>
+        </w:rPr>
+        <w:t>Timer(</w:t>
+      </w:r>
+      <w:proofErr w:type="gramEnd"/>
+      <w:r>
+        <w:rPr>
+          <w:b/>
+          <w:bCs/>
+          <w:sz w:val="32"/>
+          <w:szCs w:val="32"/>
+        </w:rPr>
+        <w:t>…)</w:t>
+      </w:r>
+      <w:r>
+        <w:rPr>
+          <w:sz w:val="32"/>
+          <w:szCs w:val="32"/>
+        </w:rPr>
+        <w:t xml:space="preserve"> takes a </w:t>
+      </w:r>
+      <w:r>
+        <w:rPr>
+          <w:b/>
+          <w:bCs/>
+          <w:sz w:val="32"/>
+          <w:szCs w:val="32"/>
+        </w:rPr>
+        <w:t>Duration(…)</w:t>
+      </w:r>
+      <w:r>
+        <w:rPr>
+          <w:sz w:val="32"/>
+          <w:szCs w:val="32"/>
+        </w:rPr>
+        <w:t xml:space="preserve"> to run the code or logic after that specified time or delay (like after 500 milliseconds do this)</w:t>
+      </w:r>
+    </w:p>
+    <w:p>
+      <w:pPr>
+        <w:jc w:val="both"/>
+        <w:rPr>
+          <w:sz w:val="32"/>
+          <w:szCs w:val="32"/>
+        </w:rPr>
+      </w:pPr>
+      <w:r>
+        <w:rPr>
+          <w:sz w:val="32"/>
+          <w:szCs w:val="32"/>
+        </w:rPr>
         <w:lastRenderedPageBreak/>
-        <w:t>DB update only once</w:t>
-      </w:r>
-    </w:p>
-    <w:p>
-      <w:pPr>
-        <w:jc w:val="both"/>
-        <w:rPr>
-          <w:sz w:val="32"/>
-          <w:szCs w:val="32"/>
-        </w:rPr>
-      </w:pPr>
-      <w:r>
-        <w:rPr>
-          <w:sz w:val="32"/>
-          <w:szCs w:val="32"/>
-        </w:rPr>
-        <w:t># That’s the idea.</w:t>
-      </w:r>
-    </w:p>
-    <w:p>
-      <w:pPr>
-        <w:jc w:val="both"/>
-        <w:rPr>
-          <w:sz w:val="32"/>
-          <w:szCs w:val="32"/>
-        </w:rPr>
-      </w:pPr>
-    </w:p>
-    <w:p>
-      <w:pPr>
-        <w:jc w:val="both"/>
-        <w:rPr>
-          <w:sz w:val="32"/>
-          <w:szCs w:val="32"/>
-        </w:rPr>
-      </w:pPr>
-      <w:r>
-        <w:rPr>
-          <w:sz w:val="32"/>
-          <w:szCs w:val="32"/>
-        </w:rPr>
-        <w:t>Database/API Debounce:</w:t>
-      </w:r>
-    </w:p>
-    <w:p>
-      <w:pPr>
-        <w:jc w:val="both"/>
-        <w:rPr>
-          <w:sz w:val="32"/>
-          <w:szCs w:val="32"/>
-        </w:rPr>
-      </w:pPr>
-      <w:r>
-        <w:rPr>
-          <w:sz w:val="32"/>
-          <w:szCs w:val="32"/>
-        </w:rPr>
-        <w:t xml:space="preserve"># For DB or API Debounce we use one-shot timer </w:t>
+        <w:t xml:space="preserve"># In </w:t>
       </w:r>
       <w:proofErr w:type="gramStart"/>
       <w:r>
@@ -20576,209 +23132,6 @@
           <w:sz w:val="32"/>
           <w:szCs w:val="32"/>
         </w:rPr>
-        <w:t>(…), () {})</w:t>
-      </w:r>
-      <w:r>
-        <w:rPr>
-          <w:sz w:val="32"/>
-          <w:szCs w:val="32"/>
-        </w:rPr>
-        <w:t xml:space="preserve"> that runs once after a delay. If user taps multiple times instead of updating DB or calling API multiple times, we use debounce (wait until user is done then do it)</w:t>
-      </w:r>
-    </w:p>
-    <w:p>
-      <w:pPr>
-        <w:jc w:val="both"/>
-        <w:rPr>
-          <w:sz w:val="32"/>
-          <w:szCs w:val="32"/>
-        </w:rPr>
-      </w:pPr>
-      <w:r>
-        <w:rPr>
-          <w:sz w:val="32"/>
-          <w:szCs w:val="32"/>
-        </w:rPr>
-        <w:t># Instead of calling API every keystroke or user tap. We wait 500ms after they stop typing. Then call API or update DB once</w:t>
-      </w:r>
-    </w:p>
-    <w:p>
-      <w:pPr>
-        <w:jc w:val="both"/>
-        <w:rPr>
-          <w:sz w:val="32"/>
-          <w:szCs w:val="32"/>
-        </w:rPr>
-      </w:pPr>
-      <w:r>
-        <w:rPr>
-          <w:sz w:val="32"/>
-          <w:szCs w:val="32"/>
-        </w:rPr>
-        <w:t># First create an object (</w:t>
-      </w:r>
-      <w:r>
-        <w:rPr>
-          <w:b/>
-          <w:bCs/>
-          <w:sz w:val="32"/>
-          <w:szCs w:val="32"/>
-        </w:rPr>
-        <w:t>_debounce</w:t>
-      </w:r>
-      <w:r>
-        <w:rPr>
-          <w:sz w:val="32"/>
-          <w:szCs w:val="32"/>
-        </w:rPr>
-        <w:t xml:space="preserve">) of </w:t>
-      </w:r>
-      <w:r>
-        <w:rPr>
-          <w:b/>
-          <w:bCs/>
-          <w:sz w:val="32"/>
-          <w:szCs w:val="32"/>
-        </w:rPr>
-        <w:t>Timer</w:t>
-      </w:r>
-      <w:r>
-        <w:rPr>
-          <w:sz w:val="32"/>
-          <w:szCs w:val="32"/>
-        </w:rPr>
-        <w:t xml:space="preserve"> class which can be nullable</w:t>
-      </w:r>
-    </w:p>
-    <w:p>
-      <w:pPr>
-        <w:jc w:val="both"/>
-        <w:rPr>
-          <w:sz w:val="32"/>
-          <w:szCs w:val="32"/>
-        </w:rPr>
-      </w:pPr>
-      <w:r>
-        <w:rPr>
-          <w:sz w:val="32"/>
-          <w:szCs w:val="32"/>
-        </w:rPr>
-        <w:t xml:space="preserve"># Then in the method we are updating data in the </w:t>
-      </w:r>
-      <w:r>
-        <w:rPr>
-          <w:b/>
-          <w:bCs/>
-          <w:sz w:val="32"/>
-          <w:szCs w:val="32"/>
-        </w:rPr>
-        <w:t>List</w:t>
-      </w:r>
-      <w:r>
-        <w:rPr>
-          <w:sz w:val="32"/>
-          <w:szCs w:val="32"/>
-        </w:rPr>
-        <w:t xml:space="preserve"> to save in the database</w:t>
-      </w:r>
-    </w:p>
-    <w:p>
-      <w:pPr>
-        <w:jc w:val="both"/>
-        <w:rPr>
-          <w:sz w:val="32"/>
-          <w:szCs w:val="32"/>
-        </w:rPr>
-      </w:pPr>
-      <w:r>
-        <w:rPr>
-          <w:sz w:val="32"/>
-          <w:szCs w:val="32"/>
-        </w:rPr>
-        <w:t xml:space="preserve"># Make sure to cancel any previous debounce if any was running (this resets the debounce to 500 milliseconds every time user taps) </w:t>
-      </w:r>
-      <w:proofErr w:type="gramStart"/>
-      <w:r>
-        <w:rPr>
-          <w:sz w:val="32"/>
-          <w:szCs w:val="32"/>
-        </w:rPr>
-        <w:t>using</w:t>
-      </w:r>
-      <w:r>
-        <w:rPr>
-          <w:b/>
-          <w:bCs/>
-          <w:sz w:val="32"/>
-          <w:szCs w:val="32"/>
-        </w:rPr>
-        <w:t xml:space="preserve"> .cancel</w:t>
-      </w:r>
-      <w:proofErr w:type="gramEnd"/>
-      <w:r>
-        <w:rPr>
-          <w:b/>
-          <w:bCs/>
-          <w:sz w:val="32"/>
-          <w:szCs w:val="32"/>
-        </w:rPr>
-        <w:t>()</w:t>
-      </w:r>
-      <w:r>
-        <w:rPr>
-          <w:sz w:val="32"/>
-          <w:szCs w:val="32"/>
-        </w:rPr>
-        <w:t xml:space="preserve"> method</w:t>
-      </w:r>
-      <w:r>
-        <w:rPr>
-          <w:sz w:val="32"/>
-          <w:szCs w:val="32"/>
-        </w:rPr>
-        <w:t>. This is the heart of debounce. We are basically saying: “Forget the previous delayed call. Start fresh.” Now only the LAST user action survives.</w:t>
-      </w:r>
-    </w:p>
-    <w:p>
-      <w:pPr>
-        <w:jc w:val="both"/>
-        <w:rPr>
-          <w:sz w:val="32"/>
-          <w:szCs w:val="32"/>
-        </w:rPr>
-      </w:pPr>
-      <w:r>
-        <w:rPr>
-          <w:sz w:val="32"/>
-          <w:szCs w:val="32"/>
-        </w:rPr>
-        <w:t># Then before database update or write we are using debounce</w:t>
-      </w:r>
-      <w:r>
-        <w:rPr>
-          <w:sz w:val="32"/>
-          <w:szCs w:val="32"/>
-        </w:rPr>
-        <w:t xml:space="preserve">. </w:t>
-      </w:r>
-      <w:proofErr w:type="gramStart"/>
-      <w:r>
-        <w:rPr>
-          <w:b/>
-          <w:bCs/>
-          <w:sz w:val="32"/>
-          <w:szCs w:val="32"/>
-        </w:rPr>
-        <w:t>Timer(</w:t>
-      </w:r>
-      <w:proofErr w:type="gramEnd"/>
-      <w:r>
-        <w:rPr>
-          <w:b/>
-          <w:bCs/>
-          <w:sz w:val="32"/>
-          <w:szCs w:val="32"/>
-        </w:rPr>
         <w:t>…)</w:t>
       </w:r>
       <w:r>
@@ -20786,65 +23139,6 @@
           <w:sz w:val="32"/>
           <w:szCs w:val="32"/>
         </w:rPr>
-        <w:t xml:space="preserve"> takes a </w:t>
-      </w:r>
-      <w:r>
-        <w:rPr>
-          <w:b/>
-          <w:bCs/>
-          <w:sz w:val="32"/>
-          <w:szCs w:val="32"/>
-        </w:rPr>
-        <w:t>Duration(…)</w:t>
-      </w:r>
-      <w:r>
-        <w:rPr>
-          <w:sz w:val="32"/>
-          <w:szCs w:val="32"/>
-        </w:rPr>
-        <w:t xml:space="preserve"> to run the code or logic after that specified time or delay (like after 500 milliseconds do this)</w:t>
-      </w:r>
-    </w:p>
-    <w:p>
-      <w:pPr>
-        <w:jc w:val="both"/>
-        <w:rPr>
-          <w:sz w:val="32"/>
-          <w:szCs w:val="32"/>
-        </w:rPr>
-      </w:pPr>
-      <w:r>
-        <w:rPr>
-          <w:sz w:val="32"/>
-          <w:szCs w:val="32"/>
-        </w:rPr>
-        <w:t xml:space="preserve"># In </w:t>
-      </w:r>
-      <w:proofErr w:type="gramStart"/>
-      <w:r>
-        <w:rPr>
-          <w:b/>
-          <w:bCs/>
-          <w:sz w:val="32"/>
-          <w:szCs w:val="32"/>
-        </w:rPr>
-        <w:t>Timer(</w:t>
-      </w:r>
-      <w:proofErr w:type="gramEnd"/>
-      <w:r>
-        <w:rPr>
-          <w:b/>
-          <w:bCs/>
-          <w:sz w:val="32"/>
-          <w:szCs w:val="32"/>
-        </w:rPr>
-        <w:t>…)</w:t>
-      </w:r>
-      <w:r>
-        <w:rPr>
-          <w:sz w:val="32"/>
-          <w:szCs w:val="32"/>
-        </w:rPr>
         <w:t>, the second parameter is a callback method that takes a lambda function and the code written here like database update happens after the delay</w:t>
       </w:r>
     </w:p>
@@ -20889,7 +23183,6 @@
           <w:sz w:val="32"/>
           <w:szCs w:val="32"/>
         </w:rPr>
-        <w:lastRenderedPageBreak/>
         <w:t xml:space="preserve">void </w:t>
       </w:r>
       <w:proofErr w:type="spellStart"/>
@@ -21471,6 +23764,7 @@
           <w:sz w:val="32"/>
           <w:szCs w:val="32"/>
         </w:rPr>
+        <w:lastRenderedPageBreak/>
         <w:t>When reaches 0 → stop timer</w:t>
       </w:r>
     </w:p>
@@ -21524,7 +23818,6 @@
           <w:sz w:val="32"/>
           <w:szCs w:val="32"/>
         </w:rPr>
-        <w:lastRenderedPageBreak/>
         <w:t># First create an object</w:t>
       </w:r>
       <w:r>
@@ -22256,6 +24549,7 @@
           <w:sz w:val="32"/>
           <w:szCs w:val="32"/>
         </w:rPr>
+        <w:lastRenderedPageBreak/>
         <w:t xml:space="preserve">  int _</w:t>
       </w:r>
       <w:proofErr w:type="spellStart"/>
@@ -22366,7 +24660,6 @@
           <w:sz w:val="32"/>
           <w:szCs w:val="32"/>
         </w:rPr>
-        <w:lastRenderedPageBreak/>
         <w:t xml:space="preserve">  late Timer _</w:t>
       </w:r>
       <w:proofErr w:type="spellStart"/>
@@ -23185,6 +25478,7 @@
           <w:sz w:val="32"/>
           <w:szCs w:val="32"/>
         </w:rPr>
+        <w:lastRenderedPageBreak/>
         <w:t xml:space="preserve">  void </w:t>
       </w:r>
       <w:proofErr w:type="gramStart"/>
@@ -23273,7 +25567,6 @@
           <w:sz w:val="32"/>
           <w:szCs w:val="32"/>
         </w:rPr>
-        <w:lastRenderedPageBreak/>
         <w:t xml:space="preserve">    </w:t>
       </w:r>
       <w:proofErr w:type="spellStart"/>
@@ -23706,6 +25999,7 @@
           <w:sz w:val="32"/>
           <w:szCs w:val="32"/>
         </w:rPr>
+        <w:lastRenderedPageBreak/>
         <w:t xml:space="preserve">  </w:t>
       </w:r>
       <w:proofErr w:type="spellStart"/>
@@ -23840,7 +26134,6 @@
           <w:sz w:val="32"/>
           <w:szCs w:val="32"/>
         </w:rPr>
-        <w:lastRenderedPageBreak/>
         <w:t xml:space="preserve">    _</w:t>
       </w:r>
       <w:proofErr w:type="spellStart"/>
@@ -24582,6 +26875,7 @@
           <w:sz w:val="32"/>
           <w:szCs w:val="32"/>
         </w:rPr>
+        <w:lastRenderedPageBreak/>
         <w:t>Riverpod</w:t>
       </w:r>
       <w:proofErr w:type="spellEnd"/>
@@ -24630,7 +26924,6 @@
           <w:sz w:val="32"/>
           <w:szCs w:val="32"/>
         </w:rPr>
-        <w:lastRenderedPageBreak/>
         <w:t>RxDart</w:t>
       </w:r>
       <w:proofErr w:type="spellEnd"/>
@@ -25473,6 +27766,7 @@
           <w:sz w:val="32"/>
           <w:szCs w:val="32"/>
         </w:rPr>
+        <w:lastRenderedPageBreak/>
         <w:t xml:space="preserve">  const </w:t>
       </w:r>
       <w:proofErr w:type="spellStart"/>
@@ -25561,7 +27855,6 @@
           <w:sz w:val="32"/>
           <w:szCs w:val="32"/>
         </w:rPr>
-        <w:lastRenderedPageBreak/>
         <w:t xml:space="preserve">  Widget </w:t>
       </w:r>
       <w:proofErr w:type="gramStart"/>
@@ -26480,6 +28773,7 @@
           <w:sz w:val="32"/>
           <w:szCs w:val="32"/>
         </w:rPr>
+        <w:lastRenderedPageBreak/>
         <w:t xml:space="preserve">                  const </w:t>
       </w:r>
       <w:proofErr w:type="gramStart"/>
@@ -26568,7 +28862,6 @@
           <w:sz w:val="32"/>
           <w:szCs w:val="32"/>
         </w:rPr>
-        <w:lastRenderedPageBreak/>
         <w:t xml:space="preserve">                  </w:t>
       </w:r>
       <w:proofErr w:type="gramStart"/>
@@ -27176,6 +29469,7 @@
           <w:sz w:val="32"/>
           <w:szCs w:val="32"/>
         </w:rPr>
+        <w:lastRenderedPageBreak/>
         <w:t xml:space="preserve"># This is production level debounce. </w:t>
       </w:r>
       <w:proofErr w:type="spellStart"/>
@@ -27863,6 +30157,15 @@
         </w:rPr>
         <w:t>Break</w:t>
       </w:r>
+    </w:p>
+    <w:p>
+      <w:pPr>
+        <w:jc w:val="both"/>
+        <w:rPr>
+          <w:sz w:val="32"/>
+          <w:szCs w:val="32"/>
+        </w:rPr>
+      </w:pPr>
     </w:p>
     <w:p>
       <w:pPr>
@@ -28788,6 +31091,7 @@
           <w:sz w:val="28"/>
           <w:szCs w:val="28"/>
         </w:rPr>
+        <w:lastRenderedPageBreak/>
         <w:t xml:space="preserve">│       </w:t>
       </w:r>
       <w:r>
@@ -28937,7 +31241,6 @@
           <w:sz w:val="28"/>
           <w:szCs w:val="28"/>
         </w:rPr>
-        <w:lastRenderedPageBreak/>
         <w:t>│    └─ await ...</w:t>
       </w:r>
     </w:p>
@@ -29645,6 +31948,7 @@
           <w:sz w:val="32"/>
           <w:szCs w:val="32"/>
         </w:rPr>
+        <w:lastRenderedPageBreak/>
         <w:t xml:space="preserve"># The </w:t>
       </w:r>
       <w:r>
@@ -29801,7 +32105,6 @@
           <w:sz w:val="32"/>
           <w:szCs w:val="32"/>
         </w:rPr>
-        <w:lastRenderedPageBreak/>
         <w:t xml:space="preserve"># </w:t>
       </w:r>
       <w:r>
@@ -33570,19 +35873,29 @@
       <w:pPr>
         <w:jc w:val="both"/>
         <w:rPr>
-          <w:b/>
-          <w:bCs/>
-          <w:sz w:val="32"/>
-          <w:szCs w:val="32"/>
-        </w:rPr>
-      </w:pPr>
-      <w:r>
-        <w:rPr>
-          <w:b/>
-          <w:bCs/>
-          <w:sz w:val="32"/>
-          <w:szCs w:val="32"/>
-        </w:rPr>
+          <w:sz w:val="32"/>
+          <w:szCs w:val="32"/>
+        </w:rPr>
+      </w:pPr>
+    </w:p>
+    <w:p>
+      <w:pPr>
+        <w:jc w:val="both"/>
+        <w:rPr>
+          <w:b/>
+          <w:bCs/>
+          <w:sz w:val="32"/>
+          <w:szCs w:val="32"/>
+        </w:rPr>
+      </w:pPr>
+      <w:r>
+        <w:rPr>
+          <w:b/>
+          <w:bCs/>
+          <w:sz w:val="32"/>
+          <w:szCs w:val="32"/>
+        </w:rPr>
+        <w:lastRenderedPageBreak/>
         <w:t>Microtask Queue:</w:t>
       </w:r>
     </w:p>
@@ -33599,7 +35912,6 @@
           <w:sz w:val="32"/>
           <w:szCs w:val="32"/>
         </w:rPr>
-        <w:lastRenderedPageBreak/>
         <w:t xml:space="preserve"># </w:t>
       </w:r>
       <w:r>
@@ -34291,6 +36603,7 @@
           <w:sz w:val="28"/>
           <w:szCs w:val="28"/>
         </w:rPr>
+        <w:lastRenderedPageBreak/>
         <w:t>4. Empty ALL microtasks</w:t>
       </w:r>
     </w:p>
@@ -34311,7 +36624,6 @@
           <w:sz w:val="28"/>
           <w:szCs w:val="28"/>
         </w:rPr>
-        <w:lastRenderedPageBreak/>
         <w:t>5. Execute ONE event</w:t>
       </w:r>
     </w:p>
@@ -34955,6 +37267,7 @@
           <w:sz w:val="32"/>
           <w:szCs w:val="32"/>
         </w:rPr>
+        <w:lastRenderedPageBreak/>
         <w:t>Code Example:</w:t>
       </w:r>
     </w:p>
@@ -34971,7 +37284,6 @@
           <w:sz w:val="32"/>
           <w:szCs w:val="32"/>
         </w:rPr>
-        <w:lastRenderedPageBreak/>
         <w:t xml:space="preserve"># Step-1, </w:t>
       </w:r>
       <w:r>
@@ -35615,6 +37927,7 @@
           <w:sz w:val="32"/>
           <w:szCs w:val="32"/>
         </w:rPr>
+        <w:lastRenderedPageBreak/>
         <w:t>microtask</w:t>
       </w:r>
     </w:p>
@@ -35635,584 +37948,584 @@
           <w:sz w:val="32"/>
           <w:szCs w:val="32"/>
         </w:rPr>
+        <w:t>future</w:t>
+      </w:r>
+    </w:p>
+    <w:p>
+      <w:pPr>
+        <w:jc w:val="both"/>
+        <w:rPr>
+          <w:sz w:val="32"/>
+          <w:szCs w:val="32"/>
+        </w:rPr>
+      </w:pPr>
+    </w:p>
+    <w:p>
+      <w:pPr>
+        <w:jc w:val="both"/>
+        <w:rPr>
+          <w:sz w:val="32"/>
+          <w:szCs w:val="32"/>
+        </w:rPr>
+      </w:pPr>
+      <w:r>
+        <w:rPr>
+          <w:sz w:val="32"/>
+          <w:szCs w:val="32"/>
+        </w:rPr>
+        <w:t>async/await Continuation Callback with Microtask:</w:t>
+      </w:r>
+    </w:p>
+    <w:p>
+      <w:pPr>
+        <w:jc w:val="both"/>
+        <w:rPr>
+          <w:sz w:val="32"/>
+          <w:szCs w:val="32"/>
+        </w:rPr>
+      </w:pPr>
+      <w:r>
+        <w:rPr>
+          <w:sz w:val="32"/>
+          <w:szCs w:val="32"/>
+        </w:rPr>
+        <w:t xml:space="preserve"># </w:t>
+      </w:r>
+      <w:r>
+        <w:rPr>
+          <w:sz w:val="32"/>
+          <w:szCs w:val="32"/>
+        </w:rPr>
+        <w:t>This is the interesting part.</w:t>
+      </w:r>
+      <w:r>
+        <w:rPr>
+          <w:sz w:val="32"/>
+          <w:szCs w:val="32"/>
+        </w:rPr>
+        <w:t xml:space="preserve"> </w:t>
+      </w:r>
+      <w:r>
+        <w:rPr>
+          <w:sz w:val="32"/>
+          <w:szCs w:val="32"/>
+        </w:rPr>
+        <w:t>When a</w:t>
+      </w:r>
+      <w:r>
+        <w:rPr>
+          <w:b/>
+          <w:bCs/>
+          <w:sz w:val="32"/>
+          <w:szCs w:val="32"/>
+        </w:rPr>
+        <w:t xml:space="preserve"> Future</w:t>
+      </w:r>
+      <w:r>
+        <w:rPr>
+          <w:sz w:val="32"/>
+          <w:szCs w:val="32"/>
+        </w:rPr>
+        <w:t xml:space="preserve"> </w:t>
+      </w:r>
+      <w:r>
+        <w:rPr>
+          <w:sz w:val="32"/>
+          <w:szCs w:val="32"/>
+        </w:rPr>
+        <w:t xml:space="preserve">or continuation Callback </w:t>
+      </w:r>
+      <w:r>
+        <w:rPr>
+          <w:sz w:val="32"/>
+          <w:szCs w:val="32"/>
+        </w:rPr>
+        <w:t>completes</w:t>
+      </w:r>
+      <w:r>
+        <w:rPr>
+          <w:sz w:val="32"/>
+          <w:szCs w:val="32"/>
+        </w:rPr>
+        <w:t xml:space="preserve"> or returns a result</w:t>
+      </w:r>
+      <w:r>
+        <w:rPr>
+          <w:sz w:val="32"/>
+          <w:szCs w:val="32"/>
+        </w:rPr>
+        <w:t>:</w:t>
+      </w:r>
+    </w:p>
+    <w:p>
+      <w:pPr>
+        <w:jc w:val="both"/>
+        <w:rPr>
+          <w:b/>
+          <w:bCs/>
+          <w:color w:val="D86DCB" w:themeColor="accent5" w:themeTint="99"/>
+          <w:sz w:val="32"/>
+          <w:szCs w:val="32"/>
+        </w:rPr>
+      </w:pPr>
+      <w:r>
+        <w:rPr>
+          <w:b/>
+          <w:bCs/>
+          <w:color w:val="D86DCB" w:themeColor="accent5" w:themeTint="99"/>
+          <w:sz w:val="32"/>
+          <w:szCs w:val="32"/>
+        </w:rPr>
+        <w:t xml:space="preserve">await </w:t>
+      </w:r>
+      <w:proofErr w:type="gramStart"/>
+      <w:r>
+        <w:rPr>
+          <w:b/>
+          <w:bCs/>
+          <w:color w:val="D86DCB" w:themeColor="accent5" w:themeTint="99"/>
+          <w:sz w:val="32"/>
+          <w:szCs w:val="32"/>
+        </w:rPr>
+        <w:t>something(</w:t>
+      </w:r>
+      <w:proofErr w:type="gramEnd"/>
+      <w:r>
+        <w:rPr>
+          <w:b/>
+          <w:bCs/>
+          <w:color w:val="D86DCB" w:themeColor="accent5" w:themeTint="99"/>
+          <w:sz w:val="32"/>
+          <w:szCs w:val="32"/>
+        </w:rPr>
+        <w:t>);</w:t>
+      </w:r>
+    </w:p>
+    <w:p>
+      <w:pPr>
+        <w:jc w:val="both"/>
+        <w:rPr>
+          <w:sz w:val="32"/>
+          <w:szCs w:val="32"/>
+        </w:rPr>
+      </w:pPr>
+      <w:r>
+        <w:rPr>
+          <w:sz w:val="32"/>
+          <w:szCs w:val="32"/>
+        </w:rPr>
+        <w:t># T</w:t>
+      </w:r>
+      <w:r>
+        <w:rPr>
+          <w:sz w:val="32"/>
+          <w:szCs w:val="32"/>
+        </w:rPr>
+        <w:t>he continuation</w:t>
+      </w:r>
+      <w:r>
+        <w:rPr>
+          <w:sz w:val="32"/>
+          <w:szCs w:val="32"/>
+        </w:rPr>
+        <w:t xml:space="preserve"> </w:t>
+      </w:r>
+      <w:r>
+        <w:rPr>
+          <w:sz w:val="32"/>
+          <w:szCs w:val="32"/>
+        </w:rPr>
+        <w:t xml:space="preserve">or resuming </w:t>
+      </w:r>
+      <w:r>
+        <w:rPr>
+          <w:sz w:val="32"/>
+          <w:szCs w:val="32"/>
+        </w:rPr>
+        <w:t xml:space="preserve">after the </w:t>
+      </w:r>
+      <w:r>
+        <w:rPr>
+          <w:b/>
+          <w:bCs/>
+          <w:sz w:val="32"/>
+          <w:szCs w:val="32"/>
+        </w:rPr>
+        <w:t>await</w:t>
+      </w:r>
+      <w:r>
+        <w:rPr>
+          <w:sz w:val="32"/>
+          <w:szCs w:val="32"/>
+        </w:rPr>
+        <w:t xml:space="preserve"> is typically scheduled as a microtask.</w:t>
+      </w:r>
+      <w:r>
+        <w:rPr>
+          <w:sz w:val="32"/>
+          <w:szCs w:val="32"/>
+        </w:rPr>
+        <w:t xml:space="preserve"> </w:t>
+      </w:r>
+      <w:r>
+        <w:rPr>
+          <w:sz w:val="32"/>
+          <w:szCs w:val="32"/>
+        </w:rPr>
+        <w:t>Conceptually:</w:t>
+      </w:r>
+    </w:p>
+    <w:p>
+      <w:pPr>
+        <w:jc w:val="both"/>
+        <w:rPr>
+          <w:b/>
+          <w:bCs/>
+          <w:color w:val="D86DCB" w:themeColor="accent5" w:themeTint="99"/>
+          <w:sz w:val="32"/>
+          <w:szCs w:val="32"/>
+        </w:rPr>
+      </w:pPr>
+      <w:r>
+        <w:rPr>
+          <w:b/>
+          <w:bCs/>
+          <w:color w:val="D86DCB" w:themeColor="accent5" w:themeTint="99"/>
+          <w:sz w:val="32"/>
+          <w:szCs w:val="32"/>
+        </w:rPr>
+        <w:t xml:space="preserve">await </w:t>
+      </w:r>
+      <w:proofErr w:type="gramStart"/>
+      <w:r>
+        <w:rPr>
+          <w:b/>
+          <w:bCs/>
+          <w:color w:val="D86DCB" w:themeColor="accent5" w:themeTint="99"/>
+          <w:sz w:val="32"/>
+          <w:szCs w:val="32"/>
+        </w:rPr>
+        <w:t>fetch(</w:t>
+      </w:r>
+      <w:proofErr w:type="gramEnd"/>
+      <w:r>
+        <w:rPr>
+          <w:b/>
+          <w:bCs/>
+          <w:color w:val="D86DCB" w:themeColor="accent5" w:themeTint="99"/>
+          <w:sz w:val="32"/>
+          <w:szCs w:val="32"/>
+        </w:rPr>
+        <w:t>);</w:t>
+      </w:r>
+    </w:p>
+    <w:p>
+      <w:pPr>
+        <w:jc w:val="both"/>
+        <w:rPr>
+          <w:b/>
+          <w:bCs/>
+          <w:color w:val="D86DCB" w:themeColor="accent5" w:themeTint="99"/>
+          <w:sz w:val="32"/>
+          <w:szCs w:val="32"/>
+        </w:rPr>
+      </w:pPr>
+      <w:r>
+        <w:rPr>
+          <w:b/>
+          <w:bCs/>
+          <w:color w:val="D86DCB" w:themeColor="accent5" w:themeTint="99"/>
+          <w:sz w:val="32"/>
+          <w:szCs w:val="32"/>
+        </w:rPr>
+        <w:t>print("Done");</w:t>
+      </w:r>
+    </w:p>
+    <w:p>
+      <w:pPr>
+        <w:jc w:val="both"/>
+        <w:rPr>
+          <w:sz w:val="32"/>
+          <w:szCs w:val="32"/>
+        </w:rPr>
+      </w:pPr>
+      <w:r>
+        <w:rPr>
+          <w:sz w:val="32"/>
+          <w:szCs w:val="32"/>
+        </w:rPr>
+        <w:t xml:space="preserve"># </w:t>
+      </w:r>
+      <w:r>
+        <w:rPr>
+          <w:sz w:val="32"/>
+          <w:szCs w:val="32"/>
+        </w:rPr>
+        <w:t>B</w:t>
+      </w:r>
+      <w:r>
+        <w:rPr>
+          <w:sz w:val="32"/>
+          <w:szCs w:val="32"/>
+        </w:rPr>
+        <w:t>ecomes something like</w:t>
+      </w:r>
+      <w:r>
+        <w:rPr>
+          <w:sz w:val="32"/>
+          <w:szCs w:val="32"/>
+        </w:rPr>
+        <w:t xml:space="preserve"> the below, </w:t>
+      </w:r>
+      <w:r>
+        <w:rPr>
+          <w:sz w:val="32"/>
+          <w:szCs w:val="32"/>
+        </w:rPr>
+        <w:t>and that continuation</w:t>
+      </w:r>
+      <w:r>
+        <w:rPr>
+          <w:sz w:val="32"/>
+          <w:szCs w:val="32"/>
+        </w:rPr>
+        <w:t xml:space="preserve"> </w:t>
+      </w:r>
+      <w:r>
+        <w:rPr>
+          <w:sz w:val="32"/>
+          <w:szCs w:val="32"/>
+        </w:rPr>
+        <w:t xml:space="preserve">or resuming </w:t>
+      </w:r>
+      <w:r>
+        <w:rPr>
+          <w:sz w:val="32"/>
+          <w:szCs w:val="32"/>
+        </w:rPr>
+        <w:t>gets very high priority:</w:t>
+      </w:r>
+    </w:p>
+    <w:p>
+      <w:pPr>
+        <w:jc w:val="both"/>
+        <w:rPr>
+          <w:b/>
+          <w:bCs/>
+          <w:color w:val="D86DCB" w:themeColor="accent5" w:themeTint="99"/>
+          <w:sz w:val="32"/>
+          <w:szCs w:val="32"/>
+        </w:rPr>
+      </w:pPr>
+      <w:r>
+        <w:rPr>
+          <w:b/>
+          <w:bCs/>
+          <w:color w:val="D86DCB" w:themeColor="accent5" w:themeTint="99"/>
+          <w:sz w:val="32"/>
+          <w:szCs w:val="32"/>
+        </w:rPr>
+        <w:t>fetch(</w:t>
+      </w:r>
+      <w:proofErr w:type="gramStart"/>
+      <w:r>
+        <w:rPr>
+          <w:b/>
+          <w:bCs/>
+          <w:color w:val="D86DCB" w:themeColor="accent5" w:themeTint="99"/>
+          <w:sz w:val="32"/>
+          <w:szCs w:val="32"/>
+        </w:rPr>
+        <w:t>).then</w:t>
+      </w:r>
+      <w:proofErr w:type="gramEnd"/>
+      <w:r>
+        <w:rPr>
+          <w:b/>
+          <w:bCs/>
+          <w:color w:val="D86DCB" w:themeColor="accent5" w:themeTint="99"/>
+          <w:sz w:val="32"/>
+          <w:szCs w:val="32"/>
+        </w:rPr>
+        <w:t>((_) {</w:t>
+      </w:r>
+    </w:p>
+    <w:p>
+      <w:pPr>
+        <w:jc w:val="both"/>
+        <w:rPr>
+          <w:b/>
+          <w:bCs/>
+          <w:color w:val="D86DCB" w:themeColor="accent5" w:themeTint="99"/>
+          <w:sz w:val="32"/>
+          <w:szCs w:val="32"/>
+        </w:rPr>
+      </w:pPr>
+      <w:r>
+        <w:rPr>
+          <w:b/>
+          <w:bCs/>
+          <w:color w:val="D86DCB" w:themeColor="accent5" w:themeTint="99"/>
+          <w:sz w:val="32"/>
+          <w:szCs w:val="32"/>
+        </w:rPr>
+        <w:t xml:space="preserve">   print("Done");</w:t>
+      </w:r>
+    </w:p>
+    <w:p>
+      <w:pPr>
+        <w:jc w:val="both"/>
+        <w:rPr>
+          <w:b/>
+          <w:bCs/>
+          <w:color w:val="D86DCB" w:themeColor="accent5" w:themeTint="99"/>
+          <w:sz w:val="32"/>
+          <w:szCs w:val="32"/>
+        </w:rPr>
+      </w:pPr>
+      <w:r>
+        <w:rPr>
+          <w:b/>
+          <w:bCs/>
+          <w:color w:val="D86DCB" w:themeColor="accent5" w:themeTint="99"/>
+          <w:sz w:val="32"/>
+          <w:szCs w:val="32"/>
+        </w:rPr>
+        <w:t>});</w:t>
+      </w:r>
+    </w:p>
+    <w:p>
+      <w:pPr>
+        <w:jc w:val="both"/>
+        <w:rPr>
+          <w:sz w:val="32"/>
+          <w:szCs w:val="32"/>
+        </w:rPr>
+      </w:pPr>
+      <w:r>
+        <w:rPr>
+          <w:sz w:val="32"/>
+          <w:szCs w:val="32"/>
+        </w:rPr>
+        <w:t xml:space="preserve"># </w:t>
+      </w:r>
+      <w:r>
+        <w:rPr>
+          <w:sz w:val="32"/>
+          <w:szCs w:val="32"/>
+        </w:rPr>
+        <w:t xml:space="preserve">That's one reason </w:t>
+      </w:r>
+      <w:r>
+        <w:rPr>
+          <w:b/>
+          <w:bCs/>
+          <w:sz w:val="32"/>
+          <w:szCs w:val="32"/>
+        </w:rPr>
+        <w:t>async</w:t>
+      </w:r>
+      <w:r>
+        <w:rPr>
+          <w:sz w:val="32"/>
+          <w:szCs w:val="32"/>
+        </w:rPr>
+        <w:t xml:space="preserve"> code often resumes before timers and other events.</w:t>
+      </w:r>
+    </w:p>
+    <w:p>
+      <w:pPr>
+        <w:jc w:val="both"/>
+        <w:rPr>
+          <w:sz w:val="32"/>
+          <w:szCs w:val="32"/>
+        </w:rPr>
+      </w:pPr>
+      <w:r>
+        <w:rPr>
+          <w:b/>
+          <w:bCs/>
+          <w:sz w:val="32"/>
+          <w:szCs w:val="32"/>
+        </w:rPr>
+        <w:t>NOTE:</w:t>
+      </w:r>
+      <w:r>
+        <w:rPr>
+          <w:sz w:val="32"/>
+          <w:szCs w:val="32"/>
+        </w:rPr>
+        <w:t xml:space="preserve"> JavaScript or TypeScript also has these </w:t>
+      </w:r>
+      <w:r>
+        <w:rPr>
+          <w:b/>
+          <w:bCs/>
+          <w:sz w:val="32"/>
+          <w:szCs w:val="32"/>
+        </w:rPr>
+        <w:t>Call Stack</w:t>
+      </w:r>
+      <w:r>
+        <w:rPr>
+          <w:sz w:val="32"/>
+          <w:szCs w:val="32"/>
+        </w:rPr>
+        <w:t>, Microtask queue, Event queue</w:t>
+      </w:r>
+    </w:p>
+    <w:p>
+      <w:pPr>
+        <w:jc w:val="both"/>
+        <w:rPr>
+          <w:sz w:val="32"/>
+          <w:szCs w:val="32"/>
+        </w:rPr>
+      </w:pPr>
+    </w:p>
+    <w:p>
+      <w:pPr>
+        <w:jc w:val="both"/>
+        <w:rPr>
+          <w:sz w:val="32"/>
+          <w:szCs w:val="32"/>
+        </w:rPr>
+      </w:pPr>
+    </w:p>
+    <w:p>
+      <w:pPr>
+        <w:jc w:val="both"/>
+        <w:rPr>
+          <w:b/>
+          <w:bCs/>
+          <w:sz w:val="32"/>
+          <w:szCs w:val="32"/>
+        </w:rPr>
+      </w:pPr>
+      <w:r>
+        <w:rPr>
+          <w:b/>
+          <w:bCs/>
+          <w:sz w:val="32"/>
+          <w:szCs w:val="32"/>
+        </w:rPr>
+        <w:t>Isolate:</w:t>
+      </w:r>
+    </w:p>
+    <w:p>
+      <w:pPr>
+        <w:jc w:val="both"/>
+        <w:rPr>
+          <w:sz w:val="32"/>
+          <w:szCs w:val="32"/>
+        </w:rPr>
+      </w:pPr>
+      <w:r>
+        <w:rPr>
+          <w:sz w:val="32"/>
+          <w:szCs w:val="32"/>
+        </w:rPr>
         <w:lastRenderedPageBreak/>
-        <w:t>future</w:t>
-      </w:r>
-    </w:p>
-    <w:p>
-      <w:pPr>
-        <w:jc w:val="both"/>
-        <w:rPr>
-          <w:sz w:val="32"/>
-          <w:szCs w:val="32"/>
-        </w:rPr>
-      </w:pPr>
-    </w:p>
-    <w:p>
-      <w:pPr>
-        <w:jc w:val="both"/>
-        <w:rPr>
-          <w:sz w:val="32"/>
-          <w:szCs w:val="32"/>
-        </w:rPr>
-      </w:pPr>
-      <w:r>
-        <w:rPr>
-          <w:sz w:val="32"/>
-          <w:szCs w:val="32"/>
-        </w:rPr>
-        <w:t>async/await Continuation Callback with Microtask:</w:t>
-      </w:r>
-    </w:p>
-    <w:p>
-      <w:pPr>
-        <w:jc w:val="both"/>
-        <w:rPr>
-          <w:sz w:val="32"/>
-          <w:szCs w:val="32"/>
-        </w:rPr>
-      </w:pPr>
-      <w:r>
-        <w:rPr>
-          <w:sz w:val="32"/>
-          <w:szCs w:val="32"/>
-        </w:rPr>
-        <w:t xml:space="preserve"># </w:t>
-      </w:r>
-      <w:r>
-        <w:rPr>
-          <w:sz w:val="32"/>
-          <w:szCs w:val="32"/>
-        </w:rPr>
-        <w:t>This is the interesting part.</w:t>
-      </w:r>
-      <w:r>
-        <w:rPr>
-          <w:sz w:val="32"/>
-          <w:szCs w:val="32"/>
-        </w:rPr>
-        <w:t xml:space="preserve"> </w:t>
-      </w:r>
-      <w:r>
-        <w:rPr>
-          <w:sz w:val="32"/>
-          <w:szCs w:val="32"/>
-        </w:rPr>
-        <w:t>When a</w:t>
-      </w:r>
-      <w:r>
-        <w:rPr>
-          <w:b/>
-          <w:bCs/>
-          <w:sz w:val="32"/>
-          <w:szCs w:val="32"/>
-        </w:rPr>
-        <w:t xml:space="preserve"> Future</w:t>
-      </w:r>
-      <w:r>
-        <w:rPr>
-          <w:sz w:val="32"/>
-          <w:szCs w:val="32"/>
-        </w:rPr>
-        <w:t xml:space="preserve"> </w:t>
-      </w:r>
-      <w:r>
-        <w:rPr>
-          <w:sz w:val="32"/>
-          <w:szCs w:val="32"/>
-        </w:rPr>
-        <w:t xml:space="preserve">or continuation Callback </w:t>
-      </w:r>
-      <w:r>
-        <w:rPr>
-          <w:sz w:val="32"/>
-          <w:szCs w:val="32"/>
-        </w:rPr>
-        <w:t>completes</w:t>
-      </w:r>
-      <w:r>
-        <w:rPr>
-          <w:sz w:val="32"/>
-          <w:szCs w:val="32"/>
-        </w:rPr>
-        <w:t xml:space="preserve"> or returns a result</w:t>
-      </w:r>
-      <w:r>
-        <w:rPr>
-          <w:sz w:val="32"/>
-          <w:szCs w:val="32"/>
-        </w:rPr>
-        <w:t>:</w:t>
-      </w:r>
-    </w:p>
-    <w:p>
-      <w:pPr>
-        <w:jc w:val="both"/>
-        <w:rPr>
-          <w:b/>
-          <w:bCs/>
-          <w:color w:val="D86DCB" w:themeColor="accent5" w:themeTint="99"/>
-          <w:sz w:val="32"/>
-          <w:szCs w:val="32"/>
-        </w:rPr>
-      </w:pPr>
-      <w:r>
-        <w:rPr>
-          <w:b/>
-          <w:bCs/>
-          <w:color w:val="D86DCB" w:themeColor="accent5" w:themeTint="99"/>
-          <w:sz w:val="32"/>
-          <w:szCs w:val="32"/>
-        </w:rPr>
-        <w:t xml:space="preserve">await </w:t>
-      </w:r>
-      <w:proofErr w:type="gramStart"/>
-      <w:r>
-        <w:rPr>
-          <w:b/>
-          <w:bCs/>
-          <w:color w:val="D86DCB" w:themeColor="accent5" w:themeTint="99"/>
-          <w:sz w:val="32"/>
-          <w:szCs w:val="32"/>
-        </w:rPr>
-        <w:t>something(</w:t>
-      </w:r>
-      <w:proofErr w:type="gramEnd"/>
-      <w:r>
-        <w:rPr>
-          <w:b/>
-          <w:bCs/>
-          <w:color w:val="D86DCB" w:themeColor="accent5" w:themeTint="99"/>
-          <w:sz w:val="32"/>
-          <w:szCs w:val="32"/>
-        </w:rPr>
-        <w:t>);</w:t>
-      </w:r>
-    </w:p>
-    <w:p>
-      <w:pPr>
-        <w:jc w:val="both"/>
-        <w:rPr>
-          <w:sz w:val="32"/>
-          <w:szCs w:val="32"/>
-        </w:rPr>
-      </w:pPr>
-      <w:r>
-        <w:rPr>
-          <w:sz w:val="32"/>
-          <w:szCs w:val="32"/>
-        </w:rPr>
-        <w:t># T</w:t>
-      </w:r>
-      <w:r>
-        <w:rPr>
-          <w:sz w:val="32"/>
-          <w:szCs w:val="32"/>
-        </w:rPr>
-        <w:t>he continuation</w:t>
-      </w:r>
-      <w:r>
-        <w:rPr>
-          <w:sz w:val="32"/>
-          <w:szCs w:val="32"/>
-        </w:rPr>
-        <w:t xml:space="preserve"> </w:t>
-      </w:r>
-      <w:r>
-        <w:rPr>
-          <w:sz w:val="32"/>
-          <w:szCs w:val="32"/>
-        </w:rPr>
-        <w:t xml:space="preserve">or resuming </w:t>
-      </w:r>
-      <w:r>
-        <w:rPr>
-          <w:sz w:val="32"/>
-          <w:szCs w:val="32"/>
-        </w:rPr>
-        <w:t xml:space="preserve">after the </w:t>
-      </w:r>
-      <w:r>
-        <w:rPr>
-          <w:b/>
-          <w:bCs/>
-          <w:sz w:val="32"/>
-          <w:szCs w:val="32"/>
-        </w:rPr>
-        <w:t>await</w:t>
-      </w:r>
-      <w:r>
-        <w:rPr>
-          <w:sz w:val="32"/>
-          <w:szCs w:val="32"/>
-        </w:rPr>
-        <w:t xml:space="preserve"> is typically scheduled as a microtask.</w:t>
-      </w:r>
-      <w:r>
-        <w:rPr>
-          <w:sz w:val="32"/>
-          <w:szCs w:val="32"/>
-        </w:rPr>
-        <w:t xml:space="preserve"> </w:t>
-      </w:r>
-      <w:r>
-        <w:rPr>
-          <w:sz w:val="32"/>
-          <w:szCs w:val="32"/>
-        </w:rPr>
-        <w:t>Conceptually:</w:t>
-      </w:r>
-    </w:p>
-    <w:p>
-      <w:pPr>
-        <w:jc w:val="both"/>
-        <w:rPr>
-          <w:b/>
-          <w:bCs/>
-          <w:color w:val="D86DCB" w:themeColor="accent5" w:themeTint="99"/>
-          <w:sz w:val="32"/>
-          <w:szCs w:val="32"/>
-        </w:rPr>
-      </w:pPr>
-      <w:r>
-        <w:rPr>
-          <w:b/>
-          <w:bCs/>
-          <w:color w:val="D86DCB" w:themeColor="accent5" w:themeTint="99"/>
-          <w:sz w:val="32"/>
-          <w:szCs w:val="32"/>
-        </w:rPr>
-        <w:t xml:space="preserve">await </w:t>
-      </w:r>
-      <w:proofErr w:type="gramStart"/>
-      <w:r>
-        <w:rPr>
-          <w:b/>
-          <w:bCs/>
-          <w:color w:val="D86DCB" w:themeColor="accent5" w:themeTint="99"/>
-          <w:sz w:val="32"/>
-          <w:szCs w:val="32"/>
-        </w:rPr>
-        <w:t>fetch(</w:t>
-      </w:r>
-      <w:proofErr w:type="gramEnd"/>
-      <w:r>
-        <w:rPr>
-          <w:b/>
-          <w:bCs/>
-          <w:color w:val="D86DCB" w:themeColor="accent5" w:themeTint="99"/>
-          <w:sz w:val="32"/>
-          <w:szCs w:val="32"/>
-        </w:rPr>
-        <w:t>);</w:t>
-      </w:r>
-    </w:p>
-    <w:p>
-      <w:pPr>
-        <w:jc w:val="both"/>
-        <w:rPr>
-          <w:b/>
-          <w:bCs/>
-          <w:color w:val="D86DCB" w:themeColor="accent5" w:themeTint="99"/>
-          <w:sz w:val="32"/>
-          <w:szCs w:val="32"/>
-        </w:rPr>
-      </w:pPr>
-      <w:r>
-        <w:rPr>
-          <w:b/>
-          <w:bCs/>
-          <w:color w:val="D86DCB" w:themeColor="accent5" w:themeTint="99"/>
-          <w:sz w:val="32"/>
-          <w:szCs w:val="32"/>
-        </w:rPr>
-        <w:t>print("Done");</w:t>
-      </w:r>
-    </w:p>
-    <w:p>
-      <w:pPr>
-        <w:jc w:val="both"/>
-        <w:rPr>
-          <w:sz w:val="32"/>
-          <w:szCs w:val="32"/>
-        </w:rPr>
-      </w:pPr>
-      <w:r>
-        <w:rPr>
-          <w:sz w:val="32"/>
-          <w:szCs w:val="32"/>
-        </w:rPr>
-        <w:t xml:space="preserve"># </w:t>
-      </w:r>
-      <w:r>
-        <w:rPr>
-          <w:sz w:val="32"/>
-          <w:szCs w:val="32"/>
-        </w:rPr>
-        <w:t>B</w:t>
-      </w:r>
-      <w:r>
-        <w:rPr>
-          <w:sz w:val="32"/>
-          <w:szCs w:val="32"/>
-        </w:rPr>
-        <w:t>ecomes something like</w:t>
-      </w:r>
-      <w:r>
-        <w:rPr>
-          <w:sz w:val="32"/>
-          <w:szCs w:val="32"/>
-        </w:rPr>
-        <w:t xml:space="preserve"> the below, </w:t>
-      </w:r>
-      <w:r>
-        <w:rPr>
-          <w:sz w:val="32"/>
-          <w:szCs w:val="32"/>
-        </w:rPr>
-        <w:t>and that continuation</w:t>
-      </w:r>
-      <w:r>
-        <w:rPr>
-          <w:sz w:val="32"/>
-          <w:szCs w:val="32"/>
-        </w:rPr>
-        <w:t xml:space="preserve"> </w:t>
-      </w:r>
-      <w:r>
-        <w:rPr>
-          <w:sz w:val="32"/>
-          <w:szCs w:val="32"/>
-        </w:rPr>
-        <w:t xml:space="preserve">or resuming </w:t>
-      </w:r>
-      <w:r>
-        <w:rPr>
-          <w:sz w:val="32"/>
-          <w:szCs w:val="32"/>
-        </w:rPr>
-        <w:t>gets very high priority:</w:t>
-      </w:r>
-    </w:p>
-    <w:p>
-      <w:pPr>
-        <w:jc w:val="both"/>
-        <w:rPr>
-          <w:b/>
-          <w:bCs/>
-          <w:color w:val="D86DCB" w:themeColor="accent5" w:themeTint="99"/>
-          <w:sz w:val="32"/>
-          <w:szCs w:val="32"/>
-        </w:rPr>
-      </w:pPr>
-      <w:r>
-        <w:rPr>
-          <w:b/>
-          <w:bCs/>
-          <w:color w:val="D86DCB" w:themeColor="accent5" w:themeTint="99"/>
-          <w:sz w:val="32"/>
-          <w:szCs w:val="32"/>
-        </w:rPr>
-        <w:t>fetch(</w:t>
-      </w:r>
-      <w:proofErr w:type="gramStart"/>
-      <w:r>
-        <w:rPr>
-          <w:b/>
-          <w:bCs/>
-          <w:color w:val="D86DCB" w:themeColor="accent5" w:themeTint="99"/>
-          <w:sz w:val="32"/>
-          <w:szCs w:val="32"/>
-        </w:rPr>
-        <w:t>).then</w:t>
-      </w:r>
-      <w:proofErr w:type="gramEnd"/>
-      <w:r>
-        <w:rPr>
-          <w:b/>
-          <w:bCs/>
-          <w:color w:val="D86DCB" w:themeColor="accent5" w:themeTint="99"/>
-          <w:sz w:val="32"/>
-          <w:szCs w:val="32"/>
-        </w:rPr>
-        <w:t>((_) {</w:t>
-      </w:r>
-    </w:p>
-    <w:p>
-      <w:pPr>
-        <w:jc w:val="both"/>
-        <w:rPr>
-          <w:b/>
-          <w:bCs/>
-          <w:color w:val="D86DCB" w:themeColor="accent5" w:themeTint="99"/>
-          <w:sz w:val="32"/>
-          <w:szCs w:val="32"/>
-        </w:rPr>
-      </w:pPr>
-      <w:r>
-        <w:rPr>
-          <w:b/>
-          <w:bCs/>
-          <w:color w:val="D86DCB" w:themeColor="accent5" w:themeTint="99"/>
-          <w:sz w:val="32"/>
-          <w:szCs w:val="32"/>
-        </w:rPr>
-        <w:t xml:space="preserve">   print("Done");</w:t>
-      </w:r>
-    </w:p>
-    <w:p>
-      <w:pPr>
-        <w:jc w:val="both"/>
-        <w:rPr>
-          <w:b/>
-          <w:bCs/>
-          <w:color w:val="D86DCB" w:themeColor="accent5" w:themeTint="99"/>
-          <w:sz w:val="32"/>
-          <w:szCs w:val="32"/>
-        </w:rPr>
-      </w:pPr>
-      <w:r>
-        <w:rPr>
-          <w:b/>
-          <w:bCs/>
-          <w:color w:val="D86DCB" w:themeColor="accent5" w:themeTint="99"/>
-          <w:sz w:val="32"/>
-          <w:szCs w:val="32"/>
-        </w:rPr>
-        <w:t>});</w:t>
-      </w:r>
-    </w:p>
-    <w:p>
-      <w:pPr>
-        <w:jc w:val="both"/>
-        <w:rPr>
-          <w:sz w:val="32"/>
-          <w:szCs w:val="32"/>
-        </w:rPr>
-      </w:pPr>
-      <w:r>
-        <w:rPr>
-          <w:sz w:val="32"/>
-          <w:szCs w:val="32"/>
-        </w:rPr>
-        <w:t xml:space="preserve"># </w:t>
-      </w:r>
-      <w:r>
-        <w:rPr>
-          <w:sz w:val="32"/>
-          <w:szCs w:val="32"/>
-        </w:rPr>
-        <w:t xml:space="preserve">That's one reason </w:t>
-      </w:r>
-      <w:r>
-        <w:rPr>
-          <w:b/>
-          <w:bCs/>
-          <w:sz w:val="32"/>
-          <w:szCs w:val="32"/>
-        </w:rPr>
-        <w:t>async</w:t>
-      </w:r>
-      <w:r>
-        <w:rPr>
-          <w:sz w:val="32"/>
-          <w:szCs w:val="32"/>
-        </w:rPr>
-        <w:t xml:space="preserve"> code often resumes before timers and other events.</w:t>
-      </w:r>
-    </w:p>
-    <w:p>
-      <w:pPr>
-        <w:jc w:val="both"/>
-        <w:rPr>
-          <w:sz w:val="32"/>
-          <w:szCs w:val="32"/>
-        </w:rPr>
-      </w:pPr>
-      <w:r>
-        <w:rPr>
-          <w:b/>
-          <w:bCs/>
-          <w:sz w:val="32"/>
-          <w:szCs w:val="32"/>
-        </w:rPr>
-        <w:t>NOTE:</w:t>
-      </w:r>
-      <w:r>
-        <w:rPr>
-          <w:sz w:val="32"/>
-          <w:szCs w:val="32"/>
-        </w:rPr>
-        <w:t xml:space="preserve"> JavaScript or TypeScript also has these </w:t>
-      </w:r>
-      <w:r>
-        <w:rPr>
-          <w:b/>
-          <w:bCs/>
-          <w:sz w:val="32"/>
-          <w:szCs w:val="32"/>
-        </w:rPr>
-        <w:t>Call Stack</w:t>
-      </w:r>
-      <w:r>
-        <w:rPr>
-          <w:sz w:val="32"/>
-          <w:szCs w:val="32"/>
-        </w:rPr>
-        <w:t>, Microtask queue, Event queue</w:t>
-      </w:r>
-    </w:p>
-    <w:p>
-      <w:pPr>
-        <w:jc w:val="both"/>
-        <w:rPr>
-          <w:sz w:val="32"/>
-          <w:szCs w:val="32"/>
-        </w:rPr>
-      </w:pPr>
-    </w:p>
-    <w:p>
-      <w:pPr>
-        <w:jc w:val="both"/>
-        <w:rPr>
-          <w:sz w:val="32"/>
-          <w:szCs w:val="32"/>
-        </w:rPr>
-      </w:pPr>
-    </w:p>
-    <w:p>
-      <w:pPr>
-        <w:jc w:val="both"/>
-        <w:rPr>
-          <w:b/>
-          <w:bCs/>
-          <w:sz w:val="32"/>
-          <w:szCs w:val="32"/>
-        </w:rPr>
-      </w:pPr>
-      <w:r>
-        <w:rPr>
-          <w:b/>
-          <w:bCs/>
-          <w:sz w:val="32"/>
-          <w:szCs w:val="32"/>
-        </w:rPr>
-        <w:t>Isolate:</w:t>
-      </w:r>
-    </w:p>
-    <w:p>
-      <w:pPr>
-        <w:jc w:val="both"/>
-        <w:rPr>
-          <w:sz w:val="32"/>
-          <w:szCs w:val="32"/>
-        </w:rPr>
-      </w:pPr>
-      <w:r>
-        <w:rPr>
-          <w:sz w:val="32"/>
-          <w:szCs w:val="32"/>
-        </w:rPr>
         <w:t xml:space="preserve"># Unlike </w:t>
       </w:r>
       <w:r>
@@ -36848,6 +39161,7 @@
           <w:sz w:val="28"/>
           <w:szCs w:val="28"/>
         </w:rPr>
+        <w:lastRenderedPageBreak/>
         <w:t xml:space="preserve"> └─ Event Loop</w:t>
       </w:r>
     </w:p>
@@ -36888,7 +39202,6 @@
           <w:sz w:val="28"/>
           <w:szCs w:val="28"/>
         </w:rPr>
-        <w:lastRenderedPageBreak/>
         <w:t xml:space="preserve"> └─ Image Processing</w:t>
       </w:r>
     </w:p>
@@ -37409,6 +39722,7 @@
           <w:sz w:val="32"/>
           <w:szCs w:val="32"/>
         </w:rPr>
+        <w:lastRenderedPageBreak/>
         <w:t xml:space="preserve">      </w:t>
       </w:r>
       <w:r>
@@ -37857,6 +40171,7 @@
           <w:sz w:val="28"/>
           <w:szCs w:val="28"/>
         </w:rPr>
+        <w:lastRenderedPageBreak/>
         <w:t>Worker Isolate</w:t>
       </w:r>
     </w:p>

</xml_diff>

<commit_message>
Updated docs 2nd August, added App Links and Universal Links. Worked on applicatin id for Android
</commit_message>
<xml_diff>
--- a/d2_dart_asynchronous_await_and_future.docx
+++ b/d2_dart_asynchronous_await_and_future.docx
@@ -19746,6 +19746,13 @@
       </w:r>
       <w:r>
         <w:rPr>
+          <w:sz w:val="32"/>
+          <w:szCs w:val="32"/>
+        </w:rPr>
+        <w:t xml:space="preserve"> control</w:t>
+      </w:r>
+      <w:r>
+        <w:rPr>
           <w:b/>
           <w:bCs/>
           <w:sz w:val="32"/>
@@ -19790,7 +19797,23 @@
           <w:sz w:val="32"/>
           <w:szCs w:val="32"/>
         </w:rPr>
-        <w:t xml:space="preserve"> is like a TV. A Completer gives us the remote control to decide when the </w:t>
+        <w:t xml:space="preserve"> is like a TV. A </w:t>
+      </w:r>
+      <w:r>
+        <w:rPr>
+          <w:b/>
+          <w:bCs/>
+          <w:sz w:val="32"/>
+          <w:szCs w:val="32"/>
+        </w:rPr>
+        <w:t>Completer</w:t>
+      </w:r>
+      <w:r>
+        <w:rPr>
+          <w:sz w:val="32"/>
+          <w:szCs w:val="32"/>
+        </w:rPr>
+        <w:t xml:space="preserve"> gives us the remote control to decide when the </w:t>
       </w:r>
       <w:r>
         <w:rPr>
@@ -20444,6 +20467,35 @@
       </w:r>
       <w:r>
         <w:rPr>
+          <w:b/>
+          <w:bCs/>
+          <w:sz w:val="32"/>
+          <w:szCs w:val="32"/>
+        </w:rPr>
+        <w:t>&lt;T</w:t>
+      </w:r>
+      <w:proofErr w:type="gramStart"/>
+      <w:r>
+        <w:rPr>
+          <w:b/>
+          <w:bCs/>
+          <w:sz w:val="32"/>
+          <w:szCs w:val="32"/>
+        </w:rPr>
+        <w:t>&gt;(</w:t>
+      </w:r>
+      <w:proofErr w:type="gramEnd"/>
+      <w:r>
+        <w:rPr>
+          <w:b/>
+          <w:bCs/>
+          <w:sz w:val="32"/>
+          <w:szCs w:val="32"/>
+        </w:rPr>
+        <w:t>)</w:t>
+      </w:r>
+      <w:r>
+        <w:rPr>
           <w:sz w:val="32"/>
           <w:szCs w:val="32"/>
         </w:rPr>
@@ -20454,7 +20506,51 @@
           <w:sz w:val="32"/>
           <w:szCs w:val="32"/>
         </w:rPr>
-        <w:t xml:space="preserve"> (It can also solve indicating API success problem in </w:t>
+        <w:t xml:space="preserve"> (</w:t>
+      </w:r>
+      <w:r>
+        <w:rPr>
+          <w:sz w:val="32"/>
+          <w:szCs w:val="32"/>
+        </w:rPr>
+        <w:t xml:space="preserve">It can also </w:t>
+      </w:r>
+      <w:proofErr w:type="gramStart"/>
+      <w:r>
+        <w:rPr>
+          <w:sz w:val="32"/>
+          <w:szCs w:val="32"/>
+        </w:rPr>
+        <w:t>solved</w:t>
+      </w:r>
+      <w:proofErr w:type="gramEnd"/>
+      <w:r>
+        <w:rPr>
+          <w:sz w:val="32"/>
+          <w:szCs w:val="32"/>
+        </w:rPr>
+        <w:t xml:space="preserve"> </w:t>
+      </w:r>
+      <w:r>
+        <w:rPr>
+          <w:sz w:val="32"/>
+          <w:szCs w:val="32"/>
+        </w:rPr>
+        <w:t>AP</w:t>
+      </w:r>
+      <w:r>
+        <w:rPr>
+          <w:sz w:val="32"/>
+          <w:szCs w:val="32"/>
+        </w:rPr>
+        <w:t>I calling and awaiting</w:t>
+      </w:r>
+      <w:r>
+        <w:rPr>
+          <w:sz w:val="32"/>
+          <w:szCs w:val="32"/>
+        </w:rPr>
+        <w:t xml:space="preserve"> problem in </w:t>
       </w:r>
       <w:proofErr w:type="spellStart"/>
       <w:r>
@@ -21799,6 +21895,1811 @@
           <w:szCs w:val="32"/>
         </w:rPr>
         <w:t xml:space="preserve"> method and the Future&lt;T&gt; that started the Stream will only finish API calling is finished in another method. See dart3 streams doc for this</w:t>
+      </w:r>
+    </w:p>
+    <w:p>
+      <w:pPr>
+        <w:jc w:val="both"/>
+        <w:rPr>
+          <w:sz w:val="32"/>
+          <w:szCs w:val="32"/>
+        </w:rPr>
+      </w:pPr>
+    </w:p>
+    <w:p>
+      <w:pPr>
+        <w:jc w:val="both"/>
+        <w:rPr>
+          <w:sz w:val="32"/>
+          <w:szCs w:val="32"/>
+        </w:rPr>
+      </w:pPr>
+    </w:p>
+    <w:p>
+      <w:pPr>
+        <w:jc w:val="both"/>
+        <w:rPr>
+          <w:sz w:val="32"/>
+          <w:szCs w:val="32"/>
+        </w:rPr>
+      </w:pPr>
+      <w:r>
+        <w:rPr>
+          <w:sz w:val="32"/>
+          <w:szCs w:val="32"/>
+        </w:rPr>
+        <w:t xml:space="preserve">Nullable Completer for </w:t>
+      </w:r>
+      <w:r>
+        <w:rPr>
+          <w:sz w:val="32"/>
+          <w:szCs w:val="32"/>
+        </w:rPr>
+        <w:t>Fresh Completer Per Method Call (In State Management):</w:t>
+      </w:r>
+    </w:p>
+    <w:p>
+      <w:pPr>
+        <w:jc w:val="both"/>
+        <w:rPr>
+          <w:sz w:val="32"/>
+          <w:szCs w:val="32"/>
+        </w:rPr>
+      </w:pPr>
+      <w:r>
+        <w:rPr>
+          <w:sz w:val="32"/>
+          <w:szCs w:val="32"/>
+        </w:rPr>
+        <w:t xml:space="preserve"># If we directly initialize or create the </w:t>
+      </w:r>
+      <w:r>
+        <w:rPr>
+          <w:b/>
+          <w:bCs/>
+          <w:sz w:val="32"/>
+          <w:szCs w:val="32"/>
+        </w:rPr>
+        <w:t>Completer</w:t>
+      </w:r>
+      <w:r>
+        <w:rPr>
+          <w:sz w:val="32"/>
+          <w:szCs w:val="32"/>
+        </w:rPr>
+        <w:t xml:space="preserve"> like this:</w:t>
+      </w:r>
+    </w:p>
+    <w:p>
+      <w:pPr>
+        <w:jc w:val="both"/>
+        <w:rPr>
+          <w:b/>
+          <w:bCs/>
+          <w:color w:val="D86DCB" w:themeColor="accent5" w:themeTint="99"/>
+          <w:sz w:val="32"/>
+          <w:szCs w:val="32"/>
+        </w:rPr>
+      </w:pPr>
+      <w:r>
+        <w:rPr>
+          <w:b/>
+          <w:bCs/>
+          <w:color w:val="D86DCB" w:themeColor="accent5" w:themeTint="99"/>
+          <w:sz w:val="32"/>
+          <w:szCs w:val="32"/>
+        </w:rPr>
+        <w:t>final Completer&lt;</w:t>
+      </w:r>
+      <w:r>
+        <w:rPr>
+          <w:b/>
+          <w:bCs/>
+          <w:color w:val="D86DCB" w:themeColor="accent5" w:themeTint="99"/>
+          <w:sz w:val="32"/>
+          <w:szCs w:val="32"/>
+        </w:rPr>
+        <w:t>bool</w:t>
+      </w:r>
+      <w:r>
+        <w:rPr>
+          <w:b/>
+          <w:bCs/>
+          <w:color w:val="D86DCB" w:themeColor="accent5" w:themeTint="99"/>
+          <w:sz w:val="32"/>
+          <w:szCs w:val="32"/>
+        </w:rPr>
+        <w:t>&gt; _</w:t>
+      </w:r>
+      <w:proofErr w:type="spellStart"/>
+      <w:r>
+        <w:rPr>
+          <w:b/>
+          <w:bCs/>
+          <w:color w:val="D86DCB" w:themeColor="accent5" w:themeTint="99"/>
+          <w:sz w:val="32"/>
+          <w:szCs w:val="32"/>
+        </w:rPr>
+        <w:t>authCompleter</w:t>
+      </w:r>
+      <w:proofErr w:type="spellEnd"/>
+      <w:r>
+        <w:rPr>
+          <w:b/>
+          <w:bCs/>
+          <w:color w:val="D86DCB" w:themeColor="accent5" w:themeTint="99"/>
+          <w:sz w:val="32"/>
+          <w:szCs w:val="32"/>
+        </w:rPr>
+        <w:t xml:space="preserve"> = Completer&lt;</w:t>
+      </w:r>
+      <w:r>
+        <w:rPr>
+          <w:b/>
+          <w:bCs/>
+          <w:color w:val="D86DCB" w:themeColor="accent5" w:themeTint="99"/>
+          <w:sz w:val="32"/>
+          <w:szCs w:val="32"/>
+        </w:rPr>
+        <w:t>bool</w:t>
+      </w:r>
+      <w:proofErr w:type="gramStart"/>
+      <w:r>
+        <w:rPr>
+          <w:b/>
+          <w:bCs/>
+          <w:color w:val="D86DCB" w:themeColor="accent5" w:themeTint="99"/>
+          <w:sz w:val="32"/>
+          <w:szCs w:val="32"/>
+        </w:rPr>
+        <w:t>&gt;(</w:t>
+      </w:r>
+      <w:proofErr w:type="gramEnd"/>
+      <w:r>
+        <w:rPr>
+          <w:b/>
+          <w:bCs/>
+          <w:color w:val="D86DCB" w:themeColor="accent5" w:themeTint="99"/>
+          <w:sz w:val="32"/>
+          <w:szCs w:val="32"/>
+        </w:rPr>
+        <w:t>);</w:t>
+      </w:r>
+    </w:p>
+    <w:p>
+      <w:pPr>
+        <w:jc w:val="both"/>
+        <w:rPr>
+          <w:b/>
+          <w:bCs/>
+          <w:color w:val="D86DCB" w:themeColor="accent5" w:themeTint="99"/>
+          <w:sz w:val="32"/>
+          <w:szCs w:val="32"/>
+        </w:rPr>
+      </w:pPr>
+      <w:r>
+        <w:rPr>
+          <w:b/>
+          <w:bCs/>
+          <w:color w:val="D86DCB" w:themeColor="accent5" w:themeTint="99"/>
+          <w:sz w:val="32"/>
+          <w:szCs w:val="32"/>
+        </w:rPr>
+        <w:t>…</w:t>
+      </w:r>
+    </w:p>
+    <w:p>
+      <w:pPr>
+        <w:jc w:val="both"/>
+        <w:rPr>
+          <w:b/>
+          <w:bCs/>
+          <w:color w:val="D86DCB" w:themeColor="accent5" w:themeTint="99"/>
+          <w:sz w:val="32"/>
+          <w:szCs w:val="32"/>
+        </w:rPr>
+      </w:pPr>
+      <w:r>
+        <w:rPr>
+          <w:b/>
+          <w:bCs/>
+          <w:color w:val="D86DCB" w:themeColor="accent5" w:themeTint="99"/>
+          <w:sz w:val="32"/>
+          <w:szCs w:val="32"/>
+        </w:rPr>
+        <w:t xml:space="preserve">Future&lt;void&gt; </w:t>
+      </w:r>
+      <w:proofErr w:type="spellStart"/>
+      <w:proofErr w:type="gramStart"/>
+      <w:r>
+        <w:rPr>
+          <w:b/>
+          <w:bCs/>
+          <w:color w:val="D86DCB" w:themeColor="accent5" w:themeTint="99"/>
+          <w:sz w:val="32"/>
+          <w:szCs w:val="32"/>
+        </w:rPr>
+        <w:t>startAuth</w:t>
+      </w:r>
+      <w:proofErr w:type="spellEnd"/>
+      <w:r>
+        <w:rPr>
+          <w:b/>
+          <w:bCs/>
+          <w:color w:val="D86DCB" w:themeColor="accent5" w:themeTint="99"/>
+          <w:sz w:val="32"/>
+          <w:szCs w:val="32"/>
+        </w:rPr>
+        <w:t>(</w:t>
+      </w:r>
+      <w:proofErr w:type="gramEnd"/>
+      <w:r>
+        <w:rPr>
+          <w:b/>
+          <w:bCs/>
+          <w:color w:val="D86DCB" w:themeColor="accent5" w:themeTint="99"/>
+          <w:sz w:val="32"/>
+          <w:szCs w:val="32"/>
+        </w:rPr>
+        <w:t>) async {</w:t>
+      </w:r>
+    </w:p>
+    <w:p>
+      <w:pPr>
+        <w:jc w:val="both"/>
+        <w:rPr>
+          <w:b/>
+          <w:bCs/>
+          <w:color w:val="D86DCB" w:themeColor="accent5" w:themeTint="99"/>
+          <w:sz w:val="32"/>
+          <w:szCs w:val="32"/>
+        </w:rPr>
+      </w:pPr>
+      <w:r>
+        <w:rPr>
+          <w:b/>
+          <w:bCs/>
+          <w:color w:val="D86DCB" w:themeColor="accent5" w:themeTint="99"/>
+          <w:sz w:val="32"/>
+          <w:szCs w:val="32"/>
+        </w:rPr>
+        <w:t xml:space="preserve">    …</w:t>
+      </w:r>
+    </w:p>
+    <w:p>
+      <w:pPr>
+        <w:jc w:val="both"/>
+        <w:rPr>
+          <w:b/>
+          <w:bCs/>
+          <w:color w:val="D86DCB" w:themeColor="accent5" w:themeTint="99"/>
+          <w:sz w:val="32"/>
+          <w:szCs w:val="32"/>
+        </w:rPr>
+      </w:pPr>
+      <w:r>
+        <w:rPr>
+          <w:b/>
+          <w:bCs/>
+          <w:color w:val="D86DCB" w:themeColor="accent5" w:themeTint="99"/>
+          <w:sz w:val="32"/>
+          <w:szCs w:val="32"/>
+        </w:rPr>
+        <w:t xml:space="preserve">    return _</w:t>
+      </w:r>
+      <w:proofErr w:type="spellStart"/>
+      <w:r>
+        <w:rPr>
+          <w:b/>
+          <w:bCs/>
+          <w:color w:val="D86DCB" w:themeColor="accent5" w:themeTint="99"/>
+          <w:sz w:val="32"/>
+          <w:szCs w:val="32"/>
+        </w:rPr>
+        <w:t>authCompleter.future</w:t>
+      </w:r>
+      <w:proofErr w:type="spellEnd"/>
+      <w:r>
+        <w:rPr>
+          <w:b/>
+          <w:bCs/>
+          <w:color w:val="D86DCB" w:themeColor="accent5" w:themeTint="99"/>
+          <w:sz w:val="32"/>
+          <w:szCs w:val="32"/>
+        </w:rPr>
+        <w:t>;</w:t>
+      </w:r>
+    </w:p>
+    <w:p>
+      <w:pPr>
+        <w:jc w:val="both"/>
+        <w:rPr>
+          <w:b/>
+          <w:bCs/>
+          <w:color w:val="D86DCB" w:themeColor="accent5" w:themeTint="99"/>
+          <w:sz w:val="32"/>
+          <w:szCs w:val="32"/>
+        </w:rPr>
+      </w:pPr>
+      <w:r>
+        <w:rPr>
+          <w:b/>
+          <w:bCs/>
+          <w:color w:val="D86DCB" w:themeColor="accent5" w:themeTint="99"/>
+          <w:sz w:val="32"/>
+          <w:szCs w:val="32"/>
+        </w:rPr>
+        <w:t>}</w:t>
+      </w:r>
+    </w:p>
+    <w:p>
+      <w:pPr>
+        <w:jc w:val="both"/>
+        <w:rPr>
+          <w:sz w:val="32"/>
+          <w:szCs w:val="32"/>
+        </w:rPr>
+      </w:pPr>
+      <w:r>
+        <w:rPr>
+          <w:sz w:val="32"/>
+          <w:szCs w:val="32"/>
+        </w:rPr>
+        <w:t xml:space="preserve"># Then we’re creating the </w:t>
+      </w:r>
+      <w:r>
+        <w:rPr>
+          <w:b/>
+          <w:bCs/>
+          <w:sz w:val="32"/>
+          <w:szCs w:val="32"/>
+        </w:rPr>
+        <w:t>Completer</w:t>
+      </w:r>
+      <w:r>
+        <w:rPr>
+          <w:sz w:val="32"/>
+          <w:szCs w:val="32"/>
+        </w:rPr>
+        <w:t xml:space="preserve"> once and the Notifier (state management) get one </w:t>
+      </w:r>
+      <w:r>
+        <w:rPr>
+          <w:b/>
+          <w:bCs/>
+          <w:sz w:val="32"/>
+          <w:szCs w:val="32"/>
+        </w:rPr>
+        <w:t>Completer</w:t>
+      </w:r>
+      <w:r>
+        <w:rPr>
+          <w:sz w:val="32"/>
+          <w:szCs w:val="32"/>
+        </w:rPr>
+        <w:t xml:space="preserve"> for its entire lifetime. And it creates this problem:</w:t>
+      </w:r>
+    </w:p>
+    <w:p>
+      <w:pPr>
+        <w:pStyle w:val="ListParagraph"/>
+        <w:numPr>
+          <w:ilvl w:val="0"/>
+          <w:numId w:val="38"/>
+        </w:numPr>
+        <w:jc w:val="both"/>
+        <w:rPr>
+          <w:sz w:val="32"/>
+          <w:szCs w:val="32"/>
+        </w:rPr>
+      </w:pPr>
+      <w:r>
+        <w:rPr>
+          <w:sz w:val="32"/>
+          <w:szCs w:val="32"/>
+        </w:rPr>
+        <w:t xml:space="preserve">First </w:t>
+      </w:r>
+      <w:r>
+        <w:rPr>
+          <w:sz w:val="32"/>
+          <w:szCs w:val="32"/>
+        </w:rPr>
+        <w:t>L</w:t>
+      </w:r>
+      <w:r>
+        <w:rPr>
+          <w:sz w:val="32"/>
+          <w:szCs w:val="32"/>
+        </w:rPr>
+        <w:t>ogin, everything works:</w:t>
+      </w:r>
+    </w:p>
+    <w:p>
+      <w:pPr>
+        <w:jc w:val="both"/>
+        <w:rPr>
+          <w:b/>
+          <w:bCs/>
+          <w:sz w:val="28"/>
+          <w:szCs w:val="28"/>
+        </w:rPr>
+      </w:pPr>
+      <w:r>
+        <w:rPr>
+          <w:b/>
+          <w:bCs/>
+          <w:sz w:val="28"/>
+          <w:szCs w:val="28"/>
+        </w:rPr>
+        <w:t>_</w:t>
+      </w:r>
+      <w:proofErr w:type="spellStart"/>
+      <w:r>
+        <w:rPr>
+          <w:b/>
+          <w:bCs/>
+          <w:sz w:val="28"/>
+          <w:szCs w:val="28"/>
+        </w:rPr>
+        <w:t>authCompleter</w:t>
+      </w:r>
+      <w:proofErr w:type="spellEnd"/>
+      <w:r>
+        <w:rPr>
+          <w:b/>
+          <w:bCs/>
+          <w:sz w:val="28"/>
+          <w:szCs w:val="28"/>
+        </w:rPr>
+        <w:t xml:space="preserve"> created</w:t>
+      </w:r>
+      <w:r>
+        <w:rPr>
+          <w:b/>
+          <w:bCs/>
+          <w:sz w:val="28"/>
+          <w:szCs w:val="28"/>
+        </w:rPr>
+        <w:t xml:space="preserve"> </w:t>
+      </w:r>
+      <w:r>
+        <w:sym w:font="Wingdings" w:char="F0E0"/>
+      </w:r>
+      <w:r>
+        <w:rPr>
+          <w:b/>
+          <w:bCs/>
+          <w:sz w:val="28"/>
+          <w:szCs w:val="28"/>
+        </w:rPr>
+        <w:t xml:space="preserve"> User logs in </w:t>
+      </w:r>
+      <w:r>
+        <w:sym w:font="Wingdings" w:char="F0E0"/>
+      </w:r>
+      <w:r>
+        <w:t xml:space="preserve"> </w:t>
+      </w:r>
+      <w:r>
+        <w:rPr>
+          <w:b/>
+          <w:bCs/>
+          <w:sz w:val="28"/>
+          <w:szCs w:val="28"/>
+        </w:rPr>
+        <w:t>_</w:t>
+      </w:r>
+      <w:proofErr w:type="spellStart"/>
+      <w:r>
+        <w:rPr>
+          <w:b/>
+          <w:bCs/>
+          <w:sz w:val="28"/>
+          <w:szCs w:val="28"/>
+        </w:rPr>
+        <w:t>authCompleter.complete</w:t>
+      </w:r>
+      <w:proofErr w:type="spellEnd"/>
+      <w:r>
+        <w:rPr>
+          <w:b/>
+          <w:bCs/>
+          <w:sz w:val="28"/>
+          <w:szCs w:val="28"/>
+        </w:rPr>
+        <w:t>(true)</w:t>
+      </w:r>
+    </w:p>
+    <w:p>
+      <w:pPr>
+        <w:pStyle w:val="ListParagraph"/>
+        <w:numPr>
+          <w:ilvl w:val="0"/>
+          <w:numId w:val="38"/>
+        </w:numPr>
+        <w:jc w:val="both"/>
+        <w:rPr>
+          <w:sz w:val="32"/>
+          <w:szCs w:val="32"/>
+        </w:rPr>
+      </w:pPr>
+      <w:r>
+        <w:rPr>
+          <w:sz w:val="32"/>
+          <w:szCs w:val="32"/>
+        </w:rPr>
+        <w:t xml:space="preserve">Second </w:t>
+      </w:r>
+      <w:r>
+        <w:rPr>
+          <w:sz w:val="32"/>
+          <w:szCs w:val="32"/>
+        </w:rPr>
+        <w:t>L</w:t>
+      </w:r>
+      <w:r>
+        <w:rPr>
+          <w:sz w:val="32"/>
+          <w:szCs w:val="32"/>
+        </w:rPr>
+        <w:t>ogin</w:t>
+      </w:r>
+      <w:r>
+        <w:rPr>
+          <w:sz w:val="32"/>
+          <w:szCs w:val="32"/>
+        </w:rPr>
+        <w:t>:</w:t>
+      </w:r>
+    </w:p>
+    <w:p>
+      <w:pPr>
+        <w:jc w:val="both"/>
+        <w:rPr>
+          <w:b/>
+          <w:bCs/>
+          <w:sz w:val="32"/>
+          <w:szCs w:val="32"/>
+        </w:rPr>
+      </w:pPr>
+      <w:proofErr w:type="spellStart"/>
+      <w:proofErr w:type="gramStart"/>
+      <w:r>
+        <w:rPr>
+          <w:b/>
+          <w:bCs/>
+          <w:sz w:val="28"/>
+          <w:szCs w:val="28"/>
+        </w:rPr>
+        <w:t>startAuth</w:t>
+      </w:r>
+      <w:proofErr w:type="spellEnd"/>
+      <w:r>
+        <w:rPr>
+          <w:b/>
+          <w:bCs/>
+          <w:sz w:val="28"/>
+          <w:szCs w:val="28"/>
+        </w:rPr>
+        <w:t>(</w:t>
+      </w:r>
+      <w:proofErr w:type="gramEnd"/>
+      <w:r>
+        <w:rPr>
+          <w:b/>
+          <w:bCs/>
+          <w:sz w:val="28"/>
+          <w:szCs w:val="28"/>
+        </w:rPr>
+        <w:t xml:space="preserve">) </w:t>
+      </w:r>
+      <w:r>
+        <w:rPr>
+          <w:b/>
+          <w:bCs/>
+          <w:sz w:val="28"/>
+          <w:szCs w:val="28"/>
+        </w:rPr>
+        <w:sym w:font="Wingdings" w:char="F0E0"/>
+      </w:r>
+      <w:r>
+        <w:rPr>
+          <w:b/>
+          <w:bCs/>
+          <w:sz w:val="28"/>
+          <w:szCs w:val="28"/>
+        </w:rPr>
+        <w:t xml:space="preserve"> return _</w:t>
+      </w:r>
+      <w:proofErr w:type="spellStart"/>
+      <w:r>
+        <w:rPr>
+          <w:b/>
+          <w:bCs/>
+          <w:sz w:val="28"/>
+          <w:szCs w:val="28"/>
+        </w:rPr>
+        <w:t>authCompleter.future</w:t>
+      </w:r>
+      <w:proofErr w:type="spellEnd"/>
+    </w:p>
+    <w:p>
+      <w:pPr>
+        <w:jc w:val="both"/>
+        <w:rPr>
+          <w:sz w:val="32"/>
+          <w:szCs w:val="32"/>
+        </w:rPr>
+      </w:pPr>
+      <w:r>
+        <w:rPr>
+          <w:sz w:val="32"/>
+          <w:szCs w:val="32"/>
+        </w:rPr>
+        <w:lastRenderedPageBreak/>
+        <w:t xml:space="preserve"># But </w:t>
+      </w:r>
+      <w:r>
+        <w:rPr>
+          <w:b/>
+          <w:bCs/>
+          <w:sz w:val="32"/>
+          <w:szCs w:val="32"/>
+        </w:rPr>
+        <w:t>_</w:t>
+      </w:r>
+      <w:proofErr w:type="spellStart"/>
+      <w:r>
+        <w:rPr>
+          <w:b/>
+          <w:bCs/>
+          <w:sz w:val="32"/>
+          <w:szCs w:val="32"/>
+        </w:rPr>
+        <w:t>authCompleter.future</w:t>
+      </w:r>
+      <w:proofErr w:type="spellEnd"/>
+      <w:r>
+        <w:rPr>
+          <w:b/>
+          <w:bCs/>
+          <w:sz w:val="32"/>
+          <w:szCs w:val="32"/>
+        </w:rPr>
+        <w:t xml:space="preserve"> </w:t>
+      </w:r>
+      <w:r>
+        <w:rPr>
+          <w:sz w:val="32"/>
+          <w:szCs w:val="32"/>
+        </w:rPr>
+        <w:t xml:space="preserve">is already completed from the First Login. So, </w:t>
+      </w:r>
+      <w:r>
+        <w:rPr>
+          <w:b/>
+          <w:bCs/>
+          <w:sz w:val="32"/>
+          <w:szCs w:val="32"/>
+        </w:rPr>
+        <w:t xml:space="preserve">await </w:t>
+      </w:r>
+      <w:proofErr w:type="spellStart"/>
+      <w:proofErr w:type="gramStart"/>
+      <w:r>
+        <w:rPr>
+          <w:b/>
+          <w:bCs/>
+          <w:sz w:val="32"/>
+          <w:szCs w:val="32"/>
+        </w:rPr>
+        <w:t>startAuth</w:t>
+      </w:r>
+      <w:proofErr w:type="spellEnd"/>
+      <w:r>
+        <w:rPr>
+          <w:b/>
+          <w:bCs/>
+          <w:sz w:val="32"/>
+          <w:szCs w:val="32"/>
+        </w:rPr>
+        <w:t>(</w:t>
+      </w:r>
+      <w:proofErr w:type="gramEnd"/>
+      <w:r>
+        <w:rPr>
+          <w:b/>
+          <w:bCs/>
+          <w:sz w:val="32"/>
+          <w:szCs w:val="32"/>
+        </w:rPr>
+        <w:t xml:space="preserve">) </w:t>
+      </w:r>
+      <w:r>
+        <w:rPr>
+          <w:sz w:val="32"/>
+          <w:szCs w:val="32"/>
+        </w:rPr>
+        <w:t>returns immediately without waiting for the new authentication</w:t>
+      </w:r>
+    </w:p>
+    <w:p>
+      <w:pPr>
+        <w:jc w:val="both"/>
+        <w:rPr>
+          <w:b/>
+          <w:bCs/>
+          <w:sz w:val="32"/>
+          <w:szCs w:val="32"/>
+        </w:rPr>
+      </w:pPr>
+      <w:r>
+        <w:rPr>
+          <w:sz w:val="32"/>
+          <w:szCs w:val="32"/>
+        </w:rPr>
+        <w:t xml:space="preserve"># The Correct Approach, The </w:t>
+      </w:r>
+      <w:r>
+        <w:rPr>
+          <w:b/>
+          <w:bCs/>
+          <w:sz w:val="32"/>
+          <w:szCs w:val="32"/>
+        </w:rPr>
+        <w:t>Completer&lt;bool&gt;?</w:t>
+      </w:r>
+      <w:r>
+        <w:rPr>
+          <w:sz w:val="32"/>
+          <w:szCs w:val="32"/>
+        </w:rPr>
+        <w:t xml:space="preserve"> should be </w:t>
+      </w:r>
+      <w:r>
+        <w:rPr>
+          <w:b/>
+          <w:bCs/>
+          <w:sz w:val="32"/>
+          <w:szCs w:val="32"/>
+        </w:rPr>
+        <w:t xml:space="preserve">null </w:t>
+      </w:r>
+      <w:r>
+        <w:rPr>
+          <w:sz w:val="32"/>
+          <w:szCs w:val="32"/>
+        </w:rPr>
+        <w:t xml:space="preserve">and only initialized when the </w:t>
+      </w:r>
+      <w:proofErr w:type="spellStart"/>
+      <w:proofErr w:type="gramStart"/>
+      <w:r>
+        <w:rPr>
+          <w:b/>
+          <w:bCs/>
+          <w:sz w:val="32"/>
+          <w:szCs w:val="32"/>
+        </w:rPr>
+        <w:t>startAuth</w:t>
+      </w:r>
+      <w:proofErr w:type="spellEnd"/>
+      <w:r>
+        <w:rPr>
+          <w:b/>
+          <w:bCs/>
+          <w:sz w:val="32"/>
+          <w:szCs w:val="32"/>
+        </w:rPr>
+        <w:t>(</w:t>
+      </w:r>
+      <w:proofErr w:type="gramEnd"/>
+      <w:r>
+        <w:rPr>
+          <w:b/>
+          <w:bCs/>
+          <w:sz w:val="32"/>
+          <w:szCs w:val="32"/>
+        </w:rPr>
+        <w:t xml:space="preserve">) </w:t>
+      </w:r>
+      <w:r>
+        <w:rPr>
+          <w:sz w:val="32"/>
+          <w:szCs w:val="32"/>
+        </w:rPr>
+        <w:t xml:space="preserve">method is called. So, it represents one authentication attempt, not the lifetime of the Notifier. And every Login gets a fresh </w:t>
+      </w:r>
+      <w:r>
+        <w:rPr>
+          <w:b/>
+          <w:bCs/>
+          <w:sz w:val="32"/>
+          <w:szCs w:val="32"/>
+        </w:rPr>
+        <w:t>Completer</w:t>
+      </w:r>
+    </w:p>
+    <w:p>
+      <w:pPr>
+        <w:jc w:val="both"/>
+        <w:rPr>
+          <w:b/>
+          <w:bCs/>
+          <w:color w:val="D86DCB" w:themeColor="accent5" w:themeTint="99"/>
+          <w:sz w:val="32"/>
+          <w:szCs w:val="32"/>
+        </w:rPr>
+      </w:pPr>
+      <w:r>
+        <w:rPr>
+          <w:b/>
+          <w:bCs/>
+          <w:color w:val="D86DCB" w:themeColor="accent5" w:themeTint="99"/>
+          <w:sz w:val="32"/>
+          <w:szCs w:val="32"/>
+        </w:rPr>
+        <w:t xml:space="preserve">class </w:t>
+      </w:r>
+      <w:proofErr w:type="spellStart"/>
+      <w:r>
+        <w:rPr>
+          <w:b/>
+          <w:bCs/>
+          <w:color w:val="D86DCB" w:themeColor="accent5" w:themeTint="99"/>
+          <w:sz w:val="32"/>
+          <w:szCs w:val="32"/>
+        </w:rPr>
+        <w:t>AuthNotifier</w:t>
+      </w:r>
+      <w:proofErr w:type="spellEnd"/>
+      <w:r>
+        <w:rPr>
+          <w:b/>
+          <w:bCs/>
+          <w:color w:val="D86DCB" w:themeColor="accent5" w:themeTint="99"/>
+          <w:sz w:val="32"/>
+          <w:szCs w:val="32"/>
+        </w:rPr>
+        <w:t xml:space="preserve"> extends Notifier&lt;bool&gt; {</w:t>
+      </w:r>
+    </w:p>
+    <w:p>
+      <w:pPr>
+        <w:jc w:val="both"/>
+        <w:rPr>
+          <w:b/>
+          <w:bCs/>
+          <w:color w:val="D86DCB" w:themeColor="accent5" w:themeTint="99"/>
+          <w:sz w:val="32"/>
+          <w:szCs w:val="32"/>
+        </w:rPr>
+      </w:pPr>
+      <w:r>
+        <w:rPr>
+          <w:b/>
+          <w:bCs/>
+          <w:color w:val="D86DCB" w:themeColor="accent5" w:themeTint="99"/>
+          <w:sz w:val="32"/>
+          <w:szCs w:val="32"/>
+        </w:rPr>
+        <w:t>Completer&lt;bool&gt;</w:t>
+      </w:r>
+      <w:r>
+        <w:rPr>
+          <w:b/>
+          <w:bCs/>
+          <w:color w:val="D86DCB" w:themeColor="accent5" w:themeTint="99"/>
+          <w:sz w:val="32"/>
+          <w:szCs w:val="32"/>
+        </w:rPr>
+        <w:t>?</w:t>
+      </w:r>
+      <w:r>
+        <w:rPr>
+          <w:b/>
+          <w:bCs/>
+          <w:color w:val="D86DCB" w:themeColor="accent5" w:themeTint="99"/>
+          <w:sz w:val="32"/>
+          <w:szCs w:val="32"/>
+        </w:rPr>
+        <w:t xml:space="preserve"> _</w:t>
+      </w:r>
+      <w:proofErr w:type="spellStart"/>
+      <w:r>
+        <w:rPr>
+          <w:b/>
+          <w:bCs/>
+          <w:color w:val="D86DCB" w:themeColor="accent5" w:themeTint="99"/>
+          <w:sz w:val="32"/>
+          <w:szCs w:val="32"/>
+        </w:rPr>
+        <w:t>authCompleter</w:t>
+      </w:r>
+      <w:proofErr w:type="spellEnd"/>
+      <w:r>
+        <w:rPr>
+          <w:b/>
+          <w:bCs/>
+          <w:color w:val="D86DCB" w:themeColor="accent5" w:themeTint="99"/>
+          <w:sz w:val="32"/>
+          <w:szCs w:val="32"/>
+        </w:rPr>
+        <w:t>;</w:t>
+      </w:r>
+    </w:p>
+    <w:p>
+      <w:pPr>
+        <w:jc w:val="both"/>
+        <w:rPr>
+          <w:b/>
+          <w:bCs/>
+          <w:color w:val="D86DCB" w:themeColor="accent5" w:themeTint="99"/>
+          <w:sz w:val="32"/>
+          <w:szCs w:val="32"/>
+        </w:rPr>
+      </w:pPr>
+      <w:r>
+        <w:rPr>
+          <w:b/>
+          <w:bCs/>
+          <w:color w:val="D86DCB" w:themeColor="accent5" w:themeTint="99"/>
+          <w:sz w:val="32"/>
+          <w:szCs w:val="32"/>
+        </w:rPr>
+        <w:t>…</w:t>
+      </w:r>
+    </w:p>
+    <w:p>
+      <w:pPr>
+        <w:jc w:val="both"/>
+        <w:rPr>
+          <w:b/>
+          <w:bCs/>
+          <w:color w:val="D86DCB" w:themeColor="accent5" w:themeTint="99"/>
+          <w:sz w:val="32"/>
+          <w:szCs w:val="32"/>
+        </w:rPr>
+      </w:pPr>
+      <w:r>
+        <w:rPr>
+          <w:b/>
+          <w:bCs/>
+          <w:color w:val="D86DCB" w:themeColor="accent5" w:themeTint="99"/>
+          <w:sz w:val="32"/>
+          <w:szCs w:val="32"/>
+        </w:rPr>
+        <w:t xml:space="preserve">  </w:t>
+      </w:r>
+      <w:r>
+        <w:rPr>
+          <w:b/>
+          <w:bCs/>
+          <w:color w:val="D86DCB" w:themeColor="accent5" w:themeTint="99"/>
+          <w:sz w:val="32"/>
+          <w:szCs w:val="32"/>
+        </w:rPr>
+        <w:t xml:space="preserve">Future&lt;void&gt; </w:t>
+      </w:r>
+      <w:proofErr w:type="spellStart"/>
+      <w:proofErr w:type="gramStart"/>
+      <w:r>
+        <w:rPr>
+          <w:b/>
+          <w:bCs/>
+          <w:color w:val="D86DCB" w:themeColor="accent5" w:themeTint="99"/>
+          <w:sz w:val="32"/>
+          <w:szCs w:val="32"/>
+        </w:rPr>
+        <w:t>startAuth</w:t>
+      </w:r>
+      <w:proofErr w:type="spellEnd"/>
+      <w:r>
+        <w:rPr>
+          <w:b/>
+          <w:bCs/>
+          <w:color w:val="D86DCB" w:themeColor="accent5" w:themeTint="99"/>
+          <w:sz w:val="32"/>
+          <w:szCs w:val="32"/>
+        </w:rPr>
+        <w:t>(</w:t>
+      </w:r>
+      <w:proofErr w:type="gramEnd"/>
+      <w:r>
+        <w:rPr>
+          <w:b/>
+          <w:bCs/>
+          <w:color w:val="D86DCB" w:themeColor="accent5" w:themeTint="99"/>
+          <w:sz w:val="32"/>
+          <w:szCs w:val="32"/>
+        </w:rPr>
+        <w:t>) async {</w:t>
+      </w:r>
+    </w:p>
+    <w:p>
+      <w:pPr>
+        <w:jc w:val="both"/>
+        <w:rPr>
+          <w:b/>
+          <w:bCs/>
+          <w:color w:val="D86DCB" w:themeColor="accent5" w:themeTint="99"/>
+          <w:sz w:val="32"/>
+          <w:szCs w:val="32"/>
+        </w:rPr>
+      </w:pPr>
+      <w:r>
+        <w:rPr>
+          <w:b/>
+          <w:bCs/>
+          <w:color w:val="D86DCB" w:themeColor="accent5" w:themeTint="99"/>
+          <w:sz w:val="32"/>
+          <w:szCs w:val="32"/>
+        </w:rPr>
+        <w:t xml:space="preserve">  </w:t>
+      </w:r>
+      <w:r>
+        <w:rPr>
+          <w:b/>
+          <w:bCs/>
+          <w:color w:val="D86DCB" w:themeColor="accent5" w:themeTint="99"/>
+          <w:sz w:val="32"/>
+          <w:szCs w:val="32"/>
+        </w:rPr>
+        <w:t xml:space="preserve"> </w:t>
+      </w:r>
+      <w:r>
+        <w:rPr>
+          <w:b/>
+          <w:bCs/>
+          <w:color w:val="D86DCB" w:themeColor="accent5" w:themeTint="99"/>
+          <w:sz w:val="32"/>
+          <w:szCs w:val="32"/>
+        </w:rPr>
+        <w:t xml:space="preserve">  </w:t>
+      </w:r>
+      <w:r>
+        <w:rPr>
+          <w:b/>
+          <w:bCs/>
+          <w:color w:val="D86DCB" w:themeColor="accent5" w:themeTint="99"/>
+          <w:sz w:val="32"/>
+          <w:szCs w:val="32"/>
+        </w:rPr>
+        <w:t>_</w:t>
+      </w:r>
+      <w:proofErr w:type="spellStart"/>
+      <w:r>
+        <w:rPr>
+          <w:b/>
+          <w:bCs/>
+          <w:color w:val="D86DCB" w:themeColor="accent5" w:themeTint="99"/>
+          <w:sz w:val="32"/>
+          <w:szCs w:val="32"/>
+        </w:rPr>
+        <w:t>authCompleter</w:t>
+      </w:r>
+      <w:proofErr w:type="spellEnd"/>
+      <w:r>
+        <w:rPr>
+          <w:b/>
+          <w:bCs/>
+          <w:color w:val="D86DCB" w:themeColor="accent5" w:themeTint="99"/>
+          <w:sz w:val="32"/>
+          <w:szCs w:val="32"/>
+        </w:rPr>
+        <w:t xml:space="preserve"> = Completer&lt;bool</w:t>
+      </w:r>
+      <w:proofErr w:type="gramStart"/>
+      <w:r>
+        <w:rPr>
+          <w:b/>
+          <w:bCs/>
+          <w:color w:val="D86DCB" w:themeColor="accent5" w:themeTint="99"/>
+          <w:sz w:val="32"/>
+          <w:szCs w:val="32"/>
+        </w:rPr>
+        <w:t>&gt;(</w:t>
+      </w:r>
+      <w:proofErr w:type="gramEnd"/>
+      <w:r>
+        <w:rPr>
+          <w:b/>
+          <w:bCs/>
+          <w:color w:val="D86DCB" w:themeColor="accent5" w:themeTint="99"/>
+          <w:sz w:val="32"/>
+          <w:szCs w:val="32"/>
+        </w:rPr>
+        <w:t>);</w:t>
+      </w:r>
+    </w:p>
+    <w:p>
+      <w:pPr>
+        <w:jc w:val="both"/>
+        <w:rPr>
+          <w:b/>
+          <w:bCs/>
+          <w:color w:val="D86DCB" w:themeColor="accent5" w:themeTint="99"/>
+          <w:sz w:val="32"/>
+          <w:szCs w:val="32"/>
+        </w:rPr>
+      </w:pPr>
+      <w:r>
+        <w:rPr>
+          <w:b/>
+          <w:bCs/>
+          <w:color w:val="D86DCB" w:themeColor="accent5" w:themeTint="99"/>
+          <w:sz w:val="32"/>
+          <w:szCs w:val="32"/>
+        </w:rPr>
+        <w:t xml:space="preserve">   </w:t>
+      </w:r>
+      <w:r>
+        <w:rPr>
+          <w:b/>
+          <w:bCs/>
+          <w:color w:val="D86DCB" w:themeColor="accent5" w:themeTint="99"/>
+          <w:sz w:val="32"/>
+          <w:szCs w:val="32"/>
+        </w:rPr>
+        <w:t xml:space="preserve"> </w:t>
+      </w:r>
+      <w:r>
+        <w:rPr>
+          <w:b/>
+          <w:bCs/>
+          <w:color w:val="D86DCB" w:themeColor="accent5" w:themeTint="99"/>
+          <w:sz w:val="32"/>
+          <w:szCs w:val="32"/>
+        </w:rPr>
+        <w:t xml:space="preserve"> …</w:t>
+      </w:r>
+    </w:p>
+    <w:p>
+      <w:pPr>
+        <w:jc w:val="both"/>
+        <w:rPr>
+          <w:b/>
+          <w:bCs/>
+          <w:color w:val="D86DCB" w:themeColor="accent5" w:themeTint="99"/>
+          <w:sz w:val="32"/>
+          <w:szCs w:val="32"/>
+        </w:rPr>
+      </w:pPr>
+      <w:r>
+        <w:rPr>
+          <w:b/>
+          <w:bCs/>
+          <w:color w:val="D86DCB" w:themeColor="accent5" w:themeTint="99"/>
+          <w:sz w:val="32"/>
+          <w:szCs w:val="32"/>
+        </w:rPr>
+        <w:t xml:space="preserve">    </w:t>
+      </w:r>
+      <w:r>
+        <w:rPr>
+          <w:b/>
+          <w:bCs/>
+          <w:color w:val="D86DCB" w:themeColor="accent5" w:themeTint="99"/>
+          <w:sz w:val="32"/>
+          <w:szCs w:val="32"/>
+        </w:rPr>
+        <w:t xml:space="preserve"> </w:t>
+      </w:r>
+      <w:r>
+        <w:rPr>
+          <w:b/>
+          <w:bCs/>
+          <w:color w:val="D86DCB" w:themeColor="accent5" w:themeTint="99"/>
+          <w:sz w:val="32"/>
+          <w:szCs w:val="32"/>
+        </w:rPr>
+        <w:t>return _</w:t>
+      </w:r>
+      <w:proofErr w:type="spellStart"/>
+      <w:proofErr w:type="gramStart"/>
+      <w:r>
+        <w:rPr>
+          <w:b/>
+          <w:bCs/>
+          <w:color w:val="D86DCB" w:themeColor="accent5" w:themeTint="99"/>
+          <w:sz w:val="32"/>
+          <w:szCs w:val="32"/>
+        </w:rPr>
+        <w:t>authCompleter</w:t>
+      </w:r>
+      <w:proofErr w:type="spellEnd"/>
+      <w:r>
+        <w:rPr>
+          <w:b/>
+          <w:bCs/>
+          <w:color w:val="D86DCB" w:themeColor="accent5" w:themeTint="99"/>
+          <w:sz w:val="32"/>
+          <w:szCs w:val="32"/>
+        </w:rPr>
+        <w:t>!</w:t>
+      </w:r>
+      <w:r>
+        <w:rPr>
+          <w:b/>
+          <w:bCs/>
+          <w:color w:val="D86DCB" w:themeColor="accent5" w:themeTint="99"/>
+          <w:sz w:val="32"/>
+          <w:szCs w:val="32"/>
+        </w:rPr>
+        <w:t>.</w:t>
+      </w:r>
+      <w:proofErr w:type="gramEnd"/>
+      <w:r>
+        <w:rPr>
+          <w:b/>
+          <w:bCs/>
+          <w:color w:val="D86DCB" w:themeColor="accent5" w:themeTint="99"/>
+          <w:sz w:val="32"/>
+          <w:szCs w:val="32"/>
+        </w:rPr>
+        <w:t>future;</w:t>
+      </w:r>
+    </w:p>
+    <w:p>
+      <w:pPr>
+        <w:jc w:val="both"/>
+        <w:rPr>
+          <w:b/>
+          <w:bCs/>
+          <w:color w:val="D86DCB" w:themeColor="accent5" w:themeTint="99"/>
+          <w:sz w:val="32"/>
+          <w:szCs w:val="32"/>
+        </w:rPr>
+      </w:pPr>
+      <w:r>
+        <w:rPr>
+          <w:b/>
+          <w:bCs/>
+          <w:color w:val="D86DCB" w:themeColor="accent5" w:themeTint="99"/>
+          <w:sz w:val="32"/>
+          <w:szCs w:val="32"/>
+        </w:rPr>
+        <w:t xml:space="preserve">  </w:t>
+      </w:r>
+      <w:r>
+        <w:rPr>
+          <w:b/>
+          <w:bCs/>
+          <w:color w:val="D86DCB" w:themeColor="accent5" w:themeTint="99"/>
+          <w:sz w:val="32"/>
+          <w:szCs w:val="32"/>
+        </w:rPr>
+        <w:t>}</w:t>
+      </w:r>
+    </w:p>
+    <w:p>
+      <w:pPr>
+        <w:jc w:val="both"/>
+        <w:rPr>
+          <w:b/>
+          <w:bCs/>
+          <w:color w:val="D86DCB" w:themeColor="accent5" w:themeTint="99"/>
+          <w:sz w:val="32"/>
+          <w:szCs w:val="32"/>
+        </w:rPr>
+      </w:pPr>
+      <w:r>
+        <w:rPr>
+          <w:b/>
+          <w:bCs/>
+          <w:color w:val="D86DCB" w:themeColor="accent5" w:themeTint="99"/>
+          <w:sz w:val="32"/>
+          <w:szCs w:val="32"/>
+        </w:rPr>
+        <w:t xml:space="preserve">  </w:t>
+      </w:r>
+      <w:r>
+        <w:rPr>
+          <w:b/>
+          <w:bCs/>
+          <w:color w:val="D86DCB" w:themeColor="accent5" w:themeTint="99"/>
+          <w:sz w:val="32"/>
+          <w:szCs w:val="32"/>
+        </w:rPr>
+        <w:t>…</w:t>
+      </w:r>
+    </w:p>
+    <w:p>
+      <w:pPr>
+        <w:jc w:val="both"/>
+        <w:rPr>
+          <w:b/>
+          <w:bCs/>
+          <w:color w:val="D86DCB" w:themeColor="accent5" w:themeTint="99"/>
+          <w:sz w:val="32"/>
+          <w:szCs w:val="32"/>
+        </w:rPr>
+      </w:pPr>
+      <w:r>
+        <w:rPr>
+          <w:b/>
+          <w:bCs/>
+          <w:color w:val="D86DCB" w:themeColor="accent5" w:themeTint="99"/>
+          <w:sz w:val="32"/>
+          <w:szCs w:val="32"/>
+        </w:rPr>
+        <w:t xml:space="preserve">  void </w:t>
+      </w:r>
+      <w:proofErr w:type="gramStart"/>
+      <w:r>
+        <w:rPr>
+          <w:b/>
+          <w:bCs/>
+          <w:color w:val="D86DCB" w:themeColor="accent5" w:themeTint="99"/>
+          <w:sz w:val="32"/>
+          <w:szCs w:val="32"/>
+        </w:rPr>
+        <w:t>complete(</w:t>
+      </w:r>
+      <w:proofErr w:type="gramEnd"/>
+      <w:r>
+        <w:rPr>
+          <w:b/>
+          <w:bCs/>
+          <w:color w:val="D86DCB" w:themeColor="accent5" w:themeTint="99"/>
+          <w:sz w:val="32"/>
+          <w:szCs w:val="32"/>
+        </w:rPr>
+        <w:t>String value) {</w:t>
+      </w:r>
+    </w:p>
+    <w:p>
+      <w:pPr>
+        <w:jc w:val="both"/>
+        <w:rPr>
+          <w:b/>
+          <w:bCs/>
+          <w:color w:val="D86DCB" w:themeColor="accent5" w:themeTint="99"/>
+          <w:sz w:val="32"/>
+          <w:szCs w:val="32"/>
+        </w:rPr>
+      </w:pPr>
+      <w:r>
+        <w:rPr>
+          <w:b/>
+          <w:bCs/>
+          <w:color w:val="D86DCB" w:themeColor="accent5" w:themeTint="99"/>
+          <w:sz w:val="32"/>
+          <w:szCs w:val="32"/>
+        </w:rPr>
+        <w:t xml:space="preserve">    </w:t>
+      </w:r>
+      <w:proofErr w:type="gramStart"/>
+      <w:r>
+        <w:rPr>
+          <w:b/>
+          <w:bCs/>
+          <w:color w:val="D86DCB" w:themeColor="accent5" w:themeTint="99"/>
+          <w:sz w:val="32"/>
+          <w:szCs w:val="32"/>
+        </w:rPr>
+        <w:t>if(</w:t>
+      </w:r>
+      <w:proofErr w:type="gramEnd"/>
+      <w:r>
+        <w:rPr>
+          <w:b/>
+          <w:bCs/>
+          <w:color w:val="D86DCB" w:themeColor="accent5" w:themeTint="99"/>
+          <w:sz w:val="32"/>
+          <w:szCs w:val="32"/>
+        </w:rPr>
+        <w:t>!(</w:t>
+      </w:r>
+      <w:r>
+        <w:rPr>
+          <w:b/>
+          <w:bCs/>
+          <w:color w:val="D86DCB" w:themeColor="accent5" w:themeTint="99"/>
+          <w:sz w:val="32"/>
+          <w:szCs w:val="32"/>
+        </w:rPr>
+        <w:t>_</w:t>
+      </w:r>
+      <w:proofErr w:type="spellStart"/>
+      <w:r>
+        <w:rPr>
+          <w:b/>
+          <w:bCs/>
+          <w:color w:val="D86DCB" w:themeColor="accent5" w:themeTint="99"/>
+          <w:sz w:val="32"/>
+          <w:szCs w:val="32"/>
+        </w:rPr>
+        <w:t>completer.isCompleted</w:t>
+      </w:r>
+      <w:proofErr w:type="spellEnd"/>
+      <w:r>
+        <w:rPr>
+          <w:b/>
+          <w:bCs/>
+          <w:color w:val="D86DCB" w:themeColor="accent5" w:themeTint="99"/>
+          <w:sz w:val="32"/>
+          <w:szCs w:val="32"/>
+        </w:rPr>
+        <w:t xml:space="preserve"> ?? true)</w:t>
+      </w:r>
+      <w:r>
+        <w:rPr>
+          <w:b/>
+          <w:bCs/>
+          <w:color w:val="D86DCB" w:themeColor="accent5" w:themeTint="99"/>
+          <w:sz w:val="32"/>
+          <w:szCs w:val="32"/>
+        </w:rPr>
+        <w:t>) {</w:t>
+      </w:r>
+    </w:p>
+    <w:p>
+      <w:pPr>
+        <w:jc w:val="both"/>
+        <w:rPr>
+          <w:b/>
+          <w:bCs/>
+          <w:color w:val="D86DCB" w:themeColor="accent5" w:themeTint="99"/>
+          <w:sz w:val="32"/>
+          <w:szCs w:val="32"/>
+        </w:rPr>
+      </w:pPr>
+      <w:r>
+        <w:rPr>
+          <w:b/>
+          <w:bCs/>
+          <w:color w:val="D86DCB" w:themeColor="accent5" w:themeTint="99"/>
+          <w:sz w:val="32"/>
+          <w:szCs w:val="32"/>
+        </w:rPr>
+        <w:t xml:space="preserve">    _</w:t>
+      </w:r>
+      <w:proofErr w:type="spellStart"/>
+      <w:proofErr w:type="gramStart"/>
+      <w:r>
+        <w:rPr>
+          <w:b/>
+          <w:bCs/>
+          <w:color w:val="D86DCB" w:themeColor="accent5" w:themeTint="99"/>
+          <w:sz w:val="32"/>
+          <w:szCs w:val="32"/>
+        </w:rPr>
+        <w:t>completer.complete</w:t>
+      </w:r>
+      <w:proofErr w:type="spellEnd"/>
+      <w:proofErr w:type="gramEnd"/>
+      <w:r>
+        <w:rPr>
+          <w:b/>
+          <w:bCs/>
+          <w:color w:val="D86DCB" w:themeColor="accent5" w:themeTint="99"/>
+          <w:sz w:val="32"/>
+          <w:szCs w:val="32"/>
+        </w:rPr>
+        <w:t xml:space="preserve">(value); </w:t>
+      </w:r>
+    </w:p>
+    <w:p>
+      <w:pPr>
+        <w:jc w:val="both"/>
+        <w:rPr>
+          <w:b/>
+          <w:bCs/>
+          <w:color w:val="D86DCB" w:themeColor="accent5" w:themeTint="99"/>
+          <w:sz w:val="32"/>
+          <w:szCs w:val="32"/>
+        </w:rPr>
+      </w:pPr>
+      <w:r>
+        <w:rPr>
+          <w:b/>
+          <w:bCs/>
+          <w:color w:val="D86DCB" w:themeColor="accent5" w:themeTint="99"/>
+          <w:sz w:val="32"/>
+          <w:szCs w:val="32"/>
+        </w:rPr>
+        <w:t xml:space="preserve">    }</w:t>
+      </w:r>
+    </w:p>
+    <w:p>
+      <w:pPr>
+        <w:jc w:val="both"/>
+        <w:rPr>
+          <w:b/>
+          <w:bCs/>
+          <w:color w:val="D86DCB" w:themeColor="accent5" w:themeTint="99"/>
+          <w:sz w:val="32"/>
+          <w:szCs w:val="32"/>
+        </w:rPr>
+      </w:pPr>
+      <w:r>
+        <w:rPr>
+          <w:b/>
+          <w:bCs/>
+          <w:color w:val="D86DCB" w:themeColor="accent5" w:themeTint="99"/>
+          <w:sz w:val="32"/>
+          <w:szCs w:val="32"/>
+        </w:rPr>
+        <w:t xml:space="preserve">  }</w:t>
+      </w:r>
+    </w:p>
+    <w:p>
+      <w:pPr>
+        <w:jc w:val="both"/>
+        <w:rPr>
+          <w:b/>
+          <w:bCs/>
+          <w:color w:val="D86DCB" w:themeColor="accent5" w:themeTint="99"/>
+          <w:sz w:val="32"/>
+          <w:szCs w:val="32"/>
+        </w:rPr>
+      </w:pPr>
+      <w:r>
+        <w:rPr>
+          <w:b/>
+          <w:bCs/>
+          <w:color w:val="D86DCB" w:themeColor="accent5" w:themeTint="99"/>
+          <w:sz w:val="32"/>
+          <w:szCs w:val="32"/>
+        </w:rPr>
+        <w:t xml:space="preserve">  void </w:t>
+      </w:r>
+      <w:proofErr w:type="spellStart"/>
+      <w:proofErr w:type="gramStart"/>
+      <w:r>
+        <w:rPr>
+          <w:b/>
+          <w:bCs/>
+          <w:color w:val="D86DCB" w:themeColor="accent5" w:themeTint="99"/>
+          <w:sz w:val="32"/>
+          <w:szCs w:val="32"/>
+        </w:rPr>
+        <w:t>completeWithError</w:t>
+      </w:r>
+      <w:proofErr w:type="spellEnd"/>
+      <w:r>
+        <w:rPr>
+          <w:b/>
+          <w:bCs/>
+          <w:color w:val="D86DCB" w:themeColor="accent5" w:themeTint="99"/>
+          <w:sz w:val="32"/>
+          <w:szCs w:val="32"/>
+        </w:rPr>
+        <w:t>(</w:t>
+      </w:r>
+      <w:proofErr w:type="gramEnd"/>
+      <w:r>
+        <w:rPr>
+          <w:b/>
+          <w:bCs/>
+          <w:color w:val="D86DCB" w:themeColor="accent5" w:themeTint="99"/>
+          <w:sz w:val="32"/>
+          <w:szCs w:val="32"/>
+        </w:rPr>
+        <w:t>) {</w:t>
+      </w:r>
+    </w:p>
+    <w:p>
+      <w:pPr>
+        <w:jc w:val="both"/>
+        <w:rPr>
+          <w:b/>
+          <w:bCs/>
+          <w:color w:val="D86DCB" w:themeColor="accent5" w:themeTint="99"/>
+          <w:sz w:val="32"/>
+          <w:szCs w:val="32"/>
+        </w:rPr>
+      </w:pPr>
+      <w:r>
+        <w:rPr>
+          <w:b/>
+          <w:bCs/>
+          <w:color w:val="D86DCB" w:themeColor="accent5" w:themeTint="99"/>
+          <w:sz w:val="32"/>
+          <w:szCs w:val="32"/>
+        </w:rPr>
+        <w:t xml:space="preserve">    </w:t>
+      </w:r>
+      <w:proofErr w:type="gramStart"/>
+      <w:r>
+        <w:rPr>
+          <w:b/>
+          <w:bCs/>
+          <w:color w:val="D86DCB" w:themeColor="accent5" w:themeTint="99"/>
+          <w:sz w:val="32"/>
+          <w:szCs w:val="32"/>
+        </w:rPr>
+        <w:t>if(</w:t>
+      </w:r>
+      <w:proofErr w:type="gramEnd"/>
+      <w:r>
+        <w:rPr>
+          <w:b/>
+          <w:bCs/>
+          <w:color w:val="D86DCB" w:themeColor="accent5" w:themeTint="99"/>
+          <w:sz w:val="32"/>
+          <w:szCs w:val="32"/>
+        </w:rPr>
+        <w:t>!(</w:t>
+      </w:r>
+      <w:r>
+        <w:rPr>
+          <w:b/>
+          <w:bCs/>
+          <w:color w:val="D86DCB" w:themeColor="accent5" w:themeTint="99"/>
+          <w:sz w:val="32"/>
+          <w:szCs w:val="32"/>
+        </w:rPr>
+        <w:t>_</w:t>
+      </w:r>
+      <w:proofErr w:type="spellStart"/>
+      <w:r>
+        <w:rPr>
+          <w:b/>
+          <w:bCs/>
+          <w:color w:val="D86DCB" w:themeColor="accent5" w:themeTint="99"/>
+          <w:sz w:val="32"/>
+          <w:szCs w:val="32"/>
+        </w:rPr>
+        <w:t>completer.isCompleted</w:t>
+      </w:r>
+      <w:proofErr w:type="spellEnd"/>
+      <w:r>
+        <w:rPr>
+          <w:b/>
+          <w:bCs/>
+          <w:color w:val="D86DCB" w:themeColor="accent5" w:themeTint="99"/>
+          <w:sz w:val="32"/>
+          <w:szCs w:val="32"/>
+        </w:rPr>
+        <w:t xml:space="preserve"> ?? true)</w:t>
+      </w:r>
+      <w:r>
+        <w:rPr>
+          <w:b/>
+          <w:bCs/>
+          <w:color w:val="D86DCB" w:themeColor="accent5" w:themeTint="99"/>
+          <w:sz w:val="32"/>
+          <w:szCs w:val="32"/>
+        </w:rPr>
+        <w:t>) {</w:t>
+      </w:r>
+    </w:p>
+    <w:p>
+      <w:pPr>
+        <w:jc w:val="both"/>
+        <w:rPr>
+          <w:b/>
+          <w:bCs/>
+          <w:color w:val="D86DCB" w:themeColor="accent5" w:themeTint="99"/>
+          <w:sz w:val="32"/>
+          <w:szCs w:val="32"/>
+        </w:rPr>
+      </w:pPr>
+      <w:r>
+        <w:rPr>
+          <w:b/>
+          <w:bCs/>
+          <w:color w:val="D86DCB" w:themeColor="accent5" w:themeTint="99"/>
+          <w:sz w:val="32"/>
+          <w:szCs w:val="32"/>
+        </w:rPr>
+        <w:t xml:space="preserve">    _</w:t>
+      </w:r>
+      <w:proofErr w:type="spellStart"/>
+      <w:proofErr w:type="gramStart"/>
+      <w:r>
+        <w:rPr>
+          <w:b/>
+          <w:bCs/>
+          <w:color w:val="D86DCB" w:themeColor="accent5" w:themeTint="99"/>
+          <w:sz w:val="32"/>
+          <w:szCs w:val="32"/>
+        </w:rPr>
+        <w:t>completer.completeError</w:t>
+      </w:r>
+      <w:proofErr w:type="spellEnd"/>
+      <w:proofErr w:type="gramEnd"/>
+      <w:r>
+        <w:rPr>
+          <w:b/>
+          <w:bCs/>
+          <w:color w:val="D86DCB" w:themeColor="accent5" w:themeTint="99"/>
+          <w:sz w:val="32"/>
+          <w:szCs w:val="32"/>
+        </w:rPr>
+        <w:t xml:space="preserve">('Error'); </w:t>
+      </w:r>
+    </w:p>
+    <w:p>
+      <w:pPr>
+        <w:jc w:val="both"/>
+        <w:rPr>
+          <w:b/>
+          <w:bCs/>
+          <w:color w:val="D86DCB" w:themeColor="accent5" w:themeTint="99"/>
+          <w:sz w:val="32"/>
+          <w:szCs w:val="32"/>
+        </w:rPr>
+      </w:pPr>
+      <w:r>
+        <w:rPr>
+          <w:b/>
+          <w:bCs/>
+          <w:color w:val="D86DCB" w:themeColor="accent5" w:themeTint="99"/>
+          <w:sz w:val="32"/>
+          <w:szCs w:val="32"/>
+        </w:rPr>
+        <w:lastRenderedPageBreak/>
+        <w:t xml:space="preserve">    }</w:t>
+      </w:r>
+    </w:p>
+    <w:p>
+      <w:pPr>
+        <w:jc w:val="both"/>
+        <w:rPr>
+          <w:b/>
+          <w:bCs/>
+          <w:color w:val="D86DCB" w:themeColor="accent5" w:themeTint="99"/>
+          <w:sz w:val="32"/>
+          <w:szCs w:val="32"/>
+        </w:rPr>
+      </w:pPr>
+      <w:r>
+        <w:rPr>
+          <w:b/>
+          <w:bCs/>
+          <w:color w:val="D86DCB" w:themeColor="accent5" w:themeTint="99"/>
+          <w:sz w:val="32"/>
+          <w:szCs w:val="32"/>
+        </w:rPr>
+        <w:t xml:space="preserve">  }</w:t>
+      </w:r>
+    </w:p>
+    <w:p>
+      <w:pPr>
+        <w:jc w:val="both"/>
+        <w:rPr>
+          <w:b/>
+          <w:bCs/>
+          <w:color w:val="D86DCB" w:themeColor="accent5" w:themeTint="99"/>
+          <w:sz w:val="32"/>
+          <w:szCs w:val="32"/>
+        </w:rPr>
+      </w:pPr>
+      <w:r>
+        <w:rPr>
+          <w:b/>
+          <w:bCs/>
+          <w:color w:val="D86DCB" w:themeColor="accent5" w:themeTint="99"/>
+          <w:sz w:val="32"/>
+          <w:szCs w:val="32"/>
+        </w:rPr>
+        <w:t xml:space="preserve">  …</w:t>
+      </w:r>
+    </w:p>
+    <w:p>
+      <w:pPr>
+        <w:jc w:val="both"/>
+        <w:rPr>
+          <w:b/>
+          <w:bCs/>
+          <w:color w:val="D86DCB" w:themeColor="accent5" w:themeTint="99"/>
+          <w:sz w:val="32"/>
+          <w:szCs w:val="32"/>
+        </w:rPr>
+      </w:pPr>
+      <w:r>
+        <w:rPr>
+          <w:b/>
+          <w:bCs/>
+          <w:color w:val="D86DCB" w:themeColor="accent5" w:themeTint="99"/>
+          <w:sz w:val="32"/>
+          <w:szCs w:val="32"/>
+        </w:rPr>
+        <w:t>}</w:t>
       </w:r>
     </w:p>
     <w:p>
@@ -22159,51 +24060,51 @@
           <w:sz w:val="32"/>
           <w:szCs w:val="32"/>
         </w:rPr>
+        <w:t xml:space="preserve">  </w:t>
+      </w:r>
+      <w:proofErr w:type="gramStart"/>
+      <w:r>
+        <w:rPr>
+          <w:b/>
+          <w:bCs/>
+          <w:color w:val="D86DCB" w:themeColor="accent5" w:themeTint="99"/>
+          <w:sz w:val="32"/>
+          <w:szCs w:val="32"/>
+        </w:rPr>
+        <w:t>print(</w:t>
+      </w:r>
+      <w:proofErr w:type="gramEnd"/>
+      <w:r>
+        <w:rPr>
+          <w:b/>
+          <w:bCs/>
+          <w:color w:val="D86DCB" w:themeColor="accent5" w:themeTint="99"/>
+          <w:sz w:val="32"/>
+          <w:szCs w:val="32"/>
+        </w:rPr>
+        <w:t>"Runs after 2 seconds");</w:t>
+      </w:r>
+    </w:p>
+    <w:p>
+      <w:pPr>
+        <w:jc w:val="both"/>
+        <w:rPr>
+          <w:b/>
+          <w:bCs/>
+          <w:color w:val="D86DCB" w:themeColor="accent5" w:themeTint="99"/>
+          <w:sz w:val="32"/>
+          <w:szCs w:val="32"/>
+        </w:rPr>
+      </w:pPr>
+      <w:r>
+        <w:rPr>
+          <w:b/>
+          <w:bCs/>
+          <w:color w:val="D86DCB" w:themeColor="accent5" w:themeTint="99"/>
+          <w:sz w:val="32"/>
+          <w:szCs w:val="32"/>
+        </w:rPr>
         <w:lastRenderedPageBreak/>
-        <w:t xml:space="preserve">  </w:t>
-      </w:r>
-      <w:proofErr w:type="gramStart"/>
-      <w:r>
-        <w:rPr>
-          <w:b/>
-          <w:bCs/>
-          <w:color w:val="D86DCB" w:themeColor="accent5" w:themeTint="99"/>
-          <w:sz w:val="32"/>
-          <w:szCs w:val="32"/>
-        </w:rPr>
-        <w:t>print(</w:t>
-      </w:r>
-      <w:proofErr w:type="gramEnd"/>
-      <w:r>
-        <w:rPr>
-          <w:b/>
-          <w:bCs/>
-          <w:color w:val="D86DCB" w:themeColor="accent5" w:themeTint="99"/>
-          <w:sz w:val="32"/>
-          <w:szCs w:val="32"/>
-        </w:rPr>
-        <w:t>"Runs after 2 seconds");</w:t>
-      </w:r>
-    </w:p>
-    <w:p>
-      <w:pPr>
-        <w:jc w:val="both"/>
-        <w:rPr>
-          <w:b/>
-          <w:bCs/>
-          <w:color w:val="D86DCB" w:themeColor="accent5" w:themeTint="99"/>
-          <w:sz w:val="32"/>
-          <w:szCs w:val="32"/>
-        </w:rPr>
-      </w:pPr>
-      <w:r>
-        <w:rPr>
-          <w:b/>
-          <w:bCs/>
-          <w:color w:val="D86DCB" w:themeColor="accent5" w:themeTint="99"/>
-          <w:sz w:val="32"/>
-          <w:szCs w:val="32"/>
-        </w:rPr>
         <w:t>});</w:t>
       </w:r>
     </w:p>
@@ -22751,27 +24652,27 @@
           <w:sz w:val="32"/>
           <w:szCs w:val="32"/>
         </w:rPr>
+        <w:t># With debounce:</w:t>
+      </w:r>
+    </w:p>
+    <w:p>
+      <w:pPr>
+        <w:jc w:val="both"/>
+        <w:rPr>
+          <w:b/>
+          <w:bCs/>
+          <w:sz w:val="32"/>
+          <w:szCs w:val="32"/>
+        </w:rPr>
+      </w:pPr>
+      <w:r>
+        <w:rPr>
+          <w:b/>
+          <w:bCs/>
+          <w:sz w:val="32"/>
+          <w:szCs w:val="32"/>
+        </w:rPr>
         <w:lastRenderedPageBreak/>
-        <w:t># With debounce:</w:t>
-      </w:r>
-    </w:p>
-    <w:p>
-      <w:pPr>
-        <w:jc w:val="both"/>
-        <w:rPr>
-          <w:b/>
-          <w:bCs/>
-          <w:sz w:val="32"/>
-          <w:szCs w:val="32"/>
-        </w:rPr>
-      </w:pPr>
-      <w:r>
-        <w:rPr>
-          <w:b/>
-          <w:bCs/>
-          <w:sz w:val="32"/>
-          <w:szCs w:val="32"/>
-        </w:rPr>
         <w:t>(wait 500ms)</w:t>
       </w:r>
     </w:p>
@@ -23111,56 +25012,56 @@
           <w:sz w:val="32"/>
           <w:szCs w:val="32"/>
         </w:rPr>
+        <w:t xml:space="preserve"># In </w:t>
+      </w:r>
+      <w:proofErr w:type="gramStart"/>
+      <w:r>
+        <w:rPr>
+          <w:b/>
+          <w:bCs/>
+          <w:sz w:val="32"/>
+          <w:szCs w:val="32"/>
+        </w:rPr>
+        <w:t>Timer(</w:t>
+      </w:r>
+      <w:proofErr w:type="gramEnd"/>
+      <w:r>
+        <w:rPr>
+          <w:b/>
+          <w:bCs/>
+          <w:sz w:val="32"/>
+          <w:szCs w:val="32"/>
+        </w:rPr>
+        <w:t>…)</w:t>
+      </w:r>
+      <w:r>
+        <w:rPr>
+          <w:sz w:val="32"/>
+          <w:szCs w:val="32"/>
+        </w:rPr>
+        <w:t>, the second parameter is a callback method that takes a lambda function and the code written here like database update happens after the delay</w:t>
+      </w:r>
+    </w:p>
+    <w:p>
+      <w:pPr>
+        <w:jc w:val="both"/>
+        <w:rPr>
+          <w:b/>
+          <w:bCs/>
+          <w:color w:val="D86DCB" w:themeColor="accent5" w:themeTint="99"/>
+          <w:sz w:val="32"/>
+          <w:szCs w:val="32"/>
+        </w:rPr>
+      </w:pPr>
+      <w:r>
+        <w:rPr>
+          <w:b/>
+          <w:bCs/>
+          <w:color w:val="D86DCB" w:themeColor="accent5" w:themeTint="99"/>
+          <w:sz w:val="32"/>
+          <w:szCs w:val="32"/>
+        </w:rPr>
         <w:lastRenderedPageBreak/>
-        <w:t xml:space="preserve"># In </w:t>
-      </w:r>
-      <w:proofErr w:type="gramStart"/>
-      <w:r>
-        <w:rPr>
-          <w:b/>
-          <w:bCs/>
-          <w:sz w:val="32"/>
-          <w:szCs w:val="32"/>
-        </w:rPr>
-        <w:t>Timer(</w:t>
-      </w:r>
-      <w:proofErr w:type="gramEnd"/>
-      <w:r>
-        <w:rPr>
-          <w:b/>
-          <w:bCs/>
-          <w:sz w:val="32"/>
-          <w:szCs w:val="32"/>
-        </w:rPr>
-        <w:t>…)</w:t>
-      </w:r>
-      <w:r>
-        <w:rPr>
-          <w:sz w:val="32"/>
-          <w:szCs w:val="32"/>
-        </w:rPr>
-        <w:t>, the second parameter is a callback method that takes a lambda function and the code written here like database update happens after the delay</w:t>
-      </w:r>
-    </w:p>
-    <w:p>
-      <w:pPr>
-        <w:jc w:val="both"/>
-        <w:rPr>
-          <w:b/>
-          <w:bCs/>
-          <w:color w:val="D86DCB" w:themeColor="accent5" w:themeTint="99"/>
-          <w:sz w:val="32"/>
-          <w:szCs w:val="32"/>
-        </w:rPr>
-      </w:pPr>
-      <w:r>
-        <w:rPr>
-          <w:b/>
-          <w:bCs/>
-          <w:color w:val="D86DCB" w:themeColor="accent5" w:themeTint="99"/>
-          <w:sz w:val="32"/>
-          <w:szCs w:val="32"/>
-        </w:rPr>
         <w:t>Timer? _debounce;</w:t>
       </w:r>
     </w:p>
@@ -23764,7 +25665,6 @@
           <w:sz w:val="32"/>
           <w:szCs w:val="32"/>
         </w:rPr>
-        <w:lastRenderedPageBreak/>
         <w:t>When reaches 0 → stop timer</w:t>
       </w:r>
     </w:p>
@@ -23818,6 +25718,7 @@
           <w:sz w:val="32"/>
           <w:szCs w:val="32"/>
         </w:rPr>
+        <w:lastRenderedPageBreak/>
         <w:t># First create an object</w:t>
       </w:r>
       <w:r>
@@ -24549,117 +26450,117 @@
           <w:sz w:val="32"/>
           <w:szCs w:val="32"/>
         </w:rPr>
+        <w:t xml:space="preserve">  int _</w:t>
+      </w:r>
+      <w:proofErr w:type="spellStart"/>
+      <w:r>
+        <w:rPr>
+          <w:b/>
+          <w:bCs/>
+          <w:color w:val="D86DCB" w:themeColor="accent5" w:themeTint="99"/>
+          <w:sz w:val="32"/>
+          <w:szCs w:val="32"/>
+        </w:rPr>
+        <w:t>startTime</w:t>
+      </w:r>
+      <w:proofErr w:type="spellEnd"/>
+      <w:r>
+        <w:rPr>
+          <w:b/>
+          <w:bCs/>
+          <w:color w:val="D86DCB" w:themeColor="accent5" w:themeTint="99"/>
+          <w:sz w:val="32"/>
+          <w:szCs w:val="32"/>
+        </w:rPr>
+        <w:t xml:space="preserve"> = 30;</w:t>
+      </w:r>
+    </w:p>
+    <w:p>
+      <w:pPr>
+        <w:jc w:val="both"/>
+        <w:rPr>
+          <w:b/>
+          <w:bCs/>
+          <w:color w:val="D86DCB" w:themeColor="accent5" w:themeTint="99"/>
+          <w:sz w:val="32"/>
+          <w:szCs w:val="32"/>
+        </w:rPr>
+      </w:pPr>
+      <w:r>
+        <w:rPr>
+          <w:b/>
+          <w:bCs/>
+          <w:color w:val="D86DCB" w:themeColor="accent5" w:themeTint="99"/>
+          <w:sz w:val="32"/>
+          <w:szCs w:val="32"/>
+        </w:rPr>
+        <w:t xml:space="preserve">  int get </w:t>
+      </w:r>
+      <w:proofErr w:type="spellStart"/>
+      <w:r>
+        <w:rPr>
+          <w:b/>
+          <w:bCs/>
+          <w:color w:val="D86DCB" w:themeColor="accent5" w:themeTint="99"/>
+          <w:sz w:val="32"/>
+          <w:szCs w:val="32"/>
+        </w:rPr>
+        <w:t>startTime</w:t>
+      </w:r>
+      <w:proofErr w:type="spellEnd"/>
+      <w:r>
+        <w:rPr>
+          <w:b/>
+          <w:bCs/>
+          <w:color w:val="D86DCB" w:themeColor="accent5" w:themeTint="99"/>
+          <w:sz w:val="32"/>
+          <w:szCs w:val="32"/>
+        </w:rPr>
+        <w:t xml:space="preserve"> =&gt; _</w:t>
+      </w:r>
+      <w:proofErr w:type="spellStart"/>
+      <w:r>
+        <w:rPr>
+          <w:b/>
+          <w:bCs/>
+          <w:color w:val="D86DCB" w:themeColor="accent5" w:themeTint="99"/>
+          <w:sz w:val="32"/>
+          <w:szCs w:val="32"/>
+        </w:rPr>
+        <w:t>startTime</w:t>
+      </w:r>
+      <w:proofErr w:type="spellEnd"/>
+      <w:r>
+        <w:rPr>
+          <w:b/>
+          <w:bCs/>
+          <w:color w:val="D86DCB" w:themeColor="accent5" w:themeTint="99"/>
+          <w:sz w:val="32"/>
+          <w:szCs w:val="32"/>
+        </w:rPr>
+        <w:t>;</w:t>
+      </w:r>
+    </w:p>
+    <w:p>
+      <w:pPr>
+        <w:jc w:val="both"/>
+        <w:rPr>
+          <w:b/>
+          <w:bCs/>
+          <w:color w:val="D86DCB" w:themeColor="accent5" w:themeTint="99"/>
+          <w:sz w:val="32"/>
+          <w:szCs w:val="32"/>
+        </w:rPr>
+      </w:pPr>
+      <w:r>
+        <w:rPr>
+          <w:b/>
+          <w:bCs/>
+          <w:color w:val="D86DCB" w:themeColor="accent5" w:themeTint="99"/>
+          <w:sz w:val="32"/>
+          <w:szCs w:val="32"/>
+        </w:rPr>
         <w:lastRenderedPageBreak/>
-        <w:t xml:space="preserve">  int _</w:t>
-      </w:r>
-      <w:proofErr w:type="spellStart"/>
-      <w:r>
-        <w:rPr>
-          <w:b/>
-          <w:bCs/>
-          <w:color w:val="D86DCB" w:themeColor="accent5" w:themeTint="99"/>
-          <w:sz w:val="32"/>
-          <w:szCs w:val="32"/>
-        </w:rPr>
-        <w:t>startTime</w:t>
-      </w:r>
-      <w:proofErr w:type="spellEnd"/>
-      <w:r>
-        <w:rPr>
-          <w:b/>
-          <w:bCs/>
-          <w:color w:val="D86DCB" w:themeColor="accent5" w:themeTint="99"/>
-          <w:sz w:val="32"/>
-          <w:szCs w:val="32"/>
-        </w:rPr>
-        <w:t xml:space="preserve"> = 30;</w:t>
-      </w:r>
-    </w:p>
-    <w:p>
-      <w:pPr>
-        <w:jc w:val="both"/>
-        <w:rPr>
-          <w:b/>
-          <w:bCs/>
-          <w:color w:val="D86DCB" w:themeColor="accent5" w:themeTint="99"/>
-          <w:sz w:val="32"/>
-          <w:szCs w:val="32"/>
-        </w:rPr>
-      </w:pPr>
-      <w:r>
-        <w:rPr>
-          <w:b/>
-          <w:bCs/>
-          <w:color w:val="D86DCB" w:themeColor="accent5" w:themeTint="99"/>
-          <w:sz w:val="32"/>
-          <w:szCs w:val="32"/>
-        </w:rPr>
-        <w:t xml:space="preserve">  int get </w:t>
-      </w:r>
-      <w:proofErr w:type="spellStart"/>
-      <w:r>
-        <w:rPr>
-          <w:b/>
-          <w:bCs/>
-          <w:color w:val="D86DCB" w:themeColor="accent5" w:themeTint="99"/>
-          <w:sz w:val="32"/>
-          <w:szCs w:val="32"/>
-        </w:rPr>
-        <w:t>startTime</w:t>
-      </w:r>
-      <w:proofErr w:type="spellEnd"/>
-      <w:r>
-        <w:rPr>
-          <w:b/>
-          <w:bCs/>
-          <w:color w:val="D86DCB" w:themeColor="accent5" w:themeTint="99"/>
-          <w:sz w:val="32"/>
-          <w:szCs w:val="32"/>
-        </w:rPr>
-        <w:t xml:space="preserve"> =&gt; _</w:t>
-      </w:r>
-      <w:proofErr w:type="spellStart"/>
-      <w:r>
-        <w:rPr>
-          <w:b/>
-          <w:bCs/>
-          <w:color w:val="D86DCB" w:themeColor="accent5" w:themeTint="99"/>
-          <w:sz w:val="32"/>
-          <w:szCs w:val="32"/>
-        </w:rPr>
-        <w:t>startTime</w:t>
-      </w:r>
-      <w:proofErr w:type="spellEnd"/>
-      <w:r>
-        <w:rPr>
-          <w:b/>
-          <w:bCs/>
-          <w:color w:val="D86DCB" w:themeColor="accent5" w:themeTint="99"/>
-          <w:sz w:val="32"/>
-          <w:szCs w:val="32"/>
-        </w:rPr>
-        <w:t>;</w:t>
-      </w:r>
-    </w:p>
-    <w:p>
-      <w:pPr>
-        <w:jc w:val="both"/>
-        <w:rPr>
-          <w:b/>
-          <w:bCs/>
-          <w:color w:val="D86DCB" w:themeColor="accent5" w:themeTint="99"/>
-          <w:sz w:val="32"/>
-          <w:szCs w:val="32"/>
-        </w:rPr>
-      </w:pPr>
-      <w:r>
-        <w:rPr>
-          <w:b/>
-          <w:bCs/>
-          <w:color w:val="D86DCB" w:themeColor="accent5" w:themeTint="99"/>
-          <w:sz w:val="32"/>
-          <w:szCs w:val="32"/>
-        </w:rPr>
         <w:t xml:space="preserve">  late Timer _</w:t>
       </w:r>
       <w:proofErr w:type="spellStart"/>
@@ -25478,95 +27379,95 @@
           <w:sz w:val="32"/>
           <w:szCs w:val="32"/>
         </w:rPr>
+        <w:t xml:space="preserve">  void </w:t>
+      </w:r>
+      <w:proofErr w:type="gramStart"/>
+      <w:r>
+        <w:rPr>
+          <w:b/>
+          <w:bCs/>
+          <w:color w:val="D86DCB" w:themeColor="accent5" w:themeTint="99"/>
+          <w:sz w:val="32"/>
+          <w:szCs w:val="32"/>
+        </w:rPr>
+        <w:t>dispose(</w:t>
+      </w:r>
+      <w:proofErr w:type="gramEnd"/>
+      <w:r>
+        <w:rPr>
+          <w:b/>
+          <w:bCs/>
+          <w:color w:val="D86DCB" w:themeColor="accent5" w:themeTint="99"/>
+          <w:sz w:val="32"/>
+          <w:szCs w:val="32"/>
+        </w:rPr>
+        <w:t>) {</w:t>
+      </w:r>
+    </w:p>
+    <w:p>
+      <w:pPr>
+        <w:jc w:val="both"/>
+        <w:rPr>
+          <w:b/>
+          <w:bCs/>
+          <w:color w:val="D86DCB" w:themeColor="accent5" w:themeTint="99"/>
+          <w:sz w:val="32"/>
+          <w:szCs w:val="32"/>
+        </w:rPr>
+      </w:pPr>
+      <w:r>
+        <w:rPr>
+          <w:b/>
+          <w:bCs/>
+          <w:color w:val="D86DCB" w:themeColor="accent5" w:themeTint="99"/>
+          <w:sz w:val="32"/>
+          <w:szCs w:val="32"/>
+        </w:rPr>
+        <w:t xml:space="preserve">    _</w:t>
+      </w:r>
+      <w:proofErr w:type="spellStart"/>
+      <w:r>
+        <w:rPr>
+          <w:b/>
+          <w:bCs/>
+          <w:color w:val="D86DCB" w:themeColor="accent5" w:themeTint="99"/>
+          <w:sz w:val="32"/>
+          <w:szCs w:val="32"/>
+        </w:rPr>
+        <w:t>resendOTPTimer.cancel</w:t>
+      </w:r>
+      <w:proofErr w:type="spellEnd"/>
+      <w:r>
+        <w:rPr>
+          <w:b/>
+          <w:bCs/>
+          <w:color w:val="D86DCB" w:themeColor="accent5" w:themeTint="99"/>
+          <w:sz w:val="32"/>
+          <w:szCs w:val="32"/>
+        </w:rPr>
+        <w:t>();</w:t>
+      </w:r>
+    </w:p>
+    <w:p>
+      <w:pPr>
+        <w:jc w:val="both"/>
+        <w:rPr>
+          <w:b/>
+          <w:bCs/>
+          <w:color w:val="D86DCB" w:themeColor="accent5" w:themeTint="99"/>
+          <w:sz w:val="32"/>
+          <w:szCs w:val="32"/>
+        </w:rPr>
+      </w:pPr>
+      <w:r>
+        <w:rPr>
+          <w:b/>
+          <w:bCs/>
+          <w:color w:val="D86DCB" w:themeColor="accent5" w:themeTint="99"/>
+          <w:sz w:val="32"/>
+          <w:szCs w:val="32"/>
+        </w:rPr>
         <w:lastRenderedPageBreak/>
-        <w:t xml:space="preserve">  void </w:t>
-      </w:r>
-      <w:proofErr w:type="gramStart"/>
-      <w:r>
-        <w:rPr>
-          <w:b/>
-          <w:bCs/>
-          <w:color w:val="D86DCB" w:themeColor="accent5" w:themeTint="99"/>
-          <w:sz w:val="32"/>
-          <w:szCs w:val="32"/>
-        </w:rPr>
-        <w:t>dispose(</w:t>
-      </w:r>
-      <w:proofErr w:type="gramEnd"/>
-      <w:r>
-        <w:rPr>
-          <w:b/>
-          <w:bCs/>
-          <w:color w:val="D86DCB" w:themeColor="accent5" w:themeTint="99"/>
-          <w:sz w:val="32"/>
-          <w:szCs w:val="32"/>
-        </w:rPr>
-        <w:t>) {</w:t>
-      </w:r>
-    </w:p>
-    <w:p>
-      <w:pPr>
-        <w:jc w:val="both"/>
-        <w:rPr>
-          <w:b/>
-          <w:bCs/>
-          <w:color w:val="D86DCB" w:themeColor="accent5" w:themeTint="99"/>
-          <w:sz w:val="32"/>
-          <w:szCs w:val="32"/>
-        </w:rPr>
-      </w:pPr>
-      <w:r>
-        <w:rPr>
-          <w:b/>
-          <w:bCs/>
-          <w:color w:val="D86DCB" w:themeColor="accent5" w:themeTint="99"/>
-          <w:sz w:val="32"/>
-          <w:szCs w:val="32"/>
-        </w:rPr>
-        <w:t xml:space="preserve">    _</w:t>
-      </w:r>
-      <w:proofErr w:type="spellStart"/>
-      <w:r>
-        <w:rPr>
-          <w:b/>
-          <w:bCs/>
-          <w:color w:val="D86DCB" w:themeColor="accent5" w:themeTint="99"/>
-          <w:sz w:val="32"/>
-          <w:szCs w:val="32"/>
-        </w:rPr>
-        <w:t>resendOTPTimer.cancel</w:t>
-      </w:r>
-      <w:proofErr w:type="spellEnd"/>
-      <w:r>
-        <w:rPr>
-          <w:b/>
-          <w:bCs/>
-          <w:color w:val="D86DCB" w:themeColor="accent5" w:themeTint="99"/>
-          <w:sz w:val="32"/>
-          <w:szCs w:val="32"/>
-        </w:rPr>
-        <w:t>();</w:t>
-      </w:r>
-    </w:p>
-    <w:p>
-      <w:pPr>
-        <w:jc w:val="both"/>
-        <w:rPr>
-          <w:b/>
-          <w:bCs/>
-          <w:color w:val="D86DCB" w:themeColor="accent5" w:themeTint="99"/>
-          <w:sz w:val="32"/>
-          <w:szCs w:val="32"/>
-        </w:rPr>
-      </w:pPr>
-      <w:r>
-        <w:rPr>
-          <w:b/>
-          <w:bCs/>
-          <w:color w:val="D86DCB" w:themeColor="accent5" w:themeTint="99"/>
-          <w:sz w:val="32"/>
-          <w:szCs w:val="32"/>
-        </w:rPr>
         <w:t xml:space="preserve">    </w:t>
       </w:r>
       <w:proofErr w:type="spellStart"/>
@@ -25999,7 +27900,6 @@
           <w:sz w:val="32"/>
           <w:szCs w:val="32"/>
         </w:rPr>
-        <w:lastRenderedPageBreak/>
         <w:t xml:space="preserve">  </w:t>
       </w:r>
       <w:proofErr w:type="spellStart"/>
@@ -26134,6 +28034,7 @@
           <w:sz w:val="32"/>
           <w:szCs w:val="32"/>
         </w:rPr>
+        <w:lastRenderedPageBreak/>
         <w:t xml:space="preserve">    _</w:t>
       </w:r>
       <w:proofErr w:type="spellStart"/>
@@ -26875,7 +28776,6 @@
           <w:sz w:val="32"/>
           <w:szCs w:val="32"/>
         </w:rPr>
-        <w:lastRenderedPageBreak/>
         <w:t>Riverpod</w:t>
       </w:r>
       <w:proofErr w:type="spellEnd"/>
@@ -26924,6 +28824,7 @@
           <w:sz w:val="32"/>
           <w:szCs w:val="32"/>
         </w:rPr>
+        <w:lastRenderedPageBreak/>
         <w:t>RxDart</w:t>
       </w:r>
       <w:proofErr w:type="spellEnd"/>
@@ -27766,95 +29667,95 @@
           <w:sz w:val="32"/>
           <w:szCs w:val="32"/>
         </w:rPr>
+        <w:t xml:space="preserve">  const </w:t>
+      </w:r>
+      <w:proofErr w:type="spellStart"/>
+      <w:r>
+        <w:rPr>
+          <w:b/>
+          <w:bCs/>
+          <w:color w:val="D86DCB" w:themeColor="accent5" w:themeTint="99"/>
+          <w:sz w:val="32"/>
+          <w:szCs w:val="32"/>
+        </w:rPr>
+        <w:t>SearchScreen</w:t>
+      </w:r>
+      <w:proofErr w:type="spellEnd"/>
+      <w:r>
+        <w:rPr>
+          <w:b/>
+          <w:bCs/>
+          <w:color w:val="D86DCB" w:themeColor="accent5" w:themeTint="99"/>
+          <w:sz w:val="32"/>
+          <w:szCs w:val="32"/>
+        </w:rPr>
+        <w:t>({</w:t>
+      </w:r>
+      <w:proofErr w:type="spellStart"/>
+      <w:r>
+        <w:rPr>
+          <w:b/>
+          <w:bCs/>
+          <w:color w:val="D86DCB" w:themeColor="accent5" w:themeTint="99"/>
+          <w:sz w:val="32"/>
+          <w:szCs w:val="32"/>
+        </w:rPr>
+        <w:t>super.key</w:t>
+      </w:r>
+      <w:proofErr w:type="spellEnd"/>
+      <w:r>
+        <w:rPr>
+          <w:b/>
+          <w:bCs/>
+          <w:color w:val="D86DCB" w:themeColor="accent5" w:themeTint="99"/>
+          <w:sz w:val="32"/>
+          <w:szCs w:val="32"/>
+        </w:rPr>
+        <w:t>});</w:t>
+      </w:r>
+    </w:p>
+    <w:p>
+      <w:pPr>
+        <w:jc w:val="both"/>
+        <w:rPr>
+          <w:b/>
+          <w:bCs/>
+          <w:color w:val="D86DCB" w:themeColor="accent5" w:themeTint="99"/>
+          <w:sz w:val="32"/>
+          <w:szCs w:val="32"/>
+        </w:rPr>
+      </w:pPr>
+      <w:r>
+        <w:rPr>
+          <w:b/>
+          <w:bCs/>
+          <w:color w:val="D86DCB" w:themeColor="accent5" w:themeTint="99"/>
+          <w:sz w:val="32"/>
+          <w:szCs w:val="32"/>
+        </w:rPr>
+        <w:t xml:space="preserve">  @override</w:t>
+      </w:r>
+    </w:p>
+    <w:p>
+      <w:pPr>
+        <w:jc w:val="both"/>
+        <w:rPr>
+          <w:b/>
+          <w:bCs/>
+          <w:color w:val="D86DCB" w:themeColor="accent5" w:themeTint="99"/>
+          <w:sz w:val="32"/>
+          <w:szCs w:val="32"/>
+        </w:rPr>
+      </w:pPr>
+      <w:r>
+        <w:rPr>
+          <w:b/>
+          <w:bCs/>
+          <w:color w:val="D86DCB" w:themeColor="accent5" w:themeTint="99"/>
+          <w:sz w:val="32"/>
+          <w:szCs w:val="32"/>
+        </w:rPr>
         <w:lastRenderedPageBreak/>
-        <w:t xml:space="preserve">  const </w:t>
-      </w:r>
-      <w:proofErr w:type="spellStart"/>
-      <w:r>
-        <w:rPr>
-          <w:b/>
-          <w:bCs/>
-          <w:color w:val="D86DCB" w:themeColor="accent5" w:themeTint="99"/>
-          <w:sz w:val="32"/>
-          <w:szCs w:val="32"/>
-        </w:rPr>
-        <w:t>SearchScreen</w:t>
-      </w:r>
-      <w:proofErr w:type="spellEnd"/>
-      <w:r>
-        <w:rPr>
-          <w:b/>
-          <w:bCs/>
-          <w:color w:val="D86DCB" w:themeColor="accent5" w:themeTint="99"/>
-          <w:sz w:val="32"/>
-          <w:szCs w:val="32"/>
-        </w:rPr>
-        <w:t>({</w:t>
-      </w:r>
-      <w:proofErr w:type="spellStart"/>
-      <w:r>
-        <w:rPr>
-          <w:b/>
-          <w:bCs/>
-          <w:color w:val="D86DCB" w:themeColor="accent5" w:themeTint="99"/>
-          <w:sz w:val="32"/>
-          <w:szCs w:val="32"/>
-        </w:rPr>
-        <w:t>super.key</w:t>
-      </w:r>
-      <w:proofErr w:type="spellEnd"/>
-      <w:r>
-        <w:rPr>
-          <w:b/>
-          <w:bCs/>
-          <w:color w:val="D86DCB" w:themeColor="accent5" w:themeTint="99"/>
-          <w:sz w:val="32"/>
-          <w:szCs w:val="32"/>
-        </w:rPr>
-        <w:t>});</w:t>
-      </w:r>
-    </w:p>
-    <w:p>
-      <w:pPr>
-        <w:jc w:val="both"/>
-        <w:rPr>
-          <w:b/>
-          <w:bCs/>
-          <w:color w:val="D86DCB" w:themeColor="accent5" w:themeTint="99"/>
-          <w:sz w:val="32"/>
-          <w:szCs w:val="32"/>
-        </w:rPr>
-      </w:pPr>
-      <w:r>
-        <w:rPr>
-          <w:b/>
-          <w:bCs/>
-          <w:color w:val="D86DCB" w:themeColor="accent5" w:themeTint="99"/>
-          <w:sz w:val="32"/>
-          <w:szCs w:val="32"/>
-        </w:rPr>
-        <w:t xml:space="preserve">  @override</w:t>
-      </w:r>
-    </w:p>
-    <w:p>
-      <w:pPr>
-        <w:jc w:val="both"/>
-        <w:rPr>
-          <w:b/>
-          <w:bCs/>
-          <w:color w:val="D86DCB" w:themeColor="accent5" w:themeTint="99"/>
-          <w:sz w:val="32"/>
-          <w:szCs w:val="32"/>
-        </w:rPr>
-      </w:pPr>
-      <w:r>
-        <w:rPr>
-          <w:b/>
-          <w:bCs/>
-          <w:color w:val="D86DCB" w:themeColor="accent5" w:themeTint="99"/>
-          <w:sz w:val="32"/>
-          <w:szCs w:val="32"/>
-        </w:rPr>
         <w:t xml:space="preserve">  Widget </w:t>
       </w:r>
       <w:proofErr w:type="gramStart"/>
@@ -28773,95 +30674,95 @@
           <w:sz w:val="32"/>
           <w:szCs w:val="32"/>
         </w:rPr>
+        <w:t xml:space="preserve">                  const </w:t>
+      </w:r>
+      <w:proofErr w:type="gramStart"/>
+      <w:r>
+        <w:rPr>
+          <w:b/>
+          <w:bCs/>
+          <w:color w:val="D86DCB" w:themeColor="accent5" w:themeTint="99"/>
+          <w:sz w:val="32"/>
+          <w:szCs w:val="32"/>
+        </w:rPr>
+        <w:t>Center(</w:t>
+      </w:r>
+      <w:proofErr w:type="gramEnd"/>
+      <w:r>
+        <w:rPr>
+          <w:b/>
+          <w:bCs/>
+          <w:color w:val="D86DCB" w:themeColor="accent5" w:themeTint="99"/>
+          <w:sz w:val="32"/>
+          <w:szCs w:val="32"/>
+        </w:rPr>
+        <w:t xml:space="preserve">child: </w:t>
+      </w:r>
+      <w:proofErr w:type="spellStart"/>
+      <w:r>
+        <w:rPr>
+          <w:b/>
+          <w:bCs/>
+          <w:color w:val="D86DCB" w:themeColor="accent5" w:themeTint="99"/>
+          <w:sz w:val="32"/>
+          <w:szCs w:val="32"/>
+        </w:rPr>
+        <w:t>CircularProgressIndicator</w:t>
+      </w:r>
+      <w:proofErr w:type="spellEnd"/>
+      <w:r>
+        <w:rPr>
+          <w:b/>
+          <w:bCs/>
+          <w:color w:val="D86DCB" w:themeColor="accent5" w:themeTint="99"/>
+          <w:sz w:val="32"/>
+          <w:szCs w:val="32"/>
+        </w:rPr>
+        <w:t>()),</w:t>
+      </w:r>
+    </w:p>
+    <w:p>
+      <w:pPr>
+        <w:jc w:val="both"/>
+        <w:rPr>
+          <w:b/>
+          <w:bCs/>
+          <w:color w:val="D86DCB" w:themeColor="accent5" w:themeTint="99"/>
+          <w:sz w:val="32"/>
+          <w:szCs w:val="32"/>
+        </w:rPr>
+      </w:pPr>
+      <w:r>
+        <w:rPr>
+          <w:b/>
+          <w:bCs/>
+          <w:color w:val="D86DCB" w:themeColor="accent5" w:themeTint="99"/>
+          <w:sz w:val="32"/>
+          <w:szCs w:val="32"/>
+        </w:rPr>
+        <w:t xml:space="preserve">              error: (e, _) =&gt;</w:t>
+      </w:r>
+    </w:p>
+    <w:p>
+      <w:pPr>
+        <w:jc w:val="both"/>
+        <w:rPr>
+          <w:b/>
+          <w:bCs/>
+          <w:color w:val="D86DCB" w:themeColor="accent5" w:themeTint="99"/>
+          <w:sz w:val="32"/>
+          <w:szCs w:val="32"/>
+        </w:rPr>
+      </w:pPr>
+      <w:r>
+        <w:rPr>
+          <w:b/>
+          <w:bCs/>
+          <w:color w:val="D86DCB" w:themeColor="accent5" w:themeTint="99"/>
+          <w:sz w:val="32"/>
+          <w:szCs w:val="32"/>
+        </w:rPr>
         <w:lastRenderedPageBreak/>
-        <w:t xml:space="preserve">                  const </w:t>
-      </w:r>
-      <w:proofErr w:type="gramStart"/>
-      <w:r>
-        <w:rPr>
-          <w:b/>
-          <w:bCs/>
-          <w:color w:val="D86DCB" w:themeColor="accent5" w:themeTint="99"/>
-          <w:sz w:val="32"/>
-          <w:szCs w:val="32"/>
-        </w:rPr>
-        <w:t>Center(</w:t>
-      </w:r>
-      <w:proofErr w:type="gramEnd"/>
-      <w:r>
-        <w:rPr>
-          <w:b/>
-          <w:bCs/>
-          <w:color w:val="D86DCB" w:themeColor="accent5" w:themeTint="99"/>
-          <w:sz w:val="32"/>
-          <w:szCs w:val="32"/>
-        </w:rPr>
-        <w:t xml:space="preserve">child: </w:t>
-      </w:r>
-      <w:proofErr w:type="spellStart"/>
-      <w:r>
-        <w:rPr>
-          <w:b/>
-          <w:bCs/>
-          <w:color w:val="D86DCB" w:themeColor="accent5" w:themeTint="99"/>
-          <w:sz w:val="32"/>
-          <w:szCs w:val="32"/>
-        </w:rPr>
-        <w:t>CircularProgressIndicator</w:t>
-      </w:r>
-      <w:proofErr w:type="spellEnd"/>
-      <w:r>
-        <w:rPr>
-          <w:b/>
-          <w:bCs/>
-          <w:color w:val="D86DCB" w:themeColor="accent5" w:themeTint="99"/>
-          <w:sz w:val="32"/>
-          <w:szCs w:val="32"/>
-        </w:rPr>
-        <w:t>()),</w:t>
-      </w:r>
-    </w:p>
-    <w:p>
-      <w:pPr>
-        <w:jc w:val="both"/>
-        <w:rPr>
-          <w:b/>
-          <w:bCs/>
-          <w:color w:val="D86DCB" w:themeColor="accent5" w:themeTint="99"/>
-          <w:sz w:val="32"/>
-          <w:szCs w:val="32"/>
-        </w:rPr>
-      </w:pPr>
-      <w:r>
-        <w:rPr>
-          <w:b/>
-          <w:bCs/>
-          <w:color w:val="D86DCB" w:themeColor="accent5" w:themeTint="99"/>
-          <w:sz w:val="32"/>
-          <w:szCs w:val="32"/>
-        </w:rPr>
-        <w:t xml:space="preserve">              error: (e, _) =&gt;</w:t>
-      </w:r>
-    </w:p>
-    <w:p>
-      <w:pPr>
-        <w:jc w:val="both"/>
-        <w:rPr>
-          <w:b/>
-          <w:bCs/>
-          <w:color w:val="D86DCB" w:themeColor="accent5" w:themeTint="99"/>
-          <w:sz w:val="32"/>
-          <w:szCs w:val="32"/>
-        </w:rPr>
-      </w:pPr>
-      <w:r>
-        <w:rPr>
-          <w:b/>
-          <w:bCs/>
-          <w:color w:val="D86DCB" w:themeColor="accent5" w:themeTint="99"/>
-          <w:sz w:val="32"/>
-          <w:szCs w:val="32"/>
-        </w:rPr>
         <w:t xml:space="preserve">                  </w:t>
       </w:r>
       <w:proofErr w:type="gramStart"/>
@@ -29469,7 +31370,6 @@
           <w:sz w:val="32"/>
           <w:szCs w:val="32"/>
         </w:rPr>
-        <w:lastRenderedPageBreak/>
         <w:t xml:space="preserve"># This is production level debounce. </w:t>
       </w:r>
       <w:proofErr w:type="spellStart"/>
@@ -31091,7 +32991,6 @@
           <w:sz w:val="28"/>
           <w:szCs w:val="28"/>
         </w:rPr>
-        <w:lastRenderedPageBreak/>
         <w:t xml:space="preserve">│       </w:t>
       </w:r>
       <w:r>
@@ -31171,6 +33070,7 @@
           <w:sz w:val="28"/>
           <w:szCs w:val="28"/>
         </w:rPr>
+        <w:lastRenderedPageBreak/>
         <w:t>├</w:t>
       </w:r>
       <w:r>
@@ -31948,94 +33848,94 @@
           <w:sz w:val="32"/>
           <w:szCs w:val="32"/>
         </w:rPr>
+        <w:t xml:space="preserve"># The </w:t>
+      </w:r>
+      <w:r>
+        <w:rPr>
+          <w:b/>
+          <w:bCs/>
+          <w:sz w:val="32"/>
+          <w:szCs w:val="32"/>
+        </w:rPr>
+        <w:t xml:space="preserve">Event </w:t>
+      </w:r>
+      <w:r>
+        <w:rPr>
+          <w:b/>
+          <w:bCs/>
+          <w:sz w:val="32"/>
+          <w:szCs w:val="32"/>
+        </w:rPr>
+        <w:t>L</w:t>
+      </w:r>
+      <w:r>
+        <w:rPr>
+          <w:b/>
+          <w:bCs/>
+          <w:sz w:val="32"/>
+          <w:szCs w:val="32"/>
+        </w:rPr>
+        <w:t>oop</w:t>
+      </w:r>
+      <w:r>
+        <w:rPr>
+          <w:sz w:val="32"/>
+          <w:szCs w:val="32"/>
+        </w:rPr>
+        <w:t xml:space="preserve"> takes the continuation </w:t>
+      </w:r>
+      <w:r>
+        <w:rPr>
+          <w:sz w:val="32"/>
+          <w:szCs w:val="32"/>
+        </w:rPr>
+        <w:t>C</w:t>
+      </w:r>
+      <w:r>
+        <w:rPr>
+          <w:sz w:val="32"/>
+          <w:szCs w:val="32"/>
+        </w:rPr>
+        <w:t>allback results from a queue (</w:t>
+      </w:r>
+      <w:r>
+        <w:rPr>
+          <w:sz w:val="32"/>
+          <w:szCs w:val="32"/>
+        </w:rPr>
+        <w:t>line</w:t>
+      </w:r>
+      <w:r>
+        <w:rPr>
+          <w:sz w:val="32"/>
+          <w:szCs w:val="32"/>
+        </w:rPr>
+        <w:t>) so the first completed result gets executed first</w:t>
+      </w:r>
+      <w:r>
+        <w:rPr>
+          <w:sz w:val="32"/>
+          <w:szCs w:val="32"/>
+        </w:rPr>
+        <w:t>.</w:t>
+      </w:r>
+    </w:p>
+    <w:p>
+      <w:pPr>
+        <w:jc w:val="both"/>
+        <w:rPr>
+          <w:sz w:val="32"/>
+          <w:szCs w:val="32"/>
+        </w:rPr>
+      </w:pPr>
+      <w:r>
+        <w:rPr>
+          <w:b/>
+          <w:bCs/>
+          <w:sz w:val="32"/>
+          <w:szCs w:val="32"/>
+        </w:rPr>
         <w:lastRenderedPageBreak/>
-        <w:t xml:space="preserve"># The </w:t>
-      </w:r>
-      <w:r>
-        <w:rPr>
-          <w:b/>
-          <w:bCs/>
-          <w:sz w:val="32"/>
-          <w:szCs w:val="32"/>
-        </w:rPr>
-        <w:t xml:space="preserve">Event </w:t>
-      </w:r>
-      <w:r>
-        <w:rPr>
-          <w:b/>
-          <w:bCs/>
-          <w:sz w:val="32"/>
-          <w:szCs w:val="32"/>
-        </w:rPr>
-        <w:t>L</w:t>
-      </w:r>
-      <w:r>
-        <w:rPr>
-          <w:b/>
-          <w:bCs/>
-          <w:sz w:val="32"/>
-          <w:szCs w:val="32"/>
-        </w:rPr>
-        <w:t>oop</w:t>
-      </w:r>
-      <w:r>
-        <w:rPr>
-          <w:sz w:val="32"/>
-          <w:szCs w:val="32"/>
-        </w:rPr>
-        <w:t xml:space="preserve"> takes the continuation </w:t>
-      </w:r>
-      <w:r>
-        <w:rPr>
-          <w:sz w:val="32"/>
-          <w:szCs w:val="32"/>
-        </w:rPr>
-        <w:t>C</w:t>
-      </w:r>
-      <w:r>
-        <w:rPr>
-          <w:sz w:val="32"/>
-          <w:szCs w:val="32"/>
-        </w:rPr>
-        <w:t>allback results from a queue (</w:t>
-      </w:r>
-      <w:r>
-        <w:rPr>
-          <w:sz w:val="32"/>
-          <w:szCs w:val="32"/>
-        </w:rPr>
-        <w:t>line</w:t>
-      </w:r>
-      <w:r>
-        <w:rPr>
-          <w:sz w:val="32"/>
-          <w:szCs w:val="32"/>
-        </w:rPr>
-        <w:t>) so the first completed result gets executed first</w:t>
-      </w:r>
-      <w:r>
-        <w:rPr>
-          <w:sz w:val="32"/>
-          <w:szCs w:val="32"/>
-        </w:rPr>
-        <w:t>.</w:t>
-      </w:r>
-    </w:p>
-    <w:p>
-      <w:pPr>
-        <w:jc w:val="both"/>
-        <w:rPr>
-          <w:sz w:val="32"/>
-          <w:szCs w:val="32"/>
-        </w:rPr>
-      </w:pPr>
-      <w:r>
-        <w:rPr>
-          <w:b/>
-          <w:bCs/>
-          <w:sz w:val="32"/>
-          <w:szCs w:val="32"/>
-        </w:rPr>
         <w:t>NOTE:</w:t>
       </w:r>
       <w:r>
@@ -42473,9 +44373,9 @@
     </w:lvl>
   </w:abstractNum>
   <w:abstractNum w:abstractNumId="11" w15:restartNumberingAfterBreak="0">
-    <w:nsid w:val="26D87776"/>
+    <w:nsid w:val="24D36514"/>
     <w:multiLevelType w:val="hybridMultilevel"/>
-    <w:tmpl w:val="7250E00E"/>
+    <w:tmpl w:val="46685C76"/>
     <w:lvl w:ilvl="0" w:tplc="04090001">
       <w:start w:val="1"/>
       <w:numFmt w:val="bullet"/>
@@ -42586,16 +44486,16 @@
     </w:lvl>
   </w:abstractNum>
   <w:abstractNum w:abstractNumId="12" w15:restartNumberingAfterBreak="0">
-    <w:nsid w:val="27092EDA"/>
+    <w:nsid w:val="26D87776"/>
     <w:multiLevelType w:val="hybridMultilevel"/>
-    <w:tmpl w:val="1C462C4A"/>
+    <w:tmpl w:val="7250E00E"/>
     <w:lvl w:ilvl="0" w:tplc="04090001">
       <w:start w:val="1"/>
       <w:numFmt w:val="bullet"/>
       <w:lvlText w:val=""/>
       <w:lvlJc w:val="left"/>
       <w:pPr>
-        <w:ind w:left="630" w:hanging="360"/>
+        <w:ind w:left="360" w:hanging="360"/>
       </w:pPr>
       <w:rPr>
         <w:rFonts w:ascii="Symbol" w:hAnsi="Symbol" w:hint="default"/>
@@ -42607,7 +44507,7 @@
       <w:lvlText w:val="o"/>
       <w:lvlJc w:val="left"/>
       <w:pPr>
-        <w:ind w:left="1350" w:hanging="360"/>
+        <w:ind w:left="1080" w:hanging="360"/>
       </w:pPr>
       <w:rPr>
         <w:rFonts w:ascii="Courier New" w:hAnsi="Courier New" w:cs="Courier New" w:hint="default"/>
@@ -42619,7 +44519,7 @@
       <w:lvlText w:val=""/>
       <w:lvlJc w:val="left"/>
       <w:pPr>
-        <w:ind w:left="2070" w:hanging="360"/>
+        <w:ind w:left="1800" w:hanging="360"/>
       </w:pPr>
       <w:rPr>
         <w:rFonts w:ascii="Wingdings" w:hAnsi="Wingdings" w:hint="default"/>
@@ -42631,7 +44531,7 @@
       <w:lvlText w:val=""/>
       <w:lvlJc w:val="left"/>
       <w:pPr>
-        <w:ind w:left="2790" w:hanging="360"/>
+        <w:ind w:left="2520" w:hanging="360"/>
       </w:pPr>
       <w:rPr>
         <w:rFonts w:ascii="Symbol" w:hAnsi="Symbol" w:hint="default"/>
@@ -42643,7 +44543,7 @@
       <w:lvlText w:val="o"/>
       <w:lvlJc w:val="left"/>
       <w:pPr>
-        <w:ind w:left="3510" w:hanging="360"/>
+        <w:ind w:left="3240" w:hanging="360"/>
       </w:pPr>
       <w:rPr>
         <w:rFonts w:ascii="Courier New" w:hAnsi="Courier New" w:cs="Courier New" w:hint="default"/>
@@ -42655,7 +44555,7 @@
       <w:lvlText w:val=""/>
       <w:lvlJc w:val="left"/>
       <w:pPr>
-        <w:ind w:left="4230" w:hanging="360"/>
+        <w:ind w:left="3960" w:hanging="360"/>
       </w:pPr>
       <w:rPr>
         <w:rFonts w:ascii="Wingdings" w:hAnsi="Wingdings" w:hint="default"/>
@@ -42667,7 +44567,7 @@
       <w:lvlText w:val=""/>
       <w:lvlJc w:val="left"/>
       <w:pPr>
-        <w:ind w:left="4950" w:hanging="360"/>
+        <w:ind w:left="4680" w:hanging="360"/>
       </w:pPr>
       <w:rPr>
         <w:rFonts w:ascii="Symbol" w:hAnsi="Symbol" w:hint="default"/>
@@ -42679,7 +44579,7 @@
       <w:lvlText w:val="o"/>
       <w:lvlJc w:val="left"/>
       <w:pPr>
-        <w:ind w:left="5670" w:hanging="360"/>
+        <w:ind w:left="5400" w:hanging="360"/>
       </w:pPr>
       <w:rPr>
         <w:rFonts w:ascii="Courier New" w:hAnsi="Courier New" w:cs="Courier New" w:hint="default"/>
@@ -42691,7 +44591,7 @@
       <w:lvlText w:val=""/>
       <w:lvlJc w:val="left"/>
       <w:pPr>
-        <w:ind w:left="6390" w:hanging="360"/>
+        <w:ind w:left="6120" w:hanging="360"/>
       </w:pPr>
       <w:rPr>
         <w:rFonts w:ascii="Wingdings" w:hAnsi="Wingdings" w:hint="default"/>
@@ -42699,16 +44599,16 @@
     </w:lvl>
   </w:abstractNum>
   <w:abstractNum w:abstractNumId="13" w15:restartNumberingAfterBreak="0">
-    <w:nsid w:val="27FD427A"/>
+    <w:nsid w:val="27092EDA"/>
     <w:multiLevelType w:val="hybridMultilevel"/>
-    <w:tmpl w:val="28AA6B6E"/>
+    <w:tmpl w:val="1C462C4A"/>
     <w:lvl w:ilvl="0" w:tplc="04090001">
       <w:start w:val="1"/>
       <w:numFmt w:val="bullet"/>
       <w:lvlText w:val=""/>
       <w:lvlJc w:val="left"/>
       <w:pPr>
-        <w:ind w:left="360" w:hanging="360"/>
+        <w:ind w:left="630" w:hanging="360"/>
       </w:pPr>
       <w:rPr>
         <w:rFonts w:ascii="Symbol" w:hAnsi="Symbol" w:hint="default"/>
@@ -42720,7 +44620,7 @@
       <w:lvlText w:val="o"/>
       <w:lvlJc w:val="left"/>
       <w:pPr>
-        <w:ind w:left="1080" w:hanging="360"/>
+        <w:ind w:left="1350" w:hanging="360"/>
       </w:pPr>
       <w:rPr>
         <w:rFonts w:ascii="Courier New" w:hAnsi="Courier New" w:cs="Courier New" w:hint="default"/>
@@ -42732,7 +44632,7 @@
       <w:lvlText w:val=""/>
       <w:lvlJc w:val="left"/>
       <w:pPr>
-        <w:ind w:left="1800" w:hanging="360"/>
+        <w:ind w:left="2070" w:hanging="360"/>
       </w:pPr>
       <w:rPr>
         <w:rFonts w:ascii="Wingdings" w:hAnsi="Wingdings" w:hint="default"/>
@@ -42744,7 +44644,7 @@
       <w:lvlText w:val=""/>
       <w:lvlJc w:val="left"/>
       <w:pPr>
-        <w:ind w:left="2520" w:hanging="360"/>
+        <w:ind w:left="2790" w:hanging="360"/>
       </w:pPr>
       <w:rPr>
         <w:rFonts w:ascii="Symbol" w:hAnsi="Symbol" w:hint="default"/>
@@ -42756,7 +44656,7 @@
       <w:lvlText w:val="o"/>
       <w:lvlJc w:val="left"/>
       <w:pPr>
-        <w:ind w:left="3240" w:hanging="360"/>
+        <w:ind w:left="3510" w:hanging="360"/>
       </w:pPr>
       <w:rPr>
         <w:rFonts w:ascii="Courier New" w:hAnsi="Courier New" w:cs="Courier New" w:hint="default"/>
@@ -42768,7 +44668,7 @@
       <w:lvlText w:val=""/>
       <w:lvlJc w:val="left"/>
       <w:pPr>
-        <w:ind w:left="3960" w:hanging="360"/>
+        <w:ind w:left="4230" w:hanging="360"/>
       </w:pPr>
       <w:rPr>
         <w:rFonts w:ascii="Wingdings" w:hAnsi="Wingdings" w:hint="default"/>
@@ -42780,7 +44680,7 @@
       <w:lvlText w:val=""/>
       <w:lvlJc w:val="left"/>
       <w:pPr>
-        <w:ind w:left="4680" w:hanging="360"/>
+        <w:ind w:left="4950" w:hanging="360"/>
       </w:pPr>
       <w:rPr>
         <w:rFonts w:ascii="Symbol" w:hAnsi="Symbol" w:hint="default"/>
@@ -42792,7 +44692,7 @@
       <w:lvlText w:val="o"/>
       <w:lvlJc w:val="left"/>
       <w:pPr>
-        <w:ind w:left="5400" w:hanging="360"/>
+        <w:ind w:left="5670" w:hanging="360"/>
       </w:pPr>
       <w:rPr>
         <w:rFonts w:ascii="Courier New" w:hAnsi="Courier New" w:cs="Courier New" w:hint="default"/>
@@ -42804,7 +44704,7 @@
       <w:lvlText w:val=""/>
       <w:lvlJc w:val="left"/>
       <w:pPr>
-        <w:ind w:left="6120" w:hanging="360"/>
+        <w:ind w:left="6390" w:hanging="360"/>
       </w:pPr>
       <w:rPr>
         <w:rFonts w:ascii="Wingdings" w:hAnsi="Wingdings" w:hint="default"/>
@@ -42812,9 +44712,9 @@
     </w:lvl>
   </w:abstractNum>
   <w:abstractNum w:abstractNumId="14" w15:restartNumberingAfterBreak="0">
-    <w:nsid w:val="2F9D4529"/>
+    <w:nsid w:val="27FD427A"/>
     <w:multiLevelType w:val="hybridMultilevel"/>
-    <w:tmpl w:val="118C8E50"/>
+    <w:tmpl w:val="28AA6B6E"/>
     <w:lvl w:ilvl="0" w:tplc="04090001">
       <w:start w:val="1"/>
       <w:numFmt w:val="bullet"/>
@@ -42925,9 +44825,9 @@
     </w:lvl>
   </w:abstractNum>
   <w:abstractNum w:abstractNumId="15" w15:restartNumberingAfterBreak="0">
-    <w:nsid w:val="30E62940"/>
+    <w:nsid w:val="2F9D4529"/>
     <w:multiLevelType w:val="hybridMultilevel"/>
-    <w:tmpl w:val="933CDA5E"/>
+    <w:tmpl w:val="118C8E50"/>
     <w:lvl w:ilvl="0" w:tplc="04090001">
       <w:start w:val="1"/>
       <w:numFmt w:val="bullet"/>
@@ -43038,9 +44938,9 @@
     </w:lvl>
   </w:abstractNum>
   <w:abstractNum w:abstractNumId="16" w15:restartNumberingAfterBreak="0">
-    <w:nsid w:val="36867164"/>
+    <w:nsid w:val="30E62940"/>
     <w:multiLevelType w:val="hybridMultilevel"/>
-    <w:tmpl w:val="AB440532"/>
+    <w:tmpl w:val="933CDA5E"/>
     <w:lvl w:ilvl="0" w:tplc="04090001">
       <w:start w:val="1"/>
       <w:numFmt w:val="bullet"/>
@@ -43151,9 +45051,9 @@
     </w:lvl>
   </w:abstractNum>
   <w:abstractNum w:abstractNumId="17" w15:restartNumberingAfterBreak="0">
-    <w:nsid w:val="39BD4AA8"/>
+    <w:nsid w:val="36867164"/>
     <w:multiLevelType w:val="hybridMultilevel"/>
-    <w:tmpl w:val="CD2A5950"/>
+    <w:tmpl w:val="AB440532"/>
     <w:lvl w:ilvl="0" w:tplc="04090001">
       <w:start w:val="1"/>
       <w:numFmt w:val="bullet"/>
@@ -43264,9 +45164,9 @@
     </w:lvl>
   </w:abstractNum>
   <w:abstractNum w:abstractNumId="18" w15:restartNumberingAfterBreak="0">
-    <w:nsid w:val="3B6B3E69"/>
+    <w:nsid w:val="39BD4AA8"/>
     <w:multiLevelType w:val="hybridMultilevel"/>
-    <w:tmpl w:val="FA1CC43E"/>
+    <w:tmpl w:val="CD2A5950"/>
     <w:lvl w:ilvl="0" w:tplc="04090001">
       <w:start w:val="1"/>
       <w:numFmt w:val="bullet"/>
@@ -43377,9 +45277,9 @@
     </w:lvl>
   </w:abstractNum>
   <w:abstractNum w:abstractNumId="19" w15:restartNumberingAfterBreak="0">
-    <w:nsid w:val="3BB7267E"/>
+    <w:nsid w:val="3B6B3E69"/>
     <w:multiLevelType w:val="hybridMultilevel"/>
-    <w:tmpl w:val="DDACA356"/>
+    <w:tmpl w:val="FA1CC43E"/>
     <w:lvl w:ilvl="0" w:tplc="04090001">
       <w:start w:val="1"/>
       <w:numFmt w:val="bullet"/>
@@ -43490,9 +45390,9 @@
     </w:lvl>
   </w:abstractNum>
   <w:abstractNum w:abstractNumId="20" w15:restartNumberingAfterBreak="0">
-    <w:nsid w:val="3F0314D7"/>
+    <w:nsid w:val="3BB7267E"/>
     <w:multiLevelType w:val="hybridMultilevel"/>
-    <w:tmpl w:val="62B8C7A4"/>
+    <w:tmpl w:val="DDACA356"/>
     <w:lvl w:ilvl="0" w:tplc="04090001">
       <w:start w:val="1"/>
       <w:numFmt w:val="bullet"/>
@@ -43603,9 +45503,9 @@
     </w:lvl>
   </w:abstractNum>
   <w:abstractNum w:abstractNumId="21" w15:restartNumberingAfterBreak="0">
-    <w:nsid w:val="4041402D"/>
+    <w:nsid w:val="3F0314D7"/>
     <w:multiLevelType w:val="hybridMultilevel"/>
-    <w:tmpl w:val="8FB2323C"/>
+    <w:tmpl w:val="62B8C7A4"/>
     <w:lvl w:ilvl="0" w:tplc="04090001">
       <w:start w:val="1"/>
       <w:numFmt w:val="bullet"/>
@@ -43716,6 +45616,119 @@
     </w:lvl>
   </w:abstractNum>
   <w:abstractNum w:abstractNumId="22" w15:restartNumberingAfterBreak="0">
+    <w:nsid w:val="4041402D"/>
+    <w:multiLevelType w:val="hybridMultilevel"/>
+    <w:tmpl w:val="8FB2323C"/>
+    <w:lvl w:ilvl="0" w:tplc="04090001">
+      <w:start w:val="1"/>
+      <w:numFmt w:val="bullet"/>
+      <w:lvlText w:val=""/>
+      <w:lvlJc w:val="left"/>
+      <w:pPr>
+        <w:ind w:left="360" w:hanging="360"/>
+      </w:pPr>
+      <w:rPr>
+        <w:rFonts w:ascii="Symbol" w:hAnsi="Symbol" w:hint="default"/>
+      </w:rPr>
+    </w:lvl>
+    <w:lvl w:ilvl="1" w:tplc="04090003" w:tentative="1">
+      <w:start w:val="1"/>
+      <w:numFmt w:val="bullet"/>
+      <w:lvlText w:val="o"/>
+      <w:lvlJc w:val="left"/>
+      <w:pPr>
+        <w:ind w:left="1080" w:hanging="360"/>
+      </w:pPr>
+      <w:rPr>
+        <w:rFonts w:ascii="Courier New" w:hAnsi="Courier New" w:cs="Courier New" w:hint="default"/>
+      </w:rPr>
+    </w:lvl>
+    <w:lvl w:ilvl="2" w:tplc="04090005" w:tentative="1">
+      <w:start w:val="1"/>
+      <w:numFmt w:val="bullet"/>
+      <w:lvlText w:val=""/>
+      <w:lvlJc w:val="left"/>
+      <w:pPr>
+        <w:ind w:left="1800" w:hanging="360"/>
+      </w:pPr>
+      <w:rPr>
+        <w:rFonts w:ascii="Wingdings" w:hAnsi="Wingdings" w:hint="default"/>
+      </w:rPr>
+    </w:lvl>
+    <w:lvl w:ilvl="3" w:tplc="04090001" w:tentative="1">
+      <w:start w:val="1"/>
+      <w:numFmt w:val="bullet"/>
+      <w:lvlText w:val=""/>
+      <w:lvlJc w:val="left"/>
+      <w:pPr>
+        <w:ind w:left="2520" w:hanging="360"/>
+      </w:pPr>
+      <w:rPr>
+        <w:rFonts w:ascii="Symbol" w:hAnsi="Symbol" w:hint="default"/>
+      </w:rPr>
+    </w:lvl>
+    <w:lvl w:ilvl="4" w:tplc="04090003" w:tentative="1">
+      <w:start w:val="1"/>
+      <w:numFmt w:val="bullet"/>
+      <w:lvlText w:val="o"/>
+      <w:lvlJc w:val="left"/>
+      <w:pPr>
+        <w:ind w:left="3240" w:hanging="360"/>
+      </w:pPr>
+      <w:rPr>
+        <w:rFonts w:ascii="Courier New" w:hAnsi="Courier New" w:cs="Courier New" w:hint="default"/>
+      </w:rPr>
+    </w:lvl>
+    <w:lvl w:ilvl="5" w:tplc="04090005" w:tentative="1">
+      <w:start w:val="1"/>
+      <w:numFmt w:val="bullet"/>
+      <w:lvlText w:val=""/>
+      <w:lvlJc w:val="left"/>
+      <w:pPr>
+        <w:ind w:left="3960" w:hanging="360"/>
+      </w:pPr>
+      <w:rPr>
+        <w:rFonts w:ascii="Wingdings" w:hAnsi="Wingdings" w:hint="default"/>
+      </w:rPr>
+    </w:lvl>
+    <w:lvl w:ilvl="6" w:tplc="04090001" w:tentative="1">
+      <w:start w:val="1"/>
+      <w:numFmt w:val="bullet"/>
+      <w:lvlText w:val=""/>
+      <w:lvlJc w:val="left"/>
+      <w:pPr>
+        <w:ind w:left="4680" w:hanging="360"/>
+      </w:pPr>
+      <w:rPr>
+        <w:rFonts w:ascii="Symbol" w:hAnsi="Symbol" w:hint="default"/>
+      </w:rPr>
+    </w:lvl>
+    <w:lvl w:ilvl="7" w:tplc="04090003" w:tentative="1">
+      <w:start w:val="1"/>
+      <w:numFmt w:val="bullet"/>
+      <w:lvlText w:val="o"/>
+      <w:lvlJc w:val="left"/>
+      <w:pPr>
+        <w:ind w:left="5400" w:hanging="360"/>
+      </w:pPr>
+      <w:rPr>
+        <w:rFonts w:ascii="Courier New" w:hAnsi="Courier New" w:cs="Courier New" w:hint="default"/>
+      </w:rPr>
+    </w:lvl>
+    <w:lvl w:ilvl="8" w:tplc="04090005" w:tentative="1">
+      <w:start w:val="1"/>
+      <w:numFmt w:val="bullet"/>
+      <w:lvlText w:val=""/>
+      <w:lvlJc w:val="left"/>
+      <w:pPr>
+        <w:ind w:left="6120" w:hanging="360"/>
+      </w:pPr>
+      <w:rPr>
+        <w:rFonts w:ascii="Wingdings" w:hAnsi="Wingdings" w:hint="default"/>
+      </w:rPr>
+    </w:lvl>
+  </w:abstractNum>
+  <w:abstractNum w:abstractNumId="23" w15:restartNumberingAfterBreak="0">
     <w:nsid w:val="420B6024"/>
     <w:multiLevelType w:val="hybridMultilevel"/>
     <w:tmpl w:val="4BD0E32C"/>
@@ -43806,7 +45819,7 @@
       </w:pPr>
     </w:lvl>
   </w:abstractNum>
-  <w:abstractNum w:abstractNumId="23" w15:restartNumberingAfterBreak="0">
+  <w:abstractNum w:abstractNumId="24" w15:restartNumberingAfterBreak="0">
     <w:nsid w:val="4302601A"/>
     <w:multiLevelType w:val="hybridMultilevel"/>
     <w:tmpl w:val="FFDC5F86"/>
@@ -43919,7 +45932,7 @@
       </w:rPr>
     </w:lvl>
   </w:abstractNum>
-  <w:abstractNum w:abstractNumId="24" w15:restartNumberingAfterBreak="0">
+  <w:abstractNum w:abstractNumId="25" w15:restartNumberingAfterBreak="0">
     <w:nsid w:val="48651D28"/>
     <w:multiLevelType w:val="hybridMultilevel"/>
     <w:tmpl w:val="4248393E"/>
@@ -44032,7 +46045,7 @@
       </w:rPr>
     </w:lvl>
   </w:abstractNum>
-  <w:abstractNum w:abstractNumId="25" w15:restartNumberingAfterBreak="0">
+  <w:abstractNum w:abstractNumId="26" w15:restartNumberingAfterBreak="0">
     <w:nsid w:val="4E037F7F"/>
     <w:multiLevelType w:val="hybridMultilevel"/>
     <w:tmpl w:val="CA3259F2"/>
@@ -44123,7 +46136,7 @@
       </w:pPr>
     </w:lvl>
   </w:abstractNum>
-  <w:abstractNum w:abstractNumId="26" w15:restartNumberingAfterBreak="0">
+  <w:abstractNum w:abstractNumId="27" w15:restartNumberingAfterBreak="0">
     <w:nsid w:val="4EFB4BF8"/>
     <w:multiLevelType w:val="hybridMultilevel"/>
     <w:tmpl w:val="6C24360C"/>
@@ -44236,7 +46249,7 @@
       </w:rPr>
     </w:lvl>
   </w:abstractNum>
-  <w:abstractNum w:abstractNumId="27" w15:restartNumberingAfterBreak="0">
+  <w:abstractNum w:abstractNumId="28" w15:restartNumberingAfterBreak="0">
     <w:nsid w:val="50A16680"/>
     <w:multiLevelType w:val="hybridMultilevel"/>
     <w:tmpl w:val="1CCC46B8"/>
@@ -44349,7 +46362,7 @@
       </w:rPr>
     </w:lvl>
   </w:abstractNum>
-  <w:abstractNum w:abstractNumId="28" w15:restartNumberingAfterBreak="0">
+  <w:abstractNum w:abstractNumId="29" w15:restartNumberingAfterBreak="0">
     <w:nsid w:val="5F200D70"/>
     <w:multiLevelType w:val="hybridMultilevel"/>
     <w:tmpl w:val="41EC8BCC"/>
@@ -44462,7 +46475,7 @@
       </w:rPr>
     </w:lvl>
   </w:abstractNum>
-  <w:abstractNum w:abstractNumId="29" w15:restartNumberingAfterBreak="0">
+  <w:abstractNum w:abstractNumId="30" w15:restartNumberingAfterBreak="0">
     <w:nsid w:val="6169513F"/>
     <w:multiLevelType w:val="hybridMultilevel"/>
     <w:tmpl w:val="298AE84A"/>
@@ -44575,7 +46588,7 @@
       </w:rPr>
     </w:lvl>
   </w:abstractNum>
-  <w:abstractNum w:abstractNumId="30" w15:restartNumberingAfterBreak="0">
+  <w:abstractNum w:abstractNumId="31" w15:restartNumberingAfterBreak="0">
     <w:nsid w:val="65CE6649"/>
     <w:multiLevelType w:val="hybridMultilevel"/>
     <w:tmpl w:val="7AEC3D28"/>
@@ -44688,7 +46701,7 @@
       </w:rPr>
     </w:lvl>
   </w:abstractNum>
-  <w:abstractNum w:abstractNumId="31" w15:restartNumberingAfterBreak="0">
+  <w:abstractNum w:abstractNumId="32" w15:restartNumberingAfterBreak="0">
     <w:nsid w:val="73444990"/>
     <w:multiLevelType w:val="hybridMultilevel"/>
     <w:tmpl w:val="DC1A8A2A"/>
@@ -44801,7 +46814,7 @@
       </w:rPr>
     </w:lvl>
   </w:abstractNum>
-  <w:abstractNum w:abstractNumId="32" w15:restartNumberingAfterBreak="0">
+  <w:abstractNum w:abstractNumId="33" w15:restartNumberingAfterBreak="0">
     <w:nsid w:val="739F65E4"/>
     <w:multiLevelType w:val="hybridMultilevel"/>
     <w:tmpl w:val="70D2C45E"/>
@@ -44914,7 +46927,7 @@
       </w:rPr>
     </w:lvl>
   </w:abstractNum>
-  <w:abstractNum w:abstractNumId="33" w15:restartNumberingAfterBreak="0">
+  <w:abstractNum w:abstractNumId="34" w15:restartNumberingAfterBreak="0">
     <w:nsid w:val="74A9520C"/>
     <w:multiLevelType w:val="hybridMultilevel"/>
     <w:tmpl w:val="B9B837AE"/>
@@ -45027,7 +47040,7 @@
       </w:rPr>
     </w:lvl>
   </w:abstractNum>
-  <w:abstractNum w:abstractNumId="34" w15:restartNumberingAfterBreak="0">
+  <w:abstractNum w:abstractNumId="35" w15:restartNumberingAfterBreak="0">
     <w:nsid w:val="769330DB"/>
     <w:multiLevelType w:val="hybridMultilevel"/>
     <w:tmpl w:val="FE768AAA"/>
@@ -45140,7 +47153,7 @@
       </w:rPr>
     </w:lvl>
   </w:abstractNum>
-  <w:abstractNum w:abstractNumId="35" w15:restartNumberingAfterBreak="0">
+  <w:abstractNum w:abstractNumId="36" w15:restartNumberingAfterBreak="0">
     <w:nsid w:val="78662C0B"/>
     <w:multiLevelType w:val="hybridMultilevel"/>
     <w:tmpl w:val="C31EF9BE"/>
@@ -45253,7 +47266,7 @@
       </w:rPr>
     </w:lvl>
   </w:abstractNum>
-  <w:abstractNum w:abstractNumId="36" w15:restartNumberingAfterBreak="0">
+  <w:abstractNum w:abstractNumId="37" w15:restartNumberingAfterBreak="0">
     <w:nsid w:val="7C261E8D"/>
     <w:multiLevelType w:val="hybridMultilevel"/>
     <w:tmpl w:val="9F286074"/>
@@ -45367,82 +47380,82 @@
     </w:lvl>
   </w:abstractNum>
   <w:num w:numId="1" w16cid:durableId="197737909">
-    <w:abstractNumId w:val="34"/>
+    <w:abstractNumId w:val="35"/>
   </w:num>
   <w:num w:numId="2" w16cid:durableId="735126934">
-    <w:abstractNumId w:val="13"/>
+    <w:abstractNumId w:val="14"/>
   </w:num>
   <w:num w:numId="3" w16cid:durableId="1085570547">
-    <w:abstractNumId w:val="14"/>
+    <w:abstractNumId w:val="15"/>
   </w:num>
   <w:num w:numId="4" w16cid:durableId="1513377898">
-    <w:abstractNumId w:val="23"/>
+    <w:abstractNumId w:val="24"/>
   </w:num>
   <w:num w:numId="5" w16cid:durableId="371271756">
-    <w:abstractNumId w:val="15"/>
+    <w:abstractNumId w:val="16"/>
   </w:num>
   <w:num w:numId="6" w16cid:durableId="1735852068">
     <w:abstractNumId w:val="4"/>
   </w:num>
   <w:num w:numId="7" w16cid:durableId="338580324">
+    <w:abstractNumId w:val="29"/>
+  </w:num>
+  <w:num w:numId="8" w16cid:durableId="1779374060">
+    <w:abstractNumId w:val="36"/>
+  </w:num>
+  <w:num w:numId="9" w16cid:durableId="292096398">
     <w:abstractNumId w:val="28"/>
   </w:num>
-  <w:num w:numId="8" w16cid:durableId="1779374060">
-    <w:abstractNumId w:val="35"/>
-  </w:num>
-  <w:num w:numId="9" w16cid:durableId="292096398">
-    <w:abstractNumId w:val="27"/>
-  </w:num>
   <w:num w:numId="10" w16cid:durableId="2134904991">
-    <w:abstractNumId w:val="29"/>
+    <w:abstractNumId w:val="30"/>
   </w:num>
   <w:num w:numId="11" w16cid:durableId="738405857">
-    <w:abstractNumId w:val="24"/>
+    <w:abstractNumId w:val="25"/>
   </w:num>
   <w:num w:numId="12" w16cid:durableId="498279447">
     <w:abstractNumId w:val="0"/>
   </w:num>
   <w:num w:numId="13" w16cid:durableId="1187478026">
-    <w:abstractNumId w:val="11"/>
+    <w:abstractNumId w:val="12"/>
   </w:num>
   <w:num w:numId="14" w16cid:durableId="2026516634">
-    <w:abstractNumId w:val="21"/>
+    <w:abstractNumId w:val="22"/>
   </w:num>
   <w:num w:numId="15" w16cid:durableId="1671642249">
     <w:abstractNumId w:val="7"/>
   </w:num>
   <w:num w:numId="16" w16cid:durableId="681736902">
-    <w:abstractNumId w:val="26"/>
+    <w:abstractNumId w:val="27"/>
   </w:num>
   <w:num w:numId="17" w16cid:durableId="443424400">
-    <w:abstractNumId w:val="16"/>
+    <w:abstractNumId w:val="17"/>
   </w:num>
   <w:num w:numId="18" w16cid:durableId="1884249514">
     <w:abstractNumId w:val="2"/>
   </w:num>
   <w:num w:numId="19" w16cid:durableId="433476749">
-    <w:abstractNumId w:val="31"/>
+    <w:abstractNumId w:val="32"/>
   </w:num>
   <w:num w:numId="20" w16cid:durableId="2069569278">
-    <w:abstractNumId w:val="18"/>
+    <w:abstractNumId w:val="19"/>
   </w:num>
   <w:num w:numId="21" w16cid:durableId="1730036537">
-    <w:abstractNumId w:val="25"/>
+    <w:abstractNumId w:val="26"/>
   </w:num>
   <w:num w:numId="22" w16cid:durableId="1684358952">
     <w:abstractNumId w:val="8"/>
   </w:num>
   <w:num w:numId="23" w16cid:durableId="487131597">
-    <w:abstractNumId w:val="12"/>
+    <w:abstractNumId w:val="13"/>
   </w:num>
   <w:num w:numId="24" w16cid:durableId="193080939">
-    <w:abstractNumId w:val="36"/>
+    <w:abstractNumId w:val="37"/>
   </w:num>
   <w:num w:numId="25" w16cid:durableId="621423513">
-    <w:abstractNumId w:val="17"/>
+    <w:abstractNumId w:val="18"/>
   </w:num>
   <w:num w:numId="26" w16cid:durableId="567614883">
-    <w:abstractNumId w:val="19"/>
+    <w:abstractNumId w:val="20"/>
   </w:num>
   <w:num w:numId="27" w16cid:durableId="416488422">
     <w:abstractNumId w:val="1"/>
@@ -45457,7 +47470,7 @@
     <w:abstractNumId w:val="10"/>
   </w:num>
   <w:num w:numId="31" w16cid:durableId="1264336238">
-    <w:abstractNumId w:val="30"/>
+    <w:abstractNumId w:val="31"/>
   </w:num>
   <w:num w:numId="32" w16cid:durableId="1543400979">
     <w:abstractNumId w:val="9"/>
@@ -45466,16 +47479,19 @@
     <w:abstractNumId w:val="6"/>
   </w:num>
   <w:num w:numId="34" w16cid:durableId="1365252827">
+    <w:abstractNumId w:val="34"/>
+  </w:num>
+  <w:num w:numId="35" w16cid:durableId="1207763686">
     <w:abstractNumId w:val="33"/>
   </w:num>
-  <w:num w:numId="35" w16cid:durableId="1207763686">
-    <w:abstractNumId w:val="32"/>
-  </w:num>
   <w:num w:numId="36" w16cid:durableId="965158745">
-    <w:abstractNumId w:val="20"/>
+    <w:abstractNumId w:val="21"/>
   </w:num>
   <w:num w:numId="37" w16cid:durableId="1636522979">
-    <w:abstractNumId w:val="22"/>
+    <w:abstractNumId w:val="23"/>
+  </w:num>
+  <w:num w:numId="38" w16cid:durableId="1138763749">
+    <w:abstractNumId w:val="11"/>
   </w:num>
 </w:numbering>
 </file>
@@ -46081,7 +48097,6 @@
   <w:style w:type="character" w:default="1" w:styleId="DefaultParagraphFont">
     <w:name w:val="Default Paragraph Font"/>
     <w:uiPriority w:val="1"/>
-    <w:semiHidden/>
     <w:unhideWhenUsed/>
   </w:style>
   <w:style w:type="table" w:default="1" w:styleId="TableNormal">

</xml_diff>

<commit_message>
Just fixed a typo
</commit_message>
<xml_diff>
--- a/d2_dart_asynchronous_await_and_future.docx
+++ b/d2_dart_asynchronous_await_and_future.docx
@@ -21989,27 +21989,7 @@
           <w:sz w:val="32"/>
           <w:szCs w:val="32"/>
         </w:rPr>
-        <w:t>final Completer&lt;</w:t>
-      </w:r>
-      <w:r>
-        <w:rPr>
-          <w:b/>
-          <w:bCs/>
-          <w:color w:val="D86DCB" w:themeColor="accent5" w:themeTint="99"/>
-          <w:sz w:val="32"/>
-          <w:szCs w:val="32"/>
-        </w:rPr>
-        <w:t>bool</w:t>
-      </w:r>
-      <w:r>
-        <w:rPr>
-          <w:b/>
-          <w:bCs/>
-          <w:color w:val="D86DCB" w:themeColor="accent5" w:themeTint="99"/>
-          <w:sz w:val="32"/>
-          <w:szCs w:val="32"/>
-        </w:rPr>
-        <w:t>&gt; _</w:t>
+        <w:t>final Completer&lt;bool&gt; _</w:t>
       </w:r>
       <w:proofErr w:type="spellStart"/>
       <w:r>
@@ -22031,17 +22011,7 @@
           <w:sz w:val="32"/>
           <w:szCs w:val="32"/>
         </w:rPr>
-        <w:t xml:space="preserve"> = Completer&lt;</w:t>
-      </w:r>
-      <w:r>
-        <w:rPr>
-          <w:b/>
-          <w:bCs/>
-          <w:color w:val="D86DCB" w:themeColor="accent5" w:themeTint="99"/>
-          <w:sz w:val="32"/>
-          <w:szCs w:val="32"/>
-        </w:rPr>
-        <w:t>bool</w:t>
+        <w:t xml:space="preserve"> = Completer&lt;bool</w:t>
       </w:r>
       <w:proofErr w:type="gramStart"/>
       <w:r>
@@ -22936,37 +22906,7 @@
           <w:sz w:val="32"/>
           <w:szCs w:val="32"/>
         </w:rPr>
-        <w:t xml:space="preserve">  </w:t>
-      </w:r>
-      <w:r>
-        <w:rPr>
-          <w:b/>
-          <w:bCs/>
-          <w:color w:val="D86DCB" w:themeColor="accent5" w:themeTint="99"/>
-          <w:sz w:val="32"/>
-          <w:szCs w:val="32"/>
-        </w:rPr>
-        <w:t xml:space="preserve"> </w:t>
-      </w:r>
-      <w:r>
-        <w:rPr>
-          <w:b/>
-          <w:bCs/>
-          <w:color w:val="D86DCB" w:themeColor="accent5" w:themeTint="99"/>
-          <w:sz w:val="32"/>
-          <w:szCs w:val="32"/>
-        </w:rPr>
-        <w:t xml:space="preserve">  </w:t>
-      </w:r>
-      <w:r>
-        <w:rPr>
-          <w:b/>
-          <w:bCs/>
-          <w:color w:val="D86DCB" w:themeColor="accent5" w:themeTint="99"/>
-          <w:sz w:val="32"/>
-          <w:szCs w:val="32"/>
-        </w:rPr>
-        <w:t>_</w:t>
+        <w:t xml:space="preserve">     _</w:t>
       </w:r>
       <w:proofErr w:type="spellStart"/>
       <w:r>
@@ -23032,69 +22972,29 @@
           <w:sz w:val="32"/>
           <w:szCs w:val="32"/>
         </w:rPr>
-        <w:t xml:space="preserve">   </w:t>
-      </w:r>
-      <w:r>
-        <w:rPr>
-          <w:b/>
-          <w:bCs/>
-          <w:color w:val="D86DCB" w:themeColor="accent5" w:themeTint="99"/>
-          <w:sz w:val="32"/>
-          <w:szCs w:val="32"/>
-        </w:rPr>
-        <w:t xml:space="preserve"> </w:t>
-      </w:r>
-      <w:r>
-        <w:rPr>
-          <w:b/>
-          <w:bCs/>
-          <w:color w:val="D86DCB" w:themeColor="accent5" w:themeTint="99"/>
-          <w:sz w:val="32"/>
-          <w:szCs w:val="32"/>
-        </w:rPr>
-        <w:t xml:space="preserve"> …</w:t>
-      </w:r>
-    </w:p>
-    <w:p>
-      <w:pPr>
-        <w:jc w:val="both"/>
-        <w:rPr>
-          <w:b/>
-          <w:bCs/>
-          <w:color w:val="D86DCB" w:themeColor="accent5" w:themeTint="99"/>
-          <w:sz w:val="32"/>
-          <w:szCs w:val="32"/>
-        </w:rPr>
-      </w:pPr>
-      <w:r>
-        <w:rPr>
-          <w:b/>
-          <w:bCs/>
-          <w:color w:val="D86DCB" w:themeColor="accent5" w:themeTint="99"/>
-          <w:sz w:val="32"/>
-          <w:szCs w:val="32"/>
-        </w:rPr>
-        <w:t xml:space="preserve">    </w:t>
-      </w:r>
-      <w:r>
-        <w:rPr>
-          <w:b/>
-          <w:bCs/>
-          <w:color w:val="D86DCB" w:themeColor="accent5" w:themeTint="99"/>
-          <w:sz w:val="32"/>
-          <w:szCs w:val="32"/>
-        </w:rPr>
-        <w:t xml:space="preserve"> </w:t>
-      </w:r>
-      <w:r>
-        <w:rPr>
-          <w:b/>
-          <w:bCs/>
-          <w:color w:val="D86DCB" w:themeColor="accent5" w:themeTint="99"/>
-          <w:sz w:val="32"/>
-          <w:szCs w:val="32"/>
-        </w:rPr>
-        <w:t>return _</w:t>
+        <w:t xml:space="preserve">     …</w:t>
+      </w:r>
+    </w:p>
+    <w:p>
+      <w:pPr>
+        <w:jc w:val="both"/>
+        <w:rPr>
+          <w:b/>
+          <w:bCs/>
+          <w:color w:val="D86DCB" w:themeColor="accent5" w:themeTint="99"/>
+          <w:sz w:val="32"/>
+          <w:szCs w:val="32"/>
+        </w:rPr>
+      </w:pPr>
+      <w:r>
+        <w:rPr>
+          <w:b/>
+          <w:bCs/>
+          <w:color w:val="D86DCB" w:themeColor="accent5" w:themeTint="99"/>
+          <w:sz w:val="32"/>
+          <w:szCs w:val="32"/>
+        </w:rPr>
+        <w:t xml:space="preserve">     return _</w:t>
       </w:r>
       <w:proofErr w:type="spellStart"/>
       <w:proofErr w:type="gramStart"/>
@@ -23117,17 +23017,7 @@
           <w:sz w:val="32"/>
           <w:szCs w:val="32"/>
         </w:rPr>
-        <w:t>!</w:t>
-      </w:r>
-      <w:r>
-        <w:rPr>
-          <w:b/>
-          <w:bCs/>
-          <w:color w:val="D86DCB" w:themeColor="accent5" w:themeTint="99"/>
-          <w:sz w:val="32"/>
-          <w:szCs w:val="32"/>
-        </w:rPr>
-        <w:t>.</w:t>
+        <w:t>!.</w:t>
       </w:r>
       <w:proofErr w:type="gramEnd"/>
       <w:r>
@@ -39261,6 +39151,15 @@
       </w:r>
       <w:r>
         <w:rPr>
+          <w:sz w:val="32"/>
+          <w:szCs w:val="32"/>
+        </w:rPr>
+        <w:t>,</w:t>
+      </w:r>
+      <w:r>
+        <w:rPr>
+          <w:b/>
+          <w:bCs/>
           <w:sz w:val="32"/>
           <w:szCs w:val="32"/>
         </w:rPr>
@@ -48097,6 +47996,7 @@
   <w:style w:type="character" w:default="1" w:styleId="DefaultParagraphFont">
     <w:name w:val="Default Paragraph Font"/>
     <w:uiPriority w:val="1"/>
+    <w:semiHidden/>
     <w:unhideWhenUsed/>
   </w:style>
   <w:style w:type="table" w:default="1" w:styleId="TableNormal">

</xml_diff>